<commit_message>
j'ai fini la 2ieme partie
</commit_message>
<xml_diff>
--- a/Atelier-linux-p1ia-27-juillet-26.docx
+++ b/Atelier-linux-p1ia-27-juillet-26.docx
@@ -1721,6 +1721,103 @@
       <w:r>
         <w:t xml:space="preserve">  </w:t>
       </w:r>
+      <w:r>
+        <w:drawing>
+          <wp:inline distT="0" distB="0" distL="0" distR="0" wp14:anchorId="32879292" wp14:editId="2F2235DB">
+            <wp:extent cx="5328285" cy="2523490"/>
+            <wp:effectExtent l="0" t="0" r="5715" b="0"/>
+            <wp:docPr id="20" name="Image 20"/>
+            <wp:cNvGraphicFramePr>
+              <a:graphicFrameLocks xmlns:a="http://schemas.openxmlformats.org/drawingml/2006/main" noChangeAspect="1"/>
+            </wp:cNvGraphicFramePr>
+            <a:graphic xmlns:a="http://schemas.openxmlformats.org/drawingml/2006/main">
+              <a:graphicData uri="http://schemas.openxmlformats.org/drawingml/2006/picture">
+                <pic:pic xmlns:pic="http://schemas.openxmlformats.org/drawingml/2006/picture">
+                  <pic:nvPicPr>
+                    <pic:cNvPr id="1" name=""/>
+                    <pic:cNvPicPr/>
+                  </pic:nvPicPr>
+                  <pic:blipFill>
+                    <a:blip r:embed="rId27"/>
+                    <a:stretch>
+                      <a:fillRect/>
+                    </a:stretch>
+                  </pic:blipFill>
+                  <pic:spPr>
+                    <a:xfrm>
+                      <a:off x="0" y="0"/>
+                      <a:ext cx="5328285" cy="2523490"/>
+                    </a:xfrm>
+                    <a:prstGeom prst="rect">
+                      <a:avLst/>
+                    </a:prstGeom>
+                  </pic:spPr>
+                </pic:pic>
+              </a:graphicData>
+            </a:graphic>
+          </wp:inline>
+        </w:drawing>
+      </w:r>
+    </w:p>
+    <w:p>
+      <w:pPr>
+        <w:ind w:left="661" w:firstLine="0"/>
+      </w:pPr>
+    </w:p>
+    <w:p>
+      <w:pPr>
+        <w:ind w:left="661" w:firstLine="0"/>
+      </w:pPr>
+    </w:p>
+    <w:p>
+      <w:pPr>
+        <w:ind w:left="661" w:firstLine="0"/>
+      </w:pPr>
+    </w:p>
+    <w:p>
+      <w:pPr>
+        <w:ind w:left="661" w:firstLine="0"/>
+      </w:pPr>
+    </w:p>
+    <w:p>
+      <w:pPr>
+        <w:ind w:left="661" w:firstLine="0"/>
+      </w:pPr>
+    </w:p>
+    <w:p>
+      <w:pPr>
+        <w:ind w:left="661" w:firstLine="0"/>
+      </w:pPr>
+    </w:p>
+    <w:p>
+      <w:pPr>
+        <w:ind w:left="661" w:firstLine="0"/>
+      </w:pPr>
+    </w:p>
+    <w:p>
+      <w:pPr>
+        <w:ind w:left="661" w:firstLine="0"/>
+      </w:pPr>
+    </w:p>
+    <w:p>
+      <w:pPr>
+        <w:ind w:left="661" w:firstLine="0"/>
+      </w:pPr>
+    </w:p>
+    <w:p>
+      <w:pPr>
+        <w:ind w:left="661" w:firstLine="0"/>
+      </w:pPr>
+    </w:p>
+    <w:p>
+      <w:pPr>
+        <w:ind w:left="661" w:firstLine="0"/>
+      </w:pPr>
+    </w:p>
+    <w:p>
+      <w:pPr>
+        <w:ind w:left="661" w:firstLine="0"/>
+      </w:pPr>
     </w:p>
     <w:p>
       <w:pPr>
@@ -1733,6 +1830,49 @@
       </w:pPr>
       <w:r>
         <w:t xml:space="preserve">Restaurez la sauvegarde ailleurs, en dehors du projet </w:t>
+      </w:r>
+    </w:p>
+    <w:p>
+      <w:pPr>
+        <w:spacing w:after="255"/>
+        <w:ind w:left="661" w:firstLine="0"/>
+      </w:pPr>
+      <w:r>
+        <w:drawing>
+          <wp:inline distT="0" distB="0" distL="0" distR="0" wp14:anchorId="44251671" wp14:editId="5B898FEA">
+            <wp:extent cx="5328285" cy="2408555"/>
+            <wp:effectExtent l="0" t="0" r="5715" b="0"/>
+            <wp:docPr id="21" name="Image 21"/>
+            <wp:cNvGraphicFramePr>
+              <a:graphicFrameLocks xmlns:a="http://schemas.openxmlformats.org/drawingml/2006/main" noChangeAspect="1"/>
+            </wp:cNvGraphicFramePr>
+            <a:graphic xmlns:a="http://schemas.openxmlformats.org/drawingml/2006/main">
+              <a:graphicData uri="http://schemas.openxmlformats.org/drawingml/2006/picture">
+                <pic:pic xmlns:pic="http://schemas.openxmlformats.org/drawingml/2006/picture">
+                  <pic:nvPicPr>
+                    <pic:cNvPr id="1" name=""/>
+                    <pic:cNvPicPr/>
+                  </pic:nvPicPr>
+                  <pic:blipFill>
+                    <a:blip r:embed="rId28"/>
+                    <a:stretch>
+                      <a:fillRect/>
+                    </a:stretch>
+                  </pic:blipFill>
+                  <pic:spPr>
+                    <a:xfrm>
+                      <a:off x="0" y="0"/>
+                      <a:ext cx="5328285" cy="2408555"/>
+                    </a:xfrm>
+                    <a:prstGeom prst="rect">
+                      <a:avLst/>
+                    </a:prstGeom>
+                  </pic:spPr>
+                </pic:pic>
+              </a:graphicData>
+            </a:graphic>
+          </wp:inline>
+        </w:drawing>
       </w:r>
     </w:p>
     <w:p>
@@ -1767,7 +1907,7 @@
                     <pic:cNvPicPr/>
                   </pic:nvPicPr>
                   <pic:blipFill>
-                    <a:blip r:embed="rId27"/>
+                    <a:blip r:embed="rId29"/>
                     <a:stretch>
                       <a:fillRect/>
                     </a:stretch>
@@ -1818,7 +1958,7 @@
                     <pic:cNvPicPr/>
                   </pic:nvPicPr>
                   <pic:blipFill>
-                    <a:blip r:embed="rId28"/>
+                    <a:blip r:embed="rId30"/>
                     <a:stretch>
                       <a:fillRect/>
                     </a:stretch>
@@ -1869,7 +2009,7 @@
                     <pic:cNvPicPr/>
                   </pic:nvPicPr>
                   <pic:blipFill>
-                    <a:blip r:embed="rId29"/>
+                    <a:blip r:embed="rId31"/>
                     <a:stretch>
                       <a:fillRect/>
                     </a:stretch>
@@ -1920,7 +2060,7 @@
                     <pic:cNvPicPr/>
                   </pic:nvPicPr>
                   <pic:blipFill>
-                    <a:blip r:embed="rId30"/>
+                    <a:blip r:embed="rId32"/>
                     <a:stretch>
                       <a:fillRect/>
                     </a:stretch>
@@ -1971,7 +2111,7 @@
                     <pic:cNvPicPr/>
                   </pic:nvPicPr>
                   <pic:blipFill>
-                    <a:blip r:embed="rId31"/>
+                    <a:blip r:embed="rId33"/>
                     <a:stretch>
                       <a:fillRect/>
                     </a:stretch>
@@ -2022,7 +2162,7 @@
                     <pic:cNvPicPr/>
                   </pic:nvPicPr>
                   <pic:blipFill>
-                    <a:blip r:embed="rId32"/>
+                    <a:blip r:embed="rId34"/>
                     <a:stretch>
                       <a:fillRect/>
                     </a:stretch>
@@ -2073,7 +2213,7 @@
                     <pic:cNvPicPr/>
                   </pic:nvPicPr>
                   <pic:blipFill>
-                    <a:blip r:embed="rId33"/>
+                    <a:blip r:embed="rId35"/>
                     <a:stretch>
                       <a:fillRect/>
                     </a:stretch>
@@ -2124,7 +2264,7 @@
                     <pic:cNvPicPr/>
                   </pic:nvPicPr>
                   <pic:blipFill>
-                    <a:blip r:embed="rId34"/>
+                    <a:blip r:embed="rId36"/>
                     <a:stretch>
                       <a:fillRect/>
                     </a:stretch>
@@ -2175,7 +2315,7 @@
                     <pic:cNvPicPr/>
                   </pic:nvPicPr>
                   <pic:blipFill>
-                    <a:blip r:embed="rId35"/>
+                    <a:blip r:embed="rId37"/>
                     <a:stretch>
                       <a:fillRect/>
                     </a:stretch>
@@ -2226,7 +2366,7 @@
                     <pic:cNvPicPr/>
                   </pic:nvPicPr>
                   <pic:blipFill>
-                    <a:blip r:embed="rId36"/>
+                    <a:blip r:embed="rId38"/>
                     <a:stretch>
                       <a:fillRect/>
                     </a:stretch>
@@ -2277,7 +2417,7 @@
                     <pic:cNvPicPr/>
                   </pic:nvPicPr>
                   <pic:blipFill>
-                    <a:blip r:embed="rId37"/>
+                    <a:blip r:embed="rId39"/>
                     <a:stretch>
                       <a:fillRect/>
                     </a:stretch>
@@ -2787,22 +2927,114 @@
       </w:r>
       <w:proofErr w:type="gramEnd"/>
       <w:r>
-        <w:t xml:space="preserve"> que son répertoire personnel a bien été créé ;  </w:t>
-      </w:r>
-      <w:r>
-        <w:rPr>
-          <w:sz w:val="19"/>
-        </w:rPr>
-        <w:t xml:space="preserve"> </w:t>
-      </w:r>
-      <w:r>
-        <w:rPr>
-          <w:sz w:val="19"/>
-        </w:rPr>
-        <w:tab/>
-      </w:r>
-      <w:r>
-        <w:t xml:space="preserve">affichez son identifiant (UID) et ses groupes. </w:t>
+        <w:t xml:space="preserve"> que son répertoire personnel a bien été créé ;</w:t>
+      </w:r>
+    </w:p>
+    <w:p>
+      <w:pPr>
+        <w:spacing w:after="253"/>
+        <w:ind w:left="659" w:right="1510" w:firstLine="0"/>
+      </w:pPr>
+      <w:r>
+        <w:drawing>
+          <wp:inline distT="0" distB="0" distL="0" distR="0" wp14:anchorId="2D94D0A4" wp14:editId="3621649C">
+            <wp:extent cx="5328285" cy="706120"/>
+            <wp:effectExtent l="0" t="0" r="5715" b="0"/>
+            <wp:docPr id="23" name="Image 23"/>
+            <wp:cNvGraphicFramePr>
+              <a:graphicFrameLocks xmlns:a="http://schemas.openxmlformats.org/drawingml/2006/main" noChangeAspect="1"/>
+            </wp:cNvGraphicFramePr>
+            <a:graphic xmlns:a="http://schemas.openxmlformats.org/drawingml/2006/main">
+              <a:graphicData uri="http://schemas.openxmlformats.org/drawingml/2006/picture">
+                <pic:pic xmlns:pic="http://schemas.openxmlformats.org/drawingml/2006/picture">
+                  <pic:nvPicPr>
+                    <pic:cNvPr id="1" name=""/>
+                    <pic:cNvPicPr/>
+                  </pic:nvPicPr>
+                  <pic:blipFill>
+                    <a:blip r:embed="rId40"/>
+                    <a:stretch>
+                      <a:fillRect/>
+                    </a:stretch>
+                  </pic:blipFill>
+                  <pic:spPr>
+                    <a:xfrm>
+                      <a:off x="0" y="0"/>
+                      <a:ext cx="5328285" cy="706120"/>
+                    </a:xfrm>
+                    <a:prstGeom prst="rect">
+                      <a:avLst/>
+                    </a:prstGeom>
+                  </pic:spPr>
+                </pic:pic>
+              </a:graphicData>
+            </a:graphic>
+          </wp:inline>
+        </w:drawing>
+      </w:r>
+      <w:r>
+        <w:t xml:space="preserve">  </w:t>
+      </w:r>
+    </w:p>
+    <w:p>
+      <w:pPr>
+        <w:numPr>
+          <w:ilvl w:val="0"/>
+          <w:numId w:val="4"/>
+        </w:numPr>
+        <w:spacing w:after="253"/>
+        <w:ind w:right="1510" w:hanging="336"/>
+      </w:pPr>
+      <w:proofErr w:type="gramStart"/>
+      <w:r>
+        <w:t>affichez</w:t>
+      </w:r>
+      <w:proofErr w:type="gramEnd"/>
+      <w:r>
+        <w:t xml:space="preserve"> son identifiant (UID) et ses groupes. </w:t>
+      </w:r>
+    </w:p>
+    <w:p>
+      <w:pPr>
+        <w:spacing w:after="253"/>
+        <w:ind w:left="659" w:right="1510" w:firstLine="0"/>
+      </w:pPr>
+      <w:r>
+        <w:drawing>
+          <wp:inline distT="0" distB="0" distL="0" distR="0" wp14:anchorId="0E3F25E0" wp14:editId="2C6129D6">
+            <wp:extent cx="5328285" cy="751205"/>
+            <wp:effectExtent l="0" t="0" r="5715" b="0"/>
+            <wp:docPr id="24" name="Image 24"/>
+            <wp:cNvGraphicFramePr>
+              <a:graphicFrameLocks xmlns:a="http://schemas.openxmlformats.org/drawingml/2006/main" noChangeAspect="1"/>
+            </wp:cNvGraphicFramePr>
+            <a:graphic xmlns:a="http://schemas.openxmlformats.org/drawingml/2006/main">
+              <a:graphicData uri="http://schemas.openxmlformats.org/drawingml/2006/picture">
+                <pic:pic xmlns:pic="http://schemas.openxmlformats.org/drawingml/2006/picture">
+                  <pic:nvPicPr>
+                    <pic:cNvPr id="1" name=""/>
+                    <pic:cNvPicPr/>
+                  </pic:nvPicPr>
+                  <pic:blipFill>
+                    <a:blip r:embed="rId41"/>
+                    <a:stretch>
+                      <a:fillRect/>
+                    </a:stretch>
+                  </pic:blipFill>
+                  <pic:spPr>
+                    <a:xfrm>
+                      <a:off x="0" y="0"/>
+                      <a:ext cx="5328285" cy="751205"/>
+                    </a:xfrm>
+                    <a:prstGeom prst="rect">
+                      <a:avLst/>
+                    </a:prstGeom>
+                  </pic:spPr>
+                </pic:pic>
+              </a:graphicData>
+            </a:graphic>
+          </wp:inline>
+        </w:drawing>
       </w:r>
     </w:p>
     <w:p>
@@ -5986,7 +6218,7 @@
                     <pic:cNvPicPr/>
                   </pic:nvPicPr>
                   <pic:blipFill>
-                    <a:blip r:embed="rId38"/>
+                    <a:blip r:embed="rId42"/>
                     <a:stretch>
                       <a:fillRect/>
                     </a:stretch>
@@ -6541,9 +6773,9 @@
       </w:r>
     </w:p>
     <w:sectPr>
-      <w:footerReference w:type="even" r:id="rId39"/>
-      <w:footerReference w:type="default" r:id="rId40"/>
-      <w:footerReference w:type="first" r:id="rId41"/>
+      <w:footerReference w:type="even" r:id="rId43"/>
+      <w:footerReference w:type="default" r:id="rId44"/>
+      <w:footerReference w:type="first" r:id="rId45"/>
       <w:pgSz w:w="12240" w:h="15840"/>
       <w:pgMar w:top="1351" w:right="1977" w:bottom="1412" w:left="1872" w:header="720" w:footer="679" w:gutter="0"/>
       <w:cols w:space="720"/>

</xml_diff>

<commit_message>
j'ai termine la troisieme partie
</commit_message>
<xml_diff>
--- a/Atelier-linux-p1ia-27-juillet-26.docx
+++ b/Atelier-linux-p1ia-27-juillet-26.docx
@@ -2836,7 +2836,7 @@
             <w:tcBorders>
               <w:top w:val="double" w:sz="3" w:space="0" w:color="000000"/>
               <w:left w:val="double" w:sz="4" w:space="0" w:color="000000"/>
-              <w:bottom w:val="double" w:sz="4" w:space="0" w:color="000000"/>
+              <w:bottom w:val="double" w:sz="3" w:space="0" w:color="000000"/>
               <w:right w:val="double" w:sz="4" w:space="0" w:color="000000"/>
             </w:tcBorders>
           </w:tcPr>
@@ -2870,7 +2870,7 @@
             <w:tcBorders>
               <w:top w:val="double" w:sz="3" w:space="0" w:color="000000"/>
               <w:left w:val="double" w:sz="4" w:space="0" w:color="000000"/>
-              <w:bottom w:val="double" w:sz="4" w:space="0" w:color="000000"/>
+              <w:bottom w:val="double" w:sz="3" w:space="0" w:color="000000"/>
               <w:right w:val="double" w:sz="4" w:space="0" w:color="000000"/>
             </w:tcBorders>
           </w:tcPr>
@@ -2892,55 +2892,11 @@
     </w:tbl>
     <w:p>
       <w:r>
-        <w:t xml:space="preserve">Pour chacun : </w:t>
-      </w:r>
-    </w:p>
-    <w:p>
-      <w:pPr>
-        <w:numPr>
-          <w:ilvl w:val="0"/>
-          <w:numId w:val="4"/>
-        </w:numPr>
-        <w:ind w:right="1510" w:hanging="336"/>
-      </w:pPr>
-      <w:proofErr w:type="gramStart"/>
-      <w:r>
-        <w:t>créez</w:t>
-      </w:r>
-      <w:proofErr w:type="gramEnd"/>
-      <w:r>
-        <w:t xml:space="preserve"> un mot de passe ;  </w:t>
-      </w:r>
-    </w:p>
-    <w:p>
-      <w:pPr>
-        <w:numPr>
-          <w:ilvl w:val="0"/>
-          <w:numId w:val="4"/>
-        </w:numPr>
-        <w:spacing w:after="253"/>
-        <w:ind w:right="1510" w:hanging="336"/>
-      </w:pPr>
-      <w:proofErr w:type="gramStart"/>
-      <w:r>
-        <w:t>vérifiez</w:t>
-      </w:r>
-      <w:proofErr w:type="gramEnd"/>
-      <w:r>
-        <w:t xml:space="preserve"> que son répertoire personnel a bien été créé ;</w:t>
-      </w:r>
-    </w:p>
-    <w:p>
-      <w:pPr>
-        <w:spacing w:after="253"/>
-        <w:ind w:left="659" w:right="1510" w:firstLine="0"/>
-      </w:pPr>
-      <w:r>
         <w:drawing>
-          <wp:inline distT="0" distB="0" distL="0" distR="0" wp14:anchorId="2D94D0A4" wp14:editId="3621649C">
-            <wp:extent cx="5328285" cy="706120"/>
-            <wp:effectExtent l="0" t="0" r="5715" b="0"/>
-            <wp:docPr id="23" name="Image 23"/>
+          <wp:inline distT="0" distB="0" distL="0" distR="0" wp14:anchorId="0C10C8B3" wp14:editId="1FED720F">
+            <wp:extent cx="5328285" cy="436245"/>
+            <wp:effectExtent l="0" t="0" r="5715" b="1905"/>
+            <wp:docPr id="28" name="Image 28"/>
             <wp:cNvGraphicFramePr>
               <a:graphicFrameLocks xmlns:a="http://schemas.openxmlformats.org/drawingml/2006/main" noChangeAspect="1"/>
             </wp:cNvGraphicFramePr>
@@ -2960,7 +2916,7 @@
                   <pic:spPr>
                     <a:xfrm>
                       <a:off x="0" y="0"/>
-                      <a:ext cx="5328285" cy="706120"/>
+                      <a:ext cx="5328285" cy="436245"/>
                     </a:xfrm>
                     <a:prstGeom prst="rect">
                       <a:avLst/>
@@ -2972,39 +2928,14 @@
           </wp:inline>
         </w:drawing>
       </w:r>
-      <w:r>
-        <w:t xml:space="preserve">  </w:t>
-      </w:r>
-    </w:p>
-    <w:p>
-      <w:pPr>
-        <w:numPr>
-          <w:ilvl w:val="0"/>
-          <w:numId w:val="4"/>
-        </w:numPr>
-        <w:spacing w:after="253"/>
-        <w:ind w:right="1510" w:hanging="336"/>
-      </w:pPr>
-      <w:proofErr w:type="gramStart"/>
-      <w:r>
-        <w:t>affichez</w:t>
-      </w:r>
-      <w:proofErr w:type="gramEnd"/>
-      <w:r>
-        <w:t xml:space="preserve"> son identifiant (UID) et ses groupes. </w:t>
-      </w:r>
-    </w:p>
-    <w:p>
-      <w:pPr>
-        <w:spacing w:after="253"/>
-        <w:ind w:left="659" w:right="1510" w:firstLine="0"/>
-      </w:pPr>
+    </w:p>
+    <w:p>
       <w:r>
         <w:drawing>
-          <wp:inline distT="0" distB="0" distL="0" distR="0" wp14:anchorId="0E3F25E0" wp14:editId="2C6129D6">
-            <wp:extent cx="5328285" cy="751205"/>
+          <wp:inline distT="0" distB="0" distL="0" distR="0" wp14:anchorId="669F338C" wp14:editId="3789BDBB">
+            <wp:extent cx="5328285" cy="427990"/>
             <wp:effectExtent l="0" t="0" r="5715" b="0"/>
-            <wp:docPr id="24" name="Image 24"/>
+            <wp:docPr id="30" name="Image 30"/>
             <wp:cNvGraphicFramePr>
               <a:graphicFrameLocks xmlns:a="http://schemas.openxmlformats.org/drawingml/2006/main" noChangeAspect="1"/>
             </wp:cNvGraphicFramePr>
@@ -3024,6 +2955,236 @@
                   <pic:spPr>
                     <a:xfrm>
                       <a:off x="0" y="0"/>
+                      <a:ext cx="5328285" cy="427990"/>
+                    </a:xfrm>
+                    <a:prstGeom prst="rect">
+                      <a:avLst/>
+                    </a:prstGeom>
+                  </pic:spPr>
+                </pic:pic>
+              </a:graphicData>
+            </a:graphic>
+          </wp:inline>
+        </w:drawing>
+      </w:r>
+    </w:p>
+    <w:p>
+      <w:r>
+        <w:t xml:space="preserve">Pour chacun : </w:t>
+      </w:r>
+    </w:p>
+    <w:p>
+      <w:pPr>
+        <w:numPr>
+          <w:ilvl w:val="0"/>
+          <w:numId w:val="4"/>
+        </w:numPr>
+        <w:ind w:right="1510" w:hanging="336"/>
+      </w:pPr>
+      <w:proofErr w:type="gramStart"/>
+      <w:r>
+        <w:t>créez</w:t>
+      </w:r>
+      <w:proofErr w:type="gramEnd"/>
+      <w:r>
+        <w:t xml:space="preserve"> un mot de passe ; </w:t>
+      </w:r>
+    </w:p>
+    <w:p>
+      <w:pPr>
+        <w:ind w:left="659" w:right="1510" w:firstLine="0"/>
+      </w:pPr>
+      <w:r>
+        <w:drawing>
+          <wp:inline distT="0" distB="0" distL="0" distR="0" wp14:anchorId="1F1C2398" wp14:editId="0E70696D">
+            <wp:extent cx="5328285" cy="428625"/>
+            <wp:effectExtent l="0" t="0" r="5715" b="9525"/>
+            <wp:docPr id="27" name="Image 27"/>
+            <wp:cNvGraphicFramePr>
+              <a:graphicFrameLocks xmlns:a="http://schemas.openxmlformats.org/drawingml/2006/main" noChangeAspect="1"/>
+            </wp:cNvGraphicFramePr>
+            <a:graphic xmlns:a="http://schemas.openxmlformats.org/drawingml/2006/main">
+              <a:graphicData uri="http://schemas.openxmlformats.org/drawingml/2006/picture">
+                <pic:pic xmlns:pic="http://schemas.openxmlformats.org/drawingml/2006/picture">
+                  <pic:nvPicPr>
+                    <pic:cNvPr id="1" name=""/>
+                    <pic:cNvPicPr/>
+                  </pic:nvPicPr>
+                  <pic:blipFill>
+                    <a:blip r:embed="rId42"/>
+                    <a:stretch>
+                      <a:fillRect/>
+                    </a:stretch>
+                  </pic:blipFill>
+                  <pic:spPr>
+                    <a:xfrm>
+                      <a:off x="0" y="0"/>
+                      <a:ext cx="5328285" cy="428625"/>
+                    </a:xfrm>
+                    <a:prstGeom prst="rect">
+                      <a:avLst/>
+                    </a:prstGeom>
+                  </pic:spPr>
+                </pic:pic>
+              </a:graphicData>
+            </a:graphic>
+          </wp:inline>
+        </w:drawing>
+      </w:r>
+    </w:p>
+    <w:p>
+      <w:pPr>
+        <w:ind w:left="709" w:right="1510" w:firstLine="0"/>
+      </w:pPr>
+      <w:r>
+        <w:drawing>
+          <wp:inline distT="0" distB="0" distL="0" distR="0" wp14:anchorId="5144BB3F" wp14:editId="040B7C7A">
+            <wp:extent cx="5328285" cy="1593215"/>
+            <wp:effectExtent l="0" t="0" r="5715" b="6985"/>
+            <wp:docPr id="25" name="Image 25"/>
+            <wp:cNvGraphicFramePr>
+              <a:graphicFrameLocks xmlns:a="http://schemas.openxmlformats.org/drawingml/2006/main" noChangeAspect="1"/>
+            </wp:cNvGraphicFramePr>
+            <a:graphic xmlns:a="http://schemas.openxmlformats.org/drawingml/2006/main">
+              <a:graphicData uri="http://schemas.openxmlformats.org/drawingml/2006/picture">
+                <pic:pic xmlns:pic="http://schemas.openxmlformats.org/drawingml/2006/picture">
+                  <pic:nvPicPr>
+                    <pic:cNvPr id="1" name=""/>
+                    <pic:cNvPicPr/>
+                  </pic:nvPicPr>
+                  <pic:blipFill>
+                    <a:blip r:embed="rId43"/>
+                    <a:stretch>
+                      <a:fillRect/>
+                    </a:stretch>
+                  </pic:blipFill>
+                  <pic:spPr>
+                    <a:xfrm>
+                      <a:off x="0" y="0"/>
+                      <a:ext cx="5328285" cy="1593215"/>
+                    </a:xfrm>
+                    <a:prstGeom prst="rect">
+                      <a:avLst/>
+                    </a:prstGeom>
+                  </pic:spPr>
+                </pic:pic>
+              </a:graphicData>
+            </a:graphic>
+          </wp:inline>
+        </w:drawing>
+      </w:r>
+      <w:r>
+        <w:t xml:space="preserve"> </w:t>
+      </w:r>
+    </w:p>
+    <w:p>
+      <w:pPr>
+        <w:numPr>
+          <w:ilvl w:val="0"/>
+          <w:numId w:val="4"/>
+        </w:numPr>
+        <w:spacing w:after="253"/>
+        <w:ind w:right="1510" w:hanging="336"/>
+      </w:pPr>
+      <w:r>
+        <w:t>Vérifiez</w:t>
+      </w:r>
+      <w:r>
+        <w:t xml:space="preserve"> que son répertoire personnel a bien été créé ;</w:t>
+      </w:r>
+    </w:p>
+    <w:p>
+      <w:pPr>
+        <w:spacing w:after="253"/>
+        <w:ind w:left="659" w:right="1510" w:firstLine="0"/>
+      </w:pPr>
+      <w:r>
+        <w:drawing>
+          <wp:inline distT="0" distB="0" distL="0" distR="0" wp14:anchorId="2D94D0A4" wp14:editId="3621649C">
+            <wp:extent cx="5328285" cy="706120"/>
+            <wp:effectExtent l="0" t="0" r="5715" b="0"/>
+            <wp:docPr id="23" name="Image 23"/>
+            <wp:cNvGraphicFramePr>
+              <a:graphicFrameLocks xmlns:a="http://schemas.openxmlformats.org/drawingml/2006/main" noChangeAspect="1"/>
+            </wp:cNvGraphicFramePr>
+            <a:graphic xmlns:a="http://schemas.openxmlformats.org/drawingml/2006/main">
+              <a:graphicData uri="http://schemas.openxmlformats.org/drawingml/2006/picture">
+                <pic:pic xmlns:pic="http://schemas.openxmlformats.org/drawingml/2006/picture">
+                  <pic:nvPicPr>
+                    <pic:cNvPr id="1" name=""/>
+                    <pic:cNvPicPr/>
+                  </pic:nvPicPr>
+                  <pic:blipFill>
+                    <a:blip r:embed="rId44"/>
+                    <a:stretch>
+                      <a:fillRect/>
+                    </a:stretch>
+                  </pic:blipFill>
+                  <pic:spPr>
+                    <a:xfrm>
+                      <a:off x="0" y="0"/>
+                      <a:ext cx="5328285" cy="706120"/>
+                    </a:xfrm>
+                    <a:prstGeom prst="rect">
+                      <a:avLst/>
+                    </a:prstGeom>
+                  </pic:spPr>
+                </pic:pic>
+              </a:graphicData>
+            </a:graphic>
+          </wp:inline>
+        </w:drawing>
+      </w:r>
+      <w:r>
+        <w:t xml:space="preserve">  </w:t>
+      </w:r>
+    </w:p>
+    <w:p>
+      <w:pPr>
+        <w:numPr>
+          <w:ilvl w:val="0"/>
+          <w:numId w:val="4"/>
+        </w:numPr>
+        <w:spacing w:after="253"/>
+        <w:ind w:right="1510" w:hanging="336"/>
+      </w:pPr>
+      <w:r>
+        <w:t>Affichez</w:t>
+      </w:r>
+      <w:r>
+        <w:t xml:space="preserve"> son identifiant (UID) et ses groupes. </w:t>
+      </w:r>
+    </w:p>
+    <w:p>
+      <w:pPr>
+        <w:spacing w:after="253"/>
+        <w:ind w:left="659" w:right="1510" w:firstLine="0"/>
+      </w:pPr>
+      <w:r>
+        <w:drawing>
+          <wp:inline distT="0" distB="0" distL="0" distR="0" wp14:anchorId="0E3F25E0" wp14:editId="2C6129D6">
+            <wp:extent cx="5328285" cy="751205"/>
+            <wp:effectExtent l="0" t="0" r="5715" b="0"/>
+            <wp:docPr id="24" name="Image 24"/>
+            <wp:cNvGraphicFramePr>
+              <a:graphicFrameLocks xmlns:a="http://schemas.openxmlformats.org/drawingml/2006/main" noChangeAspect="1"/>
+            </wp:cNvGraphicFramePr>
+            <a:graphic xmlns:a="http://schemas.openxmlformats.org/drawingml/2006/main">
+              <a:graphicData uri="http://schemas.openxmlformats.org/drawingml/2006/picture">
+                <pic:pic xmlns:pic="http://schemas.openxmlformats.org/drawingml/2006/picture">
+                  <pic:nvPicPr>
+                    <pic:cNvPr id="1" name=""/>
+                    <pic:cNvPicPr/>
+                  </pic:nvPicPr>
+                  <pic:blipFill>
+                    <a:blip r:embed="rId45"/>
+                    <a:stretch>
+                      <a:fillRect/>
+                    </a:stretch>
+                  </pic:blipFill>
+                  <pic:spPr>
+                    <a:xfrm>
+                      <a:off x="0" y="0"/>
                       <a:ext cx="5328285" cy="751205"/>
                     </a:xfrm>
                     <a:prstGeom prst="rect">
@@ -3050,11 +3211,17 @@
         <w:t xml:space="preserve">Créez les groupes suivants : </w:t>
       </w:r>
     </w:p>
+    <w:p>
+      <w:pPr>
+        <w:spacing w:after="31"/>
+        <w:ind w:left="661" w:firstLine="0"/>
+      </w:pPr>
+    </w:p>
     <w:tbl>
       <w:tblPr>
         <w:tblStyle w:val="TableGrid"/>
-        <w:tblW w:w="2736" w:type="dxa"/>
-        <w:tblInd w:w="22" w:type="dxa"/>
+        <w:tblW w:w="2900" w:type="dxa"/>
+        <w:tblInd w:w="694" w:type="dxa"/>
         <w:tblCellMar>
           <w:top w:w="80" w:type="dxa"/>
           <w:left w:w="35" w:type="dxa"/>
@@ -3062,7 +3229,7 @@
         <w:tblLook w:val="04A0" w:firstRow="1" w:lastRow="0" w:firstColumn="1" w:lastColumn="0" w:noHBand="0" w:noVBand="1"/>
       </w:tblPr>
       <w:tblGrid>
-        <w:gridCol w:w="814"/>
+        <w:gridCol w:w="978"/>
         <w:gridCol w:w="1922"/>
       </w:tblGrid>
       <w:tr>
@@ -3071,7 +3238,7 @@
         </w:trPr>
         <w:tc>
           <w:tcPr>
-            <w:tcW w:w="814" w:type="dxa"/>
+            <w:tcW w:w="978" w:type="dxa"/>
             <w:tcBorders>
               <w:top w:val="double" w:sz="4" w:space="0" w:color="000000"/>
               <w:left w:val="double" w:sz="4" w:space="0" w:color="000000"/>
@@ -3123,7 +3290,7 @@
         </w:trPr>
         <w:tc>
           <w:tcPr>
-            <w:tcW w:w="814" w:type="dxa"/>
+            <w:tcW w:w="978" w:type="dxa"/>
             <w:tcBorders>
               <w:top w:val="double" w:sz="4" w:space="0" w:color="000000"/>
               <w:left w:val="double" w:sz="4" w:space="0" w:color="000000"/>
@@ -3184,7 +3351,7 @@
         </w:trPr>
         <w:tc>
           <w:tcPr>
-            <w:tcW w:w="814" w:type="dxa"/>
+            <w:tcW w:w="978" w:type="dxa"/>
             <w:tcBorders>
               <w:top w:val="double" w:sz="4" w:space="0" w:color="000000"/>
               <w:left w:val="double" w:sz="4" w:space="0" w:color="000000"/>
@@ -3246,7 +3413,7 @@
         </w:trPr>
         <w:tc>
           <w:tcPr>
-            <w:tcW w:w="814" w:type="dxa"/>
+            <w:tcW w:w="978" w:type="dxa"/>
             <w:tcBorders>
               <w:top w:val="double" w:sz="4" w:space="0" w:color="000000"/>
               <w:left w:val="double" w:sz="4" w:space="0" w:color="000000"/>
@@ -3306,7 +3473,7 @@
         </w:trPr>
         <w:tc>
           <w:tcPr>
-            <w:tcW w:w="814" w:type="dxa"/>
+            <w:tcW w:w="978" w:type="dxa"/>
             <w:tcBorders>
               <w:top w:val="double" w:sz="4" w:space="0" w:color="000000"/>
               <w:left w:val="double" w:sz="4" w:space="0" w:color="000000"/>
@@ -3369,7 +3536,7 @@
         </w:trPr>
         <w:tc>
           <w:tcPr>
-            <w:tcW w:w="814" w:type="dxa"/>
+            <w:tcW w:w="978" w:type="dxa"/>
             <w:tcBorders>
               <w:top w:val="double" w:sz="4" w:space="0" w:color="000000"/>
               <w:left w:val="double" w:sz="4" w:space="0" w:color="000000"/>
@@ -3429,6 +3596,116 @@
     </w:tbl>
     <w:p>
       <w:pPr>
+        <w:ind w:left="661" w:firstLine="0"/>
+        <w:jc w:val="left"/>
+      </w:pPr>
+      <w:r>
+        <w:drawing>
+          <wp:inline distT="0" distB="0" distL="0" distR="0" wp14:anchorId="00304002" wp14:editId="7901980A">
+            <wp:extent cx="5328285" cy="383540"/>
+            <wp:effectExtent l="0" t="0" r="5715" b="0"/>
+            <wp:docPr id="31" name="Image 31"/>
+            <wp:cNvGraphicFramePr>
+              <a:graphicFrameLocks xmlns:a="http://schemas.openxmlformats.org/drawingml/2006/main" noChangeAspect="1"/>
+            </wp:cNvGraphicFramePr>
+            <a:graphic xmlns:a="http://schemas.openxmlformats.org/drawingml/2006/main">
+              <a:graphicData uri="http://schemas.openxmlformats.org/drawingml/2006/picture">
+                <pic:pic xmlns:pic="http://schemas.openxmlformats.org/drawingml/2006/picture">
+                  <pic:nvPicPr>
+                    <pic:cNvPr id="1" name=""/>
+                    <pic:cNvPicPr/>
+                  </pic:nvPicPr>
+                  <pic:blipFill>
+                    <a:blip r:embed="rId46"/>
+                    <a:stretch>
+                      <a:fillRect/>
+                    </a:stretch>
+                  </pic:blipFill>
+                  <pic:spPr>
+                    <a:xfrm>
+                      <a:off x="0" y="0"/>
+                      <a:ext cx="5328285" cy="383540"/>
+                    </a:xfrm>
+                    <a:prstGeom prst="rect">
+                      <a:avLst/>
+                    </a:prstGeom>
+                  </pic:spPr>
+                </pic:pic>
+              </a:graphicData>
+            </a:graphic>
+          </wp:inline>
+        </w:drawing>
+      </w:r>
+    </w:p>
+    <w:p>
+      <w:pPr>
+        <w:pStyle w:val="Paragraphedeliste"/>
+        <w:numPr>
+          <w:ilvl w:val="0"/>
+          <w:numId w:val="12"/>
+        </w:numPr>
+        <w:jc w:val="left"/>
+      </w:pPr>
+      <w:r>
+        <w:t xml:space="preserve">Vérification si les groupe </w:t>
+      </w:r>
+      <w:r>
+        <w:t>ont</w:t>
+      </w:r>
+      <w:r>
+        <w:t xml:space="preserve"> été bien </w:t>
+      </w:r>
+      <w:proofErr w:type="spellStart"/>
+      <w:r>
+        <w:t>cree</w:t>
+      </w:r>
+      <w:proofErr w:type="spellEnd"/>
+    </w:p>
+    <w:p>
+      <w:pPr>
+        <w:ind w:left="661" w:firstLine="0"/>
+        <w:jc w:val="left"/>
+      </w:pPr>
+      <w:r>
+        <w:drawing>
+          <wp:inline distT="0" distB="0" distL="0" distR="0" wp14:anchorId="2A70041F" wp14:editId="39644C9F">
+            <wp:extent cx="5328285" cy="434340"/>
+            <wp:effectExtent l="0" t="0" r="5715" b="3810"/>
+            <wp:docPr id="32" name="Image 32"/>
+            <wp:cNvGraphicFramePr>
+              <a:graphicFrameLocks xmlns:a="http://schemas.openxmlformats.org/drawingml/2006/main" noChangeAspect="1"/>
+            </wp:cNvGraphicFramePr>
+            <a:graphic xmlns:a="http://schemas.openxmlformats.org/drawingml/2006/main">
+              <a:graphicData uri="http://schemas.openxmlformats.org/drawingml/2006/picture">
+                <pic:pic xmlns:pic="http://schemas.openxmlformats.org/drawingml/2006/picture">
+                  <pic:nvPicPr>
+                    <pic:cNvPr id="1" name=""/>
+                    <pic:cNvPicPr/>
+                  </pic:nvPicPr>
+                  <pic:blipFill>
+                    <a:blip r:embed="rId47"/>
+                    <a:stretch>
+                      <a:fillRect/>
+                    </a:stretch>
+                  </pic:blipFill>
+                  <pic:spPr>
+                    <a:xfrm>
+                      <a:off x="0" y="0"/>
+                      <a:ext cx="5328285" cy="434340"/>
+                    </a:xfrm>
+                    <a:prstGeom prst="rect">
+                      <a:avLst/>
+                    </a:prstGeom>
+                  </pic:spPr>
+                </pic:pic>
+              </a:graphicData>
+            </a:graphic>
+          </wp:inline>
+        </w:drawing>
+      </w:r>
+    </w:p>
+    <w:p>
+      <w:pPr>
         <w:numPr>
           <w:ilvl w:val="0"/>
           <w:numId w:val="5"/>
@@ -3441,6 +3718,113 @@
     </w:p>
     <w:p>
       <w:pPr>
+        <w:ind w:left="661" w:firstLine="0"/>
+      </w:pPr>
+      <w:r>
+        <w:drawing>
+          <wp:inline distT="0" distB="0" distL="0" distR="0" wp14:anchorId="27F9DE7A" wp14:editId="03CA1B48">
+            <wp:extent cx="5328285" cy="361315"/>
+            <wp:effectExtent l="0" t="0" r="5715" b="635"/>
+            <wp:docPr id="33" name="Image 33"/>
+            <wp:cNvGraphicFramePr>
+              <a:graphicFrameLocks xmlns:a="http://schemas.openxmlformats.org/drawingml/2006/main" noChangeAspect="1"/>
+            </wp:cNvGraphicFramePr>
+            <a:graphic xmlns:a="http://schemas.openxmlformats.org/drawingml/2006/main">
+              <a:graphicData uri="http://schemas.openxmlformats.org/drawingml/2006/picture">
+                <pic:pic xmlns:pic="http://schemas.openxmlformats.org/drawingml/2006/picture">
+                  <pic:nvPicPr>
+                    <pic:cNvPr id="1" name=""/>
+                    <pic:cNvPicPr/>
+                  </pic:nvPicPr>
+                  <pic:blipFill>
+                    <a:blip r:embed="rId48"/>
+                    <a:stretch>
+                      <a:fillRect/>
+                    </a:stretch>
+                  </pic:blipFill>
+                  <pic:spPr>
+                    <a:xfrm>
+                      <a:off x="0" y="0"/>
+                      <a:ext cx="5328285" cy="361315"/>
+                    </a:xfrm>
+                    <a:prstGeom prst="rect">
+                      <a:avLst/>
+                    </a:prstGeom>
+                  </pic:spPr>
+                </pic:pic>
+              </a:graphicData>
+            </a:graphic>
+          </wp:inline>
+        </w:drawing>
+      </w:r>
+    </w:p>
+    <w:p>
+      <w:pPr>
+        <w:ind w:left="661" w:firstLine="0"/>
+      </w:pPr>
+      <w:r>
+        <w:t>J’avais fait des erreurs ici donc j’ai rectifié</w:t>
+      </w:r>
+    </w:p>
+    <w:p>
+      <w:pPr>
+        <w:ind w:left="661" w:firstLine="0"/>
+      </w:pPr>
+      <w:r>
+        <w:drawing>
+          <wp:inline distT="0" distB="0" distL="0" distR="0" wp14:anchorId="3833B7F0" wp14:editId="450E2A01">
+            <wp:extent cx="5328285" cy="309880"/>
+            <wp:effectExtent l="0" t="0" r="5715" b="0"/>
+            <wp:docPr id="42" name="Image 42"/>
+            <wp:cNvGraphicFramePr>
+              <a:graphicFrameLocks xmlns:a="http://schemas.openxmlformats.org/drawingml/2006/main" noChangeAspect="1"/>
+            </wp:cNvGraphicFramePr>
+            <a:graphic xmlns:a="http://schemas.openxmlformats.org/drawingml/2006/main">
+              <a:graphicData uri="http://schemas.openxmlformats.org/drawingml/2006/picture">
+                <pic:pic xmlns:pic="http://schemas.openxmlformats.org/drawingml/2006/picture">
+                  <pic:nvPicPr>
+                    <pic:cNvPr id="1" name=""/>
+                    <pic:cNvPicPr/>
+                  </pic:nvPicPr>
+                  <pic:blipFill>
+                    <a:blip r:embed="rId49"/>
+                    <a:stretch>
+                      <a:fillRect/>
+                    </a:stretch>
+                  </pic:blipFill>
+                  <pic:spPr>
+                    <a:xfrm>
+                      <a:off x="0" y="0"/>
+                      <a:ext cx="5328285" cy="309880"/>
+                    </a:xfrm>
+                    <a:prstGeom prst="rect">
+                      <a:avLst/>
+                    </a:prstGeom>
+                  </pic:spPr>
+                </pic:pic>
+              </a:graphicData>
+            </a:graphic>
+          </wp:inline>
+        </w:drawing>
+      </w:r>
+    </w:p>
+    <w:p>
+      <w:pPr>
+        <w:ind w:left="661" w:firstLine="0"/>
+      </w:pPr>
+    </w:p>
+    <w:p>
+      <w:pPr>
+        <w:ind w:left="661" w:firstLine="0"/>
+      </w:pPr>
+    </w:p>
+    <w:p>
+      <w:pPr>
+        <w:ind w:left="661" w:firstLine="0"/>
+      </w:pPr>
+    </w:p>
+    <w:p>
+      <w:pPr>
         <w:numPr>
           <w:ilvl w:val="0"/>
           <w:numId w:val="5"/>
@@ -3485,18 +3869,89 @@
         <w:t>shared</w:t>
       </w:r>
       <w:proofErr w:type="spellEnd"/>
-      <w:r>
-        <w:t xml:space="preserve"> </w:t>
-      </w:r>
+    </w:p>
+    <w:p>
+      <w:pPr>
+        <w:ind w:left="661" w:firstLine="0"/>
+        <w:rPr>
+          <w:b/>
+          <w:bCs/>
+          <w:color w:val="auto"/>
+        </w:rPr>
+      </w:pPr>
+      <w:proofErr w:type="spellStart"/>
+      <w:proofErr w:type="gramStart"/>
+      <w:r>
+        <w:rPr>
+          <w:b/>
+          <w:bCs/>
+          <w:color w:val="auto"/>
+        </w:rPr>
+        <w:t>mkdir</w:t>
+      </w:r>
+      <w:proofErr w:type="spellEnd"/>
+      <w:proofErr w:type="gramEnd"/>
+      <w:r>
+        <w:rPr>
+          <w:b/>
+          <w:bCs/>
+          <w:color w:val="auto"/>
+        </w:rPr>
+        <w:t xml:space="preserve"> api backup documentation </w:t>
+      </w:r>
+      <w:proofErr w:type="spellStart"/>
+      <w:r>
+        <w:rPr>
+          <w:b/>
+          <w:bCs/>
+          <w:color w:val="auto"/>
+        </w:rPr>
+        <w:t>shared</w:t>
+      </w:r>
+      <w:proofErr w:type="spellEnd"/>
     </w:p>
     <w:p>
       <w:pPr>
         <w:spacing w:after="276" w:line="259" w:lineRule="auto"/>
-        <w:ind w:left="0" w:firstLine="0"/>
+        <w:ind w:left="661" w:firstLine="0"/>
         <w:jc w:val="left"/>
       </w:pPr>
       <w:r>
-        <w:t xml:space="preserve"> </w:t>
+        <w:drawing>
+          <wp:inline distT="0" distB="0" distL="0" distR="0" wp14:anchorId="7D1848F4" wp14:editId="46E40BB5">
+            <wp:extent cx="5328285" cy="787400"/>
+            <wp:effectExtent l="0" t="0" r="5715" b="0"/>
+            <wp:docPr id="34" name="Image 34"/>
+            <wp:cNvGraphicFramePr>
+              <a:graphicFrameLocks xmlns:a="http://schemas.openxmlformats.org/drawingml/2006/main" noChangeAspect="1"/>
+            </wp:cNvGraphicFramePr>
+            <a:graphic xmlns:a="http://schemas.openxmlformats.org/drawingml/2006/main">
+              <a:graphicData uri="http://schemas.openxmlformats.org/drawingml/2006/picture">
+                <pic:pic xmlns:pic="http://schemas.openxmlformats.org/drawingml/2006/picture">
+                  <pic:nvPicPr>
+                    <pic:cNvPr id="1" name=""/>
+                    <pic:cNvPicPr/>
+                  </pic:nvPicPr>
+                  <pic:blipFill>
+                    <a:blip r:embed="rId50"/>
+                    <a:stretch>
+                      <a:fillRect/>
+                    </a:stretch>
+                  </pic:blipFill>
+                  <pic:spPr>
+                    <a:xfrm>
+                      <a:off x="0" y="0"/>
+                      <a:ext cx="5328285" cy="787400"/>
+                    </a:xfrm>
+                    <a:prstGeom prst="rect">
+                      <a:avLst/>
+                    </a:prstGeom>
+                  </pic:spPr>
+                </pic:pic>
+              </a:graphicData>
+            </a:graphic>
+          </wp:inline>
+        </w:drawing>
       </w:r>
     </w:p>
     <w:p>
@@ -4076,6 +4531,92 @@
     </w:tbl>
     <w:p>
       <w:pPr>
+        <w:spacing w:after="31"/>
+        <w:ind w:left="661" w:firstLine="0"/>
+      </w:pPr>
+      <w:r>
+        <w:drawing>
+          <wp:inline distT="0" distB="0" distL="0" distR="0" wp14:anchorId="010588F1" wp14:editId="5EBFA844">
+            <wp:extent cx="5328285" cy="474980"/>
+            <wp:effectExtent l="0" t="0" r="5715" b="1270"/>
+            <wp:docPr id="35" name="Image 35"/>
+            <wp:cNvGraphicFramePr>
+              <a:graphicFrameLocks xmlns:a="http://schemas.openxmlformats.org/drawingml/2006/main" noChangeAspect="1"/>
+            </wp:cNvGraphicFramePr>
+            <a:graphic xmlns:a="http://schemas.openxmlformats.org/drawingml/2006/main">
+              <a:graphicData uri="http://schemas.openxmlformats.org/drawingml/2006/picture">
+                <pic:pic xmlns:pic="http://schemas.openxmlformats.org/drawingml/2006/picture">
+                  <pic:nvPicPr>
+                    <pic:cNvPr id="1" name=""/>
+                    <pic:cNvPicPr/>
+                  </pic:nvPicPr>
+                  <pic:blipFill>
+                    <a:blip r:embed="rId51"/>
+                    <a:stretch>
+                      <a:fillRect/>
+                    </a:stretch>
+                  </pic:blipFill>
+                  <pic:spPr>
+                    <a:xfrm>
+                      <a:off x="0" y="0"/>
+                      <a:ext cx="5328285" cy="474980"/>
+                    </a:xfrm>
+                    <a:prstGeom prst="rect">
+                      <a:avLst/>
+                    </a:prstGeom>
+                  </pic:spPr>
+                </pic:pic>
+              </a:graphicData>
+            </a:graphic>
+          </wp:inline>
+        </w:drawing>
+      </w:r>
+    </w:p>
+    <w:p>
+      <w:pPr>
+        <w:spacing w:after="31"/>
+        <w:ind w:left="661" w:firstLine="0"/>
+      </w:pPr>
+      <w:r>
+        <w:drawing>
+          <wp:inline distT="0" distB="0" distL="0" distR="0" wp14:anchorId="094C0AB0" wp14:editId="21B38409">
+            <wp:extent cx="5328285" cy="583565"/>
+            <wp:effectExtent l="0" t="0" r="5715" b="6985"/>
+            <wp:docPr id="36" name="Image 36"/>
+            <wp:cNvGraphicFramePr>
+              <a:graphicFrameLocks xmlns:a="http://schemas.openxmlformats.org/drawingml/2006/main" noChangeAspect="1"/>
+            </wp:cNvGraphicFramePr>
+            <a:graphic xmlns:a="http://schemas.openxmlformats.org/drawingml/2006/main">
+              <a:graphicData uri="http://schemas.openxmlformats.org/drawingml/2006/picture">
+                <pic:pic xmlns:pic="http://schemas.openxmlformats.org/drawingml/2006/picture">
+                  <pic:nvPicPr>
+                    <pic:cNvPr id="1" name=""/>
+                    <pic:cNvPicPr/>
+                  </pic:nvPicPr>
+                  <pic:blipFill>
+                    <a:blip r:embed="rId52"/>
+                    <a:stretch>
+                      <a:fillRect/>
+                    </a:stretch>
+                  </pic:blipFill>
+                  <pic:spPr>
+                    <a:xfrm>
+                      <a:off x="0" y="0"/>
+                      <a:ext cx="5328285" cy="583565"/>
+                    </a:xfrm>
+                    <a:prstGeom prst="rect">
+                      <a:avLst/>
+                    </a:prstGeom>
+                  </pic:spPr>
+                </pic:pic>
+              </a:graphicData>
+            </a:graphic>
+          </wp:inline>
+        </w:drawing>
+      </w:r>
+    </w:p>
+    <w:p>
+      <w:pPr>
         <w:numPr>
           <w:ilvl w:val="0"/>
           <w:numId w:val="5"/>
@@ -4132,7 +4673,7 @@
         </w:tc>
         <w:tc>
           <w:tcPr>
-            <w:tcW w:w="814" w:type="dxa"/>
+            <w:tcW w:w="813" w:type="dxa"/>
             <w:tcBorders>
               <w:top w:val="double" w:sz="4" w:space="0" w:color="000000"/>
               <w:left w:val="double" w:sz="4" w:space="0" w:color="000000"/>
@@ -4194,7 +4735,7 @@
         </w:tc>
         <w:tc>
           <w:tcPr>
-            <w:tcW w:w="814" w:type="dxa"/>
+            <w:tcW w:w="813" w:type="dxa"/>
             <w:tcBorders>
               <w:top w:val="double" w:sz="4" w:space="0" w:color="000000"/>
               <w:left w:val="double" w:sz="4" w:space="0" w:color="000000"/>
@@ -4265,7 +4806,7 @@
         </w:tc>
         <w:tc>
           <w:tcPr>
-            <w:tcW w:w="814" w:type="dxa"/>
+            <w:tcW w:w="813" w:type="dxa"/>
             <w:tcBorders>
               <w:top w:val="double" w:sz="4" w:space="0" w:color="000000"/>
               <w:left w:val="double" w:sz="4" w:space="0" w:color="000000"/>
@@ -4334,7 +4875,7 @@
         </w:tc>
         <w:tc>
           <w:tcPr>
-            <w:tcW w:w="814" w:type="dxa"/>
+            <w:tcW w:w="813" w:type="dxa"/>
             <w:tcBorders>
               <w:top w:val="double" w:sz="4" w:space="0" w:color="000000"/>
               <w:left w:val="double" w:sz="4" w:space="0" w:color="000000"/>
@@ -4403,7 +4944,7 @@
         </w:tc>
         <w:tc>
           <w:tcPr>
-            <w:tcW w:w="814" w:type="dxa"/>
+            <w:tcW w:w="813" w:type="dxa"/>
             <w:tcBorders>
               <w:top w:val="double" w:sz="4" w:space="0" w:color="000000"/>
               <w:left w:val="double" w:sz="4" w:space="0" w:color="000000"/>
@@ -4474,7 +5015,7 @@
         </w:tc>
         <w:tc>
           <w:tcPr>
-            <w:tcW w:w="814" w:type="dxa"/>
+            <w:tcW w:w="813" w:type="dxa"/>
             <w:tcBorders>
               <w:top w:val="double" w:sz="4" w:space="0" w:color="000000"/>
               <w:left w:val="double" w:sz="4" w:space="0" w:color="000000"/>
@@ -4544,7 +5085,7 @@
         </w:tc>
         <w:tc>
           <w:tcPr>
-            <w:tcW w:w="814" w:type="dxa"/>
+            <w:tcW w:w="813" w:type="dxa"/>
             <w:tcBorders>
               <w:top w:val="double" w:sz="3" w:space="0" w:color="000000"/>
               <w:left w:val="double" w:sz="4" w:space="0" w:color="000000"/>
@@ -4615,7 +5156,7 @@
         </w:tc>
         <w:tc>
           <w:tcPr>
-            <w:tcW w:w="814" w:type="dxa"/>
+            <w:tcW w:w="813" w:type="dxa"/>
             <w:tcBorders>
               <w:top w:val="double" w:sz="3" w:space="0" w:color="000000"/>
               <w:left w:val="double" w:sz="4" w:space="0" w:color="000000"/>
@@ -4647,6 +5188,49 @@
         </w:tc>
       </w:tr>
     </w:tbl>
+    <w:p>
+      <w:pPr>
+        <w:spacing w:after="29"/>
+        <w:ind w:left="661" w:firstLine="0"/>
+      </w:pPr>
+      <w:r>
+        <w:drawing>
+          <wp:inline distT="0" distB="0" distL="0" distR="0" wp14:anchorId="1C47D5CB" wp14:editId="1044BBDA">
+            <wp:extent cx="5328285" cy="1083945"/>
+            <wp:effectExtent l="0" t="0" r="5715" b="1905"/>
+            <wp:docPr id="37" name="Image 37"/>
+            <wp:cNvGraphicFramePr>
+              <a:graphicFrameLocks xmlns:a="http://schemas.openxmlformats.org/drawingml/2006/main" noChangeAspect="1"/>
+            </wp:cNvGraphicFramePr>
+            <a:graphic xmlns:a="http://schemas.openxmlformats.org/drawingml/2006/main">
+              <a:graphicData uri="http://schemas.openxmlformats.org/drawingml/2006/picture">
+                <pic:pic xmlns:pic="http://schemas.openxmlformats.org/drawingml/2006/picture">
+                  <pic:nvPicPr>
+                    <pic:cNvPr id="1" name=""/>
+                    <pic:cNvPicPr/>
+                  </pic:nvPicPr>
+                  <pic:blipFill>
+                    <a:blip r:embed="rId53"/>
+                    <a:stretch>
+                      <a:fillRect/>
+                    </a:stretch>
+                  </pic:blipFill>
+                  <pic:spPr>
+                    <a:xfrm>
+                      <a:off x="0" y="0"/>
+                      <a:ext cx="5328285" cy="1083945"/>
+                    </a:xfrm>
+                    <a:prstGeom prst="rect">
+                      <a:avLst/>
+                    </a:prstGeom>
+                  </pic:spPr>
+                </pic:pic>
+              </a:graphicData>
+            </a:graphic>
+          </wp:inline>
+        </w:drawing>
+      </w:r>
+    </w:p>
     <w:p>
       <w:pPr>
         <w:numPr>
@@ -4707,7 +5291,7 @@
         </w:tc>
         <w:tc>
           <w:tcPr>
-            <w:tcW w:w="2081" w:type="dxa"/>
+            <w:tcW w:w="2080" w:type="dxa"/>
             <w:gridSpan w:val="2"/>
             <w:tcBorders>
               <w:top w:val="single" w:sz="4" w:space="0" w:color="000000"/>
@@ -4794,7 +5378,7 @@
         </w:tc>
         <w:tc>
           <w:tcPr>
-            <w:tcW w:w="1266" w:type="dxa"/>
+            <w:tcW w:w="1265" w:type="dxa"/>
             <w:tcBorders>
               <w:top w:val="single" w:sz="4" w:space="0" w:color="000000"/>
               <w:left w:val="double" w:sz="4" w:space="0" w:color="000000"/>
@@ -4925,7 +5509,7 @@
         </w:tc>
         <w:tc>
           <w:tcPr>
-            <w:tcW w:w="1266" w:type="dxa"/>
+            <w:tcW w:w="1265" w:type="dxa"/>
             <w:tcBorders>
               <w:top w:val="double" w:sz="4" w:space="0" w:color="000000"/>
               <w:left w:val="double" w:sz="4" w:space="0" w:color="000000"/>
@@ -5052,7 +5636,7 @@
         </w:tc>
         <w:tc>
           <w:tcPr>
-            <w:tcW w:w="1266" w:type="dxa"/>
+            <w:tcW w:w="1265" w:type="dxa"/>
             <w:tcBorders>
               <w:top w:val="double" w:sz="4" w:space="0" w:color="000000"/>
               <w:left w:val="double" w:sz="4" w:space="0" w:color="000000"/>
@@ -5181,7 +5765,7 @@
         </w:tc>
         <w:tc>
           <w:tcPr>
-            <w:tcW w:w="1266" w:type="dxa"/>
+            <w:tcW w:w="1265" w:type="dxa"/>
             <w:tcBorders>
               <w:top w:val="double" w:sz="4" w:space="0" w:color="000000"/>
               <w:left w:val="double" w:sz="4" w:space="0" w:color="000000"/>
@@ -5308,7 +5892,7 @@
         </w:tc>
         <w:tc>
           <w:tcPr>
-            <w:tcW w:w="1266" w:type="dxa"/>
+            <w:tcW w:w="1265" w:type="dxa"/>
             <w:tcBorders>
               <w:top w:val="double" w:sz="4" w:space="0" w:color="000000"/>
               <w:left w:val="double" w:sz="4" w:space="0" w:color="000000"/>
@@ -5426,7 +6010,7 @@
         </w:tc>
         <w:tc>
           <w:tcPr>
-            <w:tcW w:w="1266" w:type="dxa"/>
+            <w:tcW w:w="1265" w:type="dxa"/>
             <w:tcBorders>
               <w:top w:val="double" w:sz="4" w:space="0" w:color="000000"/>
               <w:left w:val="double" w:sz="4" w:space="0" w:color="000000"/>
@@ -5563,7 +6147,7 @@
         </w:tc>
         <w:tc>
           <w:tcPr>
-            <w:tcW w:w="1266" w:type="dxa"/>
+            <w:tcW w:w="1265" w:type="dxa"/>
             <w:tcBorders>
               <w:top w:val="double" w:sz="4" w:space="0" w:color="000000"/>
               <w:left w:val="double" w:sz="4" w:space="0" w:color="000000"/>
@@ -5665,6 +6249,49 @@
     </w:tbl>
     <w:p>
       <w:pPr>
+        <w:spacing w:after="255" w:line="259" w:lineRule="auto"/>
+        <w:ind w:left="661" w:firstLine="0"/>
+      </w:pPr>
+      <w:r>
+        <w:drawing>
+          <wp:inline distT="0" distB="0" distL="0" distR="0" wp14:anchorId="0519CF8C" wp14:editId="1DA4AB9E">
+            <wp:extent cx="5573210" cy="583565"/>
+            <wp:effectExtent l="0" t="0" r="8890" b="6985"/>
+            <wp:docPr id="38" name="Image 38"/>
+            <wp:cNvGraphicFramePr>
+              <a:graphicFrameLocks xmlns:a="http://schemas.openxmlformats.org/drawingml/2006/main" noChangeAspect="1"/>
+            </wp:cNvGraphicFramePr>
+            <a:graphic xmlns:a="http://schemas.openxmlformats.org/drawingml/2006/main">
+              <a:graphicData uri="http://schemas.openxmlformats.org/drawingml/2006/picture">
+                <pic:pic xmlns:pic="http://schemas.openxmlformats.org/drawingml/2006/picture">
+                  <pic:nvPicPr>
+                    <pic:cNvPr id="1" name=""/>
+                    <pic:cNvPicPr/>
+                  </pic:nvPicPr>
+                  <pic:blipFill>
+                    <a:blip r:embed="rId54"/>
+                    <a:stretch>
+                      <a:fillRect/>
+                    </a:stretch>
+                  </pic:blipFill>
+                  <pic:spPr>
+                    <a:xfrm>
+                      <a:off x="0" y="0"/>
+                      <a:ext cx="5634426" cy="589975"/>
+                    </a:xfrm>
+                    <a:prstGeom prst="rect">
+                      <a:avLst/>
+                    </a:prstGeom>
+                  </pic:spPr>
+                </pic:pic>
+              </a:graphicData>
+            </a:graphic>
+          </wp:inline>
+        </w:drawing>
+      </w:r>
+    </w:p>
+    <w:p>
+      <w:pPr>
         <w:numPr>
           <w:ilvl w:val="0"/>
           <w:numId w:val="5"/>
@@ -5700,11 +6327,9 @@
         </w:numPr>
         <w:ind w:firstLine="338"/>
       </w:pPr>
-      <w:proofErr w:type="gramStart"/>
-      <w:r>
-        <w:t>créer</w:t>
-      </w:r>
-      <w:proofErr w:type="gramEnd"/>
+      <w:r>
+        <w:t>Créer</w:t>
+      </w:r>
       <w:r>
         <w:t xml:space="preserve"> un fichier dans </w:t>
       </w:r>
@@ -5717,7 +6342,140 @@
       </w:r>
       <w:proofErr w:type="spellEnd"/>
       <w:r>
-        <w:t xml:space="preserve">  Bob doit pouvoir : </w:t>
+        <w:t xml:space="preserve"> </w:t>
+      </w:r>
+    </w:p>
+    <w:p>
+      <w:pPr>
+        <w:ind w:left="1341" w:firstLine="0"/>
+      </w:pPr>
+      <w:r>
+        <w:drawing>
+          <wp:inline distT="0" distB="0" distL="0" distR="0" wp14:anchorId="605F04B9" wp14:editId="4645AEB0">
+            <wp:extent cx="5328285" cy="236220"/>
+            <wp:effectExtent l="0" t="0" r="5715" b="0"/>
+            <wp:docPr id="39" name="Image 39"/>
+            <wp:cNvGraphicFramePr>
+              <a:graphicFrameLocks xmlns:a="http://schemas.openxmlformats.org/drawingml/2006/main" noChangeAspect="1"/>
+            </wp:cNvGraphicFramePr>
+            <a:graphic xmlns:a="http://schemas.openxmlformats.org/drawingml/2006/main">
+              <a:graphicData uri="http://schemas.openxmlformats.org/drawingml/2006/picture">
+                <pic:pic xmlns:pic="http://schemas.openxmlformats.org/drawingml/2006/picture">
+                  <pic:nvPicPr>
+                    <pic:cNvPr id="1" name=""/>
+                    <pic:cNvPicPr/>
+                  </pic:nvPicPr>
+                  <pic:blipFill>
+                    <a:blip r:embed="rId55"/>
+                    <a:stretch>
+                      <a:fillRect/>
+                    </a:stretch>
+                  </pic:blipFill>
+                  <pic:spPr>
+                    <a:xfrm>
+                      <a:off x="0" y="0"/>
+                      <a:ext cx="5328285" cy="236220"/>
+                    </a:xfrm>
+                    <a:prstGeom prst="rect">
+                      <a:avLst/>
+                    </a:prstGeom>
+                  </pic:spPr>
+                </pic:pic>
+              </a:graphicData>
+            </a:graphic>
+          </wp:inline>
+        </w:drawing>
+      </w:r>
+      <w:r>
+        <w:t xml:space="preserve"> </w:t>
+      </w:r>
+    </w:p>
+    <w:p>
+      <w:pPr>
+        <w:ind w:left="1341" w:firstLine="0"/>
+      </w:pPr>
+      <w:r>
+        <w:drawing>
+          <wp:inline distT="0" distB="0" distL="0" distR="0" wp14:anchorId="27B0E526" wp14:editId="33C3002B">
+            <wp:extent cx="5328285" cy="436245"/>
+            <wp:effectExtent l="0" t="0" r="5715" b="1905"/>
+            <wp:docPr id="40" name="Image 40"/>
+            <wp:cNvGraphicFramePr>
+              <a:graphicFrameLocks xmlns:a="http://schemas.openxmlformats.org/drawingml/2006/main" noChangeAspect="1"/>
+            </wp:cNvGraphicFramePr>
+            <a:graphic xmlns:a="http://schemas.openxmlformats.org/drawingml/2006/main">
+              <a:graphicData uri="http://schemas.openxmlformats.org/drawingml/2006/picture">
+                <pic:pic xmlns:pic="http://schemas.openxmlformats.org/drawingml/2006/picture">
+                  <pic:nvPicPr>
+                    <pic:cNvPr id="1" name=""/>
+                    <pic:cNvPicPr/>
+                  </pic:nvPicPr>
+                  <pic:blipFill>
+                    <a:blip r:embed="rId56"/>
+                    <a:stretch>
+                      <a:fillRect/>
+                    </a:stretch>
+                  </pic:blipFill>
+                  <pic:spPr>
+                    <a:xfrm>
+                      <a:off x="0" y="0"/>
+                      <a:ext cx="5328285" cy="436245"/>
+                    </a:xfrm>
+                    <a:prstGeom prst="rect">
+                      <a:avLst/>
+                    </a:prstGeom>
+                  </pic:spPr>
+                </pic:pic>
+              </a:graphicData>
+            </a:graphic>
+          </wp:inline>
+        </w:drawing>
+      </w:r>
+    </w:p>
+    <w:p>
+      <w:pPr>
+        <w:ind w:left="1341" w:firstLine="0"/>
+      </w:pPr>
+      <w:r>
+        <w:t xml:space="preserve">Oui </w:t>
+      </w:r>
+      <w:proofErr w:type="spellStart"/>
+      <w:r>
+        <w:t>alice</w:t>
+      </w:r>
+      <w:proofErr w:type="spellEnd"/>
+      <w:r>
+        <w:t xml:space="preserve"> </w:t>
+      </w:r>
+      <w:r>
+        <w:t>a réussi</w:t>
+      </w:r>
+      <w:r>
+        <w:t xml:space="preserve"> </w:t>
+      </w:r>
+      <w:r>
+        <w:t xml:space="preserve">de </w:t>
+      </w:r>
+      <w:proofErr w:type="spellStart"/>
+      <w:r>
+        <w:t>cree</w:t>
+      </w:r>
+      <w:proofErr w:type="spellEnd"/>
+      <w:r>
+        <w:t xml:space="preserve"> un fichier dans </w:t>
+      </w:r>
+      <w:proofErr w:type="spellStart"/>
+      <w:r>
+        <w:t>datasets</w:t>
+      </w:r>
+      <w:proofErr w:type="spellEnd"/>
+    </w:p>
+    <w:p>
+      <w:pPr>
+        <w:ind w:firstLine="698"/>
+      </w:pPr>
+      <w:r>
+        <w:t xml:space="preserve">Bob doit pouvoir : </w:t>
       </w:r>
     </w:p>
     <w:p>
@@ -5746,7 +6504,53 @@
       </w:r>
       <w:proofErr w:type="spellEnd"/>
       <w:r>
-        <w:t xml:space="preserve">  </w:t>
+        <w:t xml:space="preserve"> </w:t>
+      </w:r>
+    </w:p>
+    <w:p>
+      <w:pPr>
+        <w:spacing w:after="12" w:line="255" w:lineRule="auto"/>
+        <w:ind w:left="1341" w:firstLine="0"/>
+      </w:pPr>
+      <w:r>
+        <w:drawing>
+          <wp:inline distT="0" distB="0" distL="0" distR="0" wp14:anchorId="67E86657" wp14:editId="2423C482">
+            <wp:extent cx="5328285" cy="241935"/>
+            <wp:effectExtent l="0" t="0" r="5715" b="5715"/>
+            <wp:docPr id="41" name="Image 41"/>
+            <wp:cNvGraphicFramePr>
+              <a:graphicFrameLocks xmlns:a="http://schemas.openxmlformats.org/drawingml/2006/main" noChangeAspect="1"/>
+            </wp:cNvGraphicFramePr>
+            <a:graphic xmlns:a="http://schemas.openxmlformats.org/drawingml/2006/main">
+              <a:graphicData uri="http://schemas.openxmlformats.org/drawingml/2006/picture">
+                <pic:pic xmlns:pic="http://schemas.openxmlformats.org/drawingml/2006/picture">
+                  <pic:nvPicPr>
+                    <pic:cNvPr id="1" name=""/>
+                    <pic:cNvPicPr/>
+                  </pic:nvPicPr>
+                  <pic:blipFill>
+                    <a:blip r:embed="rId57"/>
+                    <a:stretch>
+                      <a:fillRect/>
+                    </a:stretch>
+                  </pic:blipFill>
+                  <pic:spPr>
+                    <a:xfrm>
+                      <a:off x="0" y="0"/>
+                      <a:ext cx="5328285" cy="241935"/>
+                    </a:xfrm>
+                    <a:prstGeom prst="rect">
+                      <a:avLst/>
+                    </a:prstGeom>
+                  </pic:spPr>
+                </pic:pic>
+              </a:graphicData>
+            </a:graphic>
+          </wp:inline>
+        </w:drawing>
+      </w:r>
+      <w:r>
+        <w:t xml:space="preserve"> </w:t>
       </w:r>
     </w:p>
     <w:p>
@@ -5757,11 +6561,9 @@
         </w:numPr>
         <w:ind w:firstLine="338"/>
       </w:pPr>
-      <w:proofErr w:type="gramStart"/>
-      <w:r>
-        <w:t>ne</w:t>
-      </w:r>
-      <w:proofErr w:type="gramEnd"/>
+      <w:r>
+        <w:t>Ne</w:t>
+      </w:r>
       <w:r>
         <w:t xml:space="preserve"> pas modifier </w:t>
       </w:r>
@@ -5775,6 +6577,48 @@
       <w:proofErr w:type="spellEnd"/>
       <w:r>
         <w:t xml:space="preserve">  </w:t>
+      </w:r>
+    </w:p>
+    <w:p>
+      <w:pPr>
+        <w:ind w:left="1341" w:firstLine="0"/>
+      </w:pPr>
+      <w:r>
+        <w:drawing>
+          <wp:inline distT="0" distB="0" distL="0" distR="0" wp14:anchorId="10C7F095" wp14:editId="4BAA97CE">
+            <wp:extent cx="5328285" cy="242570"/>
+            <wp:effectExtent l="0" t="0" r="5715" b="5080"/>
+            <wp:docPr id="43" name="Image 43"/>
+            <wp:cNvGraphicFramePr>
+              <a:graphicFrameLocks xmlns:a="http://schemas.openxmlformats.org/drawingml/2006/main" noChangeAspect="1"/>
+            </wp:cNvGraphicFramePr>
+            <a:graphic xmlns:a="http://schemas.openxmlformats.org/drawingml/2006/main">
+              <a:graphicData uri="http://schemas.openxmlformats.org/drawingml/2006/picture">
+                <pic:pic xmlns:pic="http://schemas.openxmlformats.org/drawingml/2006/picture">
+                  <pic:nvPicPr>
+                    <pic:cNvPr id="1" name=""/>
+                    <pic:cNvPicPr/>
+                  </pic:nvPicPr>
+                  <pic:blipFill>
+                    <a:blip r:embed="rId58"/>
+                    <a:stretch>
+                      <a:fillRect/>
+                    </a:stretch>
+                  </pic:blipFill>
+                  <pic:spPr>
+                    <a:xfrm>
+                      <a:off x="0" y="0"/>
+                      <a:ext cx="5328285" cy="242570"/>
+                    </a:xfrm>
+                    <a:prstGeom prst="rect">
+                      <a:avLst/>
+                    </a:prstGeom>
+                  </pic:spPr>
+                </pic:pic>
+              </a:graphicData>
+            </a:graphic>
+          </wp:inline>
+        </w:drawing>
       </w:r>
     </w:p>
     <w:p>
@@ -5794,11 +6638,9 @@
         <w:spacing w:after="12" w:line="255" w:lineRule="auto"/>
         <w:ind w:firstLine="338"/>
       </w:pPr>
-      <w:proofErr w:type="gramStart"/>
-      <w:r>
-        <w:t>lire</w:t>
-      </w:r>
-      <w:proofErr w:type="gramEnd"/>
+      <w:r>
+        <w:t>Lire</w:t>
+      </w:r>
       <w:r>
         <w:t xml:space="preserve"> </w:t>
       </w:r>
@@ -5809,7 +6651,78 @@
         <w:t>documentation</w:t>
       </w:r>
       <w:r>
-        <w:t xml:space="preserve">  </w:t>
+        <w:t xml:space="preserve"> </w:t>
+      </w:r>
+    </w:p>
+    <w:p>
+      <w:pPr>
+        <w:spacing w:after="12" w:line="255" w:lineRule="auto"/>
+        <w:ind w:left="1341" w:firstLine="0"/>
+      </w:pPr>
+      <w:r>
+        <w:drawing>
+          <wp:inline distT="0" distB="0" distL="0" distR="0" wp14:anchorId="7D5A575F" wp14:editId="4F3314E0">
+            <wp:extent cx="5328285" cy="233680"/>
+            <wp:effectExtent l="0" t="0" r="5715" b="0"/>
+            <wp:docPr id="44" name="Image 44"/>
+            <wp:cNvGraphicFramePr>
+              <a:graphicFrameLocks xmlns:a="http://schemas.openxmlformats.org/drawingml/2006/main" noChangeAspect="1"/>
+            </wp:cNvGraphicFramePr>
+            <a:graphic xmlns:a="http://schemas.openxmlformats.org/drawingml/2006/main">
+              <a:graphicData uri="http://schemas.openxmlformats.org/drawingml/2006/picture">
+                <pic:pic xmlns:pic="http://schemas.openxmlformats.org/drawingml/2006/picture">
+                  <pic:nvPicPr>
+                    <pic:cNvPr id="1" name=""/>
+                    <pic:cNvPicPr/>
+                  </pic:nvPicPr>
+                  <pic:blipFill>
+                    <a:blip r:embed="rId59"/>
+                    <a:stretch>
+                      <a:fillRect/>
+                    </a:stretch>
+                  </pic:blipFill>
+                  <pic:spPr>
+                    <a:xfrm>
+                      <a:off x="0" y="0"/>
+                      <a:ext cx="5328285" cy="233680"/>
+                    </a:xfrm>
+                    <a:prstGeom prst="rect">
+                      <a:avLst/>
+                    </a:prstGeom>
+                  </pic:spPr>
+                </pic:pic>
+              </a:graphicData>
+            </a:graphic>
+          </wp:inline>
+        </w:drawing>
+      </w:r>
+    </w:p>
+    <w:p>
+      <w:pPr>
+        <w:spacing w:after="12" w:line="255" w:lineRule="auto"/>
+        <w:ind w:left="1341" w:firstLine="0"/>
+      </w:pPr>
+      <w:r>
+        <w:t xml:space="preserve">Oui </w:t>
+      </w:r>
+      <w:proofErr w:type="spellStart"/>
+      <w:r>
+        <w:t>eva</w:t>
+      </w:r>
+      <w:proofErr w:type="spellEnd"/>
+      <w:r>
+        <w:t xml:space="preserve"> peut lire car document est un fichier que </w:t>
+      </w:r>
+      <w:proofErr w:type="gramStart"/>
+      <w:r>
+        <w:t>tous le mode</w:t>
+      </w:r>
+      <w:proofErr w:type="gramEnd"/>
+      <w:r>
+        <w:t xml:space="preserve"> peut lire </w:t>
+      </w:r>
+      <w:r>
+        <w:t xml:space="preserve"> </w:t>
       </w:r>
     </w:p>
     <w:p>
@@ -5821,11 +6734,9 @@
         <w:spacing w:after="256"/>
         <w:ind w:firstLine="338"/>
       </w:pPr>
-      <w:proofErr w:type="gramStart"/>
-      <w:r>
-        <w:t>ne</w:t>
-      </w:r>
-      <w:proofErr w:type="gramEnd"/>
+      <w:r>
+        <w:t>Ne</w:t>
+      </w:r>
       <w:r>
         <w:t xml:space="preserve"> pas accéder à </w:t>
       </w:r>
@@ -5834,6 +6745,49 @@
           <w:sz w:val="19"/>
         </w:rPr>
         <w:t>backup</w:t>
+      </w:r>
+    </w:p>
+    <w:p>
+      <w:pPr>
+        <w:spacing w:after="256"/>
+        <w:ind w:left="1341" w:firstLine="0"/>
+      </w:pPr>
+      <w:r>
+        <w:drawing>
+          <wp:inline distT="0" distB="0" distL="0" distR="0" wp14:anchorId="0222F2EC" wp14:editId="172FF960">
+            <wp:extent cx="5328285" cy="344170"/>
+            <wp:effectExtent l="0" t="0" r="5715" b="0"/>
+            <wp:docPr id="45" name="Image 45"/>
+            <wp:cNvGraphicFramePr>
+              <a:graphicFrameLocks xmlns:a="http://schemas.openxmlformats.org/drawingml/2006/main" noChangeAspect="1"/>
+            </wp:cNvGraphicFramePr>
+            <a:graphic xmlns:a="http://schemas.openxmlformats.org/drawingml/2006/main">
+              <a:graphicData uri="http://schemas.openxmlformats.org/drawingml/2006/picture">
+                <pic:pic xmlns:pic="http://schemas.openxmlformats.org/drawingml/2006/picture">
+                  <pic:nvPicPr>
+                    <pic:cNvPr id="1" name=""/>
+                    <pic:cNvPicPr/>
+                  </pic:nvPicPr>
+                  <pic:blipFill>
+                    <a:blip r:embed="rId60"/>
+                    <a:stretch>
+                      <a:fillRect/>
+                    </a:stretch>
+                  </pic:blipFill>
+                  <pic:spPr>
+                    <a:xfrm>
+                      <a:off x="0" y="0"/>
+                      <a:ext cx="5328285" cy="344170"/>
+                    </a:xfrm>
+                    <a:prstGeom prst="rect">
+                      <a:avLst/>
+                    </a:prstGeom>
+                  </pic:spPr>
+                </pic:pic>
+              </a:graphicData>
+            </a:graphic>
+          </wp:inline>
+        </w:drawing>
       </w:r>
       <w:r>
         <w:t xml:space="preserve">  </w:t>
@@ -5867,13 +6821,56 @@
         </w:numPr>
         <w:ind w:left="1005" w:hanging="338"/>
       </w:pPr>
-      <w:proofErr w:type="gramStart"/>
-      <w:r>
-        <w:t>créez</w:t>
-      </w:r>
-      <w:proofErr w:type="gramEnd"/>
-      <w:r>
-        <w:t xml:space="preserve"> son compte ;  </w:t>
+      <w:r>
+        <w:t>Créez</w:t>
+      </w:r>
+      <w:r>
+        <w:t xml:space="preserve"> son compte ; </w:t>
+      </w:r>
+    </w:p>
+    <w:p>
+      <w:pPr>
+        <w:ind w:left="1005" w:firstLine="0"/>
+      </w:pPr>
+      <w:r>
+        <w:drawing>
+          <wp:inline distT="0" distB="0" distL="0" distR="0" wp14:anchorId="320F862D" wp14:editId="7D283FBB">
+            <wp:extent cx="5328285" cy="354330"/>
+            <wp:effectExtent l="0" t="0" r="5715" b="7620"/>
+            <wp:docPr id="47" name="Image 47"/>
+            <wp:cNvGraphicFramePr>
+              <a:graphicFrameLocks xmlns:a="http://schemas.openxmlformats.org/drawingml/2006/main" noChangeAspect="1"/>
+            </wp:cNvGraphicFramePr>
+            <a:graphic xmlns:a="http://schemas.openxmlformats.org/drawingml/2006/main">
+              <a:graphicData uri="http://schemas.openxmlformats.org/drawingml/2006/picture">
+                <pic:pic xmlns:pic="http://schemas.openxmlformats.org/drawingml/2006/picture">
+                  <pic:nvPicPr>
+                    <pic:cNvPr id="1" name=""/>
+                    <pic:cNvPicPr/>
+                  </pic:nvPicPr>
+                  <pic:blipFill>
+                    <a:blip r:embed="rId61"/>
+                    <a:stretch>
+                      <a:fillRect/>
+                    </a:stretch>
+                  </pic:blipFill>
+                  <pic:spPr>
+                    <a:xfrm>
+                      <a:off x="0" y="0"/>
+                      <a:ext cx="5328285" cy="354330"/>
+                    </a:xfrm>
+                    <a:prstGeom prst="rect">
+                      <a:avLst/>
+                    </a:prstGeom>
+                  </pic:spPr>
+                </pic:pic>
+              </a:graphicData>
+            </a:graphic>
+          </wp:inline>
+        </w:drawing>
+      </w:r>
+      <w:r>
+        <w:t xml:space="preserve"> </w:t>
       </w:r>
     </w:p>
     <w:p>
@@ -5884,13 +6881,53 @@
         </w:numPr>
         <w:ind w:left="1005" w:hanging="338"/>
       </w:pPr>
-      <w:proofErr w:type="gramStart"/>
-      <w:r>
-        <w:t>l’ajoutez</w:t>
-      </w:r>
-      <w:proofErr w:type="gramEnd"/>
+      <w:r>
+        <w:t>L’ajoutez</w:t>
+      </w:r>
       <w:r>
         <w:t xml:space="preserve"> aux bons groupes ;  </w:t>
+      </w:r>
+    </w:p>
+    <w:p>
+      <w:pPr>
+        <w:ind w:left="1005" w:firstLine="0"/>
+      </w:pPr>
+      <w:r>
+        <w:drawing>
+          <wp:inline distT="0" distB="0" distL="0" distR="0" wp14:anchorId="785392F7" wp14:editId="485E55A3">
+            <wp:extent cx="5328285" cy="316865"/>
+            <wp:effectExtent l="0" t="0" r="5715" b="6985"/>
+            <wp:docPr id="48" name="Image 48"/>
+            <wp:cNvGraphicFramePr>
+              <a:graphicFrameLocks xmlns:a="http://schemas.openxmlformats.org/drawingml/2006/main" noChangeAspect="1"/>
+            </wp:cNvGraphicFramePr>
+            <a:graphic xmlns:a="http://schemas.openxmlformats.org/drawingml/2006/main">
+              <a:graphicData uri="http://schemas.openxmlformats.org/drawingml/2006/picture">
+                <pic:pic xmlns:pic="http://schemas.openxmlformats.org/drawingml/2006/picture">
+                  <pic:nvPicPr>
+                    <pic:cNvPr id="1" name=""/>
+                    <pic:cNvPicPr/>
+                  </pic:nvPicPr>
+                  <pic:blipFill>
+                    <a:blip r:embed="rId62"/>
+                    <a:stretch>
+                      <a:fillRect/>
+                    </a:stretch>
+                  </pic:blipFill>
+                  <pic:spPr>
+                    <a:xfrm>
+                      <a:off x="0" y="0"/>
+                      <a:ext cx="5328285" cy="316865"/>
+                    </a:xfrm>
+                    <a:prstGeom prst="rect">
+                      <a:avLst/>
+                    </a:prstGeom>
+                  </pic:spPr>
+                </pic:pic>
+              </a:graphicData>
+            </a:graphic>
+          </wp:inline>
+        </w:drawing>
       </w:r>
     </w:p>
     <w:p>
@@ -5901,11 +6938,9 @@
         </w:numPr>
         <w:ind w:left="1005" w:hanging="338"/>
       </w:pPr>
-      <w:proofErr w:type="gramStart"/>
-      <w:r>
-        <w:t>vérifiez</w:t>
-      </w:r>
-      <w:proofErr w:type="gramEnd"/>
+      <w:r>
+        <w:t>Vérifiez</w:t>
+      </w:r>
       <w:r>
         <w:t xml:space="preserve"> qu'il peut travailler dans </w:t>
       </w:r>
@@ -5918,7 +6953,89 @@
       </w:r>
       <w:proofErr w:type="spellEnd"/>
       <w:r>
-        <w:t xml:space="preserve">/ ;  </w:t>
+        <w:t>/ ;</w:t>
+      </w:r>
+    </w:p>
+    <w:p>
+      <w:pPr>
+        <w:ind w:left="1005" w:firstLine="0"/>
+      </w:pPr>
+      <w:r>
+        <w:drawing>
+          <wp:inline distT="0" distB="0" distL="0" distR="0" wp14:anchorId="1D3856CB" wp14:editId="75C35838">
+            <wp:extent cx="5328285" cy="250190"/>
+            <wp:effectExtent l="0" t="0" r="5715" b="0"/>
+            <wp:docPr id="49" name="Image 49"/>
+            <wp:cNvGraphicFramePr>
+              <a:graphicFrameLocks xmlns:a="http://schemas.openxmlformats.org/drawingml/2006/main" noChangeAspect="1"/>
+            </wp:cNvGraphicFramePr>
+            <a:graphic xmlns:a="http://schemas.openxmlformats.org/drawingml/2006/main">
+              <a:graphicData uri="http://schemas.openxmlformats.org/drawingml/2006/picture">
+                <pic:pic xmlns:pic="http://schemas.openxmlformats.org/drawingml/2006/picture">
+                  <pic:nvPicPr>
+                    <pic:cNvPr id="1" name=""/>
+                    <pic:cNvPicPr/>
+                  </pic:nvPicPr>
+                  <pic:blipFill>
+                    <a:blip r:embed="rId63"/>
+                    <a:stretch>
+                      <a:fillRect/>
+                    </a:stretch>
+                  </pic:blipFill>
+                  <pic:spPr>
+                    <a:xfrm>
+                      <a:off x="0" y="0"/>
+                      <a:ext cx="5328285" cy="250190"/>
+                    </a:xfrm>
+                    <a:prstGeom prst="rect">
+                      <a:avLst/>
+                    </a:prstGeom>
+                  </pic:spPr>
+                </pic:pic>
+              </a:graphicData>
+            </a:graphic>
+          </wp:inline>
+        </w:drawing>
+      </w:r>
+    </w:p>
+    <w:p>
+      <w:pPr>
+        <w:ind w:left="1005" w:firstLine="0"/>
+      </w:pPr>
+      <w:r>
+        <w:t xml:space="preserve">Oui </w:t>
+      </w:r>
+      <w:proofErr w:type="spellStart"/>
+      <w:r>
+        <w:t>frank</w:t>
+      </w:r>
+      <w:proofErr w:type="spellEnd"/>
+      <w:r>
+        <w:t xml:space="preserve"> a le droit de travails sur le </w:t>
+      </w:r>
+      <w:proofErr w:type="spellStart"/>
+      <w:r>
+        <w:t>datasets</w:t>
+      </w:r>
+      <w:proofErr w:type="spellEnd"/>
+      <w:r>
+        <w:t xml:space="preserve"> car il fait partie du groupe data qui </w:t>
+      </w:r>
+      <w:proofErr w:type="spellStart"/>
+      <w:r>
+        <w:t>on</w:t>
+      </w:r>
+      <w:proofErr w:type="spellEnd"/>
+      <w:r>
+        <w:t xml:space="preserve"> </w:t>
+      </w:r>
+      <w:proofErr w:type="gramStart"/>
+      <w:r>
+        <w:t>toutes les droit</w:t>
+      </w:r>
+      <w:proofErr w:type="gramEnd"/>
+      <w:r>
+        <w:t xml:space="preserve"> sur dataset</w:t>
       </w:r>
     </w:p>
     <w:p>
@@ -5929,11 +7046,9 @@
         </w:numPr>
         <w:ind w:left="1005" w:hanging="338"/>
       </w:pPr>
-      <w:proofErr w:type="gramStart"/>
-      <w:r>
-        <w:t>vérifiez</w:t>
-      </w:r>
-      <w:proofErr w:type="gramEnd"/>
+      <w:r>
+        <w:t>Vérifiez</w:t>
+      </w:r>
       <w:r>
         <w:t xml:space="preserve"> qu'il ne peut pas modifier </w:t>
       </w:r>
@@ -5945,6 +7060,56 @@
       </w:r>
       <w:r>
         <w:t xml:space="preserve">/ ; </w:t>
+      </w:r>
+    </w:p>
+    <w:p>
+      <w:pPr>
+        <w:ind w:left="1005" w:firstLine="0"/>
+      </w:pPr>
+      <w:r>
+        <w:drawing>
+          <wp:inline distT="0" distB="0" distL="0" distR="0" wp14:anchorId="4CF4C383" wp14:editId="4167A5CC">
+            <wp:extent cx="5328285" cy="369570"/>
+            <wp:effectExtent l="0" t="0" r="5715" b="0"/>
+            <wp:docPr id="50" name="Image 50"/>
+            <wp:cNvGraphicFramePr>
+              <a:graphicFrameLocks xmlns:a="http://schemas.openxmlformats.org/drawingml/2006/main" noChangeAspect="1"/>
+            </wp:cNvGraphicFramePr>
+            <a:graphic xmlns:a="http://schemas.openxmlformats.org/drawingml/2006/main">
+              <a:graphicData uri="http://schemas.openxmlformats.org/drawingml/2006/picture">
+                <pic:pic xmlns:pic="http://schemas.openxmlformats.org/drawingml/2006/picture">
+                  <pic:nvPicPr>
+                    <pic:cNvPr id="1" name=""/>
+                    <pic:cNvPicPr/>
+                  </pic:nvPicPr>
+                  <pic:blipFill>
+                    <a:blip r:embed="rId64"/>
+                    <a:stretch>
+                      <a:fillRect/>
+                    </a:stretch>
+                  </pic:blipFill>
+                  <pic:spPr>
+                    <a:xfrm>
+                      <a:off x="0" y="0"/>
+                      <a:ext cx="5328285" cy="369570"/>
+                    </a:xfrm>
+                    <a:prstGeom prst="rect">
+                      <a:avLst/>
+                    </a:prstGeom>
+                  </pic:spPr>
+                </pic:pic>
+              </a:graphicData>
+            </a:graphic>
+          </wp:inline>
+        </w:drawing>
+      </w:r>
+    </w:p>
+    <w:p>
+      <w:pPr>
+        <w:ind w:left="1005" w:firstLine="0"/>
+      </w:pPr>
+      <w:r>
+        <w:t xml:space="preserve">Backup c’est juste le propriétaire qui a le droit de faire quoi que soit </w:t>
       </w:r>
     </w:p>
     <w:p>
@@ -5956,11 +7121,9 @@
         <w:spacing w:after="293"/>
         <w:ind w:left="1005" w:hanging="338"/>
       </w:pPr>
-      <w:proofErr w:type="gramStart"/>
-      <w:r>
-        <w:t>vérifiez</w:t>
-      </w:r>
-      <w:proofErr w:type="gramEnd"/>
+      <w:r>
+        <w:t>Vérifiez</w:t>
+      </w:r>
       <w:r>
         <w:t xml:space="preserve"> qu'il peut accéder à </w:t>
       </w:r>
@@ -5973,7 +7136,62 @@
       </w:r>
       <w:proofErr w:type="spellEnd"/>
       <w:r>
-        <w:t xml:space="preserve">/ ; </w:t>
+        <w:t>/ ;</w:t>
+      </w:r>
+    </w:p>
+    <w:p>
+      <w:pPr>
+        <w:spacing w:after="293"/>
+        <w:ind w:left="1005" w:firstLine="0"/>
+      </w:pPr>
+      <w:r>
+        <w:drawing>
+          <wp:inline distT="0" distB="0" distL="0" distR="0" wp14:anchorId="0D229C2F" wp14:editId="54976043">
+            <wp:extent cx="5328285" cy="325120"/>
+            <wp:effectExtent l="0" t="0" r="5715" b="0"/>
+            <wp:docPr id="51" name="Image 51"/>
+            <wp:cNvGraphicFramePr>
+              <a:graphicFrameLocks xmlns:a="http://schemas.openxmlformats.org/drawingml/2006/main" noChangeAspect="1"/>
+            </wp:cNvGraphicFramePr>
+            <a:graphic xmlns:a="http://schemas.openxmlformats.org/drawingml/2006/main">
+              <a:graphicData uri="http://schemas.openxmlformats.org/drawingml/2006/picture">
+                <pic:pic xmlns:pic="http://schemas.openxmlformats.org/drawingml/2006/picture">
+                  <pic:nvPicPr>
+                    <pic:cNvPr id="1" name=""/>
+                    <pic:cNvPicPr/>
+                  </pic:nvPicPr>
+                  <pic:blipFill>
+                    <a:blip r:embed="rId65"/>
+                    <a:stretch>
+                      <a:fillRect/>
+                    </a:stretch>
+                  </pic:blipFill>
+                  <pic:spPr>
+                    <a:xfrm>
+                      <a:off x="0" y="0"/>
+                      <a:ext cx="5328285" cy="325120"/>
+                    </a:xfrm>
+                    <a:prstGeom prst="rect">
+                      <a:avLst/>
+                    </a:prstGeom>
+                  </pic:spPr>
+                </pic:pic>
+              </a:graphicData>
+            </a:graphic>
+          </wp:inline>
+        </w:drawing>
+      </w:r>
+      <w:r>
+        <w:t xml:space="preserve"> </w:t>
+      </w:r>
+    </w:p>
+    <w:p>
+      <w:pPr>
+        <w:spacing w:after="293"/>
+        <w:ind w:left="1005" w:firstLine="0"/>
+      </w:pPr>
+      <w:r>
+        <w:t xml:space="preserve">Share peut être modifier par ce qui font partie du groupe data </w:t>
       </w:r>
     </w:p>
     <w:p>
@@ -6218,7 +7436,7 @@
                     <pic:cNvPicPr/>
                   </pic:nvPicPr>
                   <pic:blipFill>
-                    <a:blip r:embed="rId42"/>
+                    <a:blip r:embed="rId66"/>
                     <a:stretch>
                       <a:fillRect/>
                     </a:stretch>
@@ -6773,9 +7991,9 @@
       </w:r>
     </w:p>
     <w:sectPr>
-      <w:footerReference w:type="even" r:id="rId43"/>
-      <w:footerReference w:type="default" r:id="rId44"/>
-      <w:footerReference w:type="first" r:id="rId45"/>
+      <w:footerReference w:type="even" r:id="rId67"/>
+      <w:footerReference w:type="default" r:id="rId68"/>
+      <w:footerReference w:type="first" r:id="rId69"/>
       <w:pgSz w:w="12240" w:h="15840"/>
       <w:pgMar w:top="1351" w:right="1977" w:bottom="1412" w:left="1872" w:header="720" w:footer="679" w:gutter="0"/>
       <w:cols w:space="720"/>
@@ -7829,6 +9047,119 @@
     </w:lvl>
   </w:abstractNum>
   <w:abstractNum w:abstractNumId="4" w15:restartNumberingAfterBreak="0">
+    <w:nsid w:val="15B91A91"/>
+    <w:multiLevelType w:val="hybridMultilevel"/>
+    <w:tmpl w:val="A57879DC"/>
+    <w:lvl w:ilvl="0" w:tplc="040C000D">
+      <w:start w:val="1"/>
+      <w:numFmt w:val="bullet"/>
+      <w:lvlText w:val=""/>
+      <w:lvlJc w:val="left"/>
+      <w:pPr>
+        <w:ind w:left="1381" w:hanging="360"/>
+      </w:pPr>
+      <w:rPr>
+        <w:rFonts w:ascii="Wingdings" w:hAnsi="Wingdings" w:hint="default"/>
+      </w:rPr>
+    </w:lvl>
+    <w:lvl w:ilvl="1" w:tplc="040C0003" w:tentative="1">
+      <w:start w:val="1"/>
+      <w:numFmt w:val="bullet"/>
+      <w:lvlText w:val="o"/>
+      <w:lvlJc w:val="left"/>
+      <w:pPr>
+        <w:ind w:left="2101" w:hanging="360"/>
+      </w:pPr>
+      <w:rPr>
+        <w:rFonts w:ascii="Courier New" w:hAnsi="Courier New" w:cs="Courier New" w:hint="default"/>
+      </w:rPr>
+    </w:lvl>
+    <w:lvl w:ilvl="2" w:tplc="040C0005" w:tentative="1">
+      <w:start w:val="1"/>
+      <w:numFmt w:val="bullet"/>
+      <w:lvlText w:val=""/>
+      <w:lvlJc w:val="left"/>
+      <w:pPr>
+        <w:ind w:left="2821" w:hanging="360"/>
+      </w:pPr>
+      <w:rPr>
+        <w:rFonts w:ascii="Wingdings" w:hAnsi="Wingdings" w:hint="default"/>
+      </w:rPr>
+    </w:lvl>
+    <w:lvl w:ilvl="3" w:tplc="040C0001" w:tentative="1">
+      <w:start w:val="1"/>
+      <w:numFmt w:val="bullet"/>
+      <w:lvlText w:val=""/>
+      <w:lvlJc w:val="left"/>
+      <w:pPr>
+        <w:ind w:left="3541" w:hanging="360"/>
+      </w:pPr>
+      <w:rPr>
+        <w:rFonts w:ascii="Symbol" w:hAnsi="Symbol" w:hint="default"/>
+      </w:rPr>
+    </w:lvl>
+    <w:lvl w:ilvl="4" w:tplc="040C0003" w:tentative="1">
+      <w:start w:val="1"/>
+      <w:numFmt w:val="bullet"/>
+      <w:lvlText w:val="o"/>
+      <w:lvlJc w:val="left"/>
+      <w:pPr>
+        <w:ind w:left="4261" w:hanging="360"/>
+      </w:pPr>
+      <w:rPr>
+        <w:rFonts w:ascii="Courier New" w:hAnsi="Courier New" w:cs="Courier New" w:hint="default"/>
+      </w:rPr>
+    </w:lvl>
+    <w:lvl w:ilvl="5" w:tplc="040C0005" w:tentative="1">
+      <w:start w:val="1"/>
+      <w:numFmt w:val="bullet"/>
+      <w:lvlText w:val=""/>
+      <w:lvlJc w:val="left"/>
+      <w:pPr>
+        <w:ind w:left="4981" w:hanging="360"/>
+      </w:pPr>
+      <w:rPr>
+        <w:rFonts w:ascii="Wingdings" w:hAnsi="Wingdings" w:hint="default"/>
+      </w:rPr>
+    </w:lvl>
+    <w:lvl w:ilvl="6" w:tplc="040C0001" w:tentative="1">
+      <w:start w:val="1"/>
+      <w:numFmt w:val="bullet"/>
+      <w:lvlText w:val=""/>
+      <w:lvlJc w:val="left"/>
+      <w:pPr>
+        <w:ind w:left="5701" w:hanging="360"/>
+      </w:pPr>
+      <w:rPr>
+        <w:rFonts w:ascii="Symbol" w:hAnsi="Symbol" w:hint="default"/>
+      </w:rPr>
+    </w:lvl>
+    <w:lvl w:ilvl="7" w:tplc="040C0003" w:tentative="1">
+      <w:start w:val="1"/>
+      <w:numFmt w:val="bullet"/>
+      <w:lvlText w:val="o"/>
+      <w:lvlJc w:val="left"/>
+      <w:pPr>
+        <w:ind w:left="6421" w:hanging="360"/>
+      </w:pPr>
+      <w:rPr>
+        <w:rFonts w:ascii="Courier New" w:hAnsi="Courier New" w:cs="Courier New" w:hint="default"/>
+      </w:rPr>
+    </w:lvl>
+    <w:lvl w:ilvl="8" w:tplc="040C0005" w:tentative="1">
+      <w:start w:val="1"/>
+      <w:numFmt w:val="bullet"/>
+      <w:lvlText w:val=""/>
+      <w:lvlJc w:val="left"/>
+      <w:pPr>
+        <w:ind w:left="7141" w:hanging="360"/>
+      </w:pPr>
+      <w:rPr>
+        <w:rFonts w:ascii="Wingdings" w:hAnsi="Wingdings" w:hint="default"/>
+      </w:rPr>
+    </w:lvl>
+  </w:abstractNum>
+  <w:abstractNum w:abstractNumId="5" w15:restartNumberingAfterBreak="0">
     <w:nsid w:val="214F7AEA"/>
     <w:multiLevelType w:val="hybridMultilevel"/>
     <w:tmpl w:val="90BCF710"/>
@@ -8041,7 +9372,7 @@
       </w:rPr>
     </w:lvl>
   </w:abstractNum>
-  <w:abstractNum w:abstractNumId="5" w15:restartNumberingAfterBreak="0">
+  <w:abstractNum w:abstractNumId="6" w15:restartNumberingAfterBreak="0">
     <w:nsid w:val="65C62D87"/>
     <w:multiLevelType w:val="hybridMultilevel"/>
     <w:tmpl w:val="996C5746"/>
@@ -8253,7 +9584,7 @@
       </w:rPr>
     </w:lvl>
   </w:abstractNum>
-  <w:abstractNum w:abstractNumId="6" w15:restartNumberingAfterBreak="0">
+  <w:abstractNum w:abstractNumId="7" w15:restartNumberingAfterBreak="0">
     <w:nsid w:val="6F1E2394"/>
     <w:multiLevelType w:val="hybridMultilevel"/>
     <w:tmpl w:val="3AAAE77E"/>
@@ -8465,7 +9796,7 @@
       </w:rPr>
     </w:lvl>
   </w:abstractNum>
-  <w:abstractNum w:abstractNumId="7" w15:restartNumberingAfterBreak="0">
+  <w:abstractNum w:abstractNumId="8" w15:restartNumberingAfterBreak="0">
     <w:nsid w:val="716037A6"/>
     <w:multiLevelType w:val="hybridMultilevel"/>
     <w:tmpl w:val="46EC3830"/>
@@ -8677,7 +10008,7 @@
       </w:rPr>
     </w:lvl>
   </w:abstractNum>
-  <w:abstractNum w:abstractNumId="8" w15:restartNumberingAfterBreak="0">
+  <w:abstractNum w:abstractNumId="9" w15:restartNumberingAfterBreak="0">
     <w:nsid w:val="7BC749AC"/>
     <w:multiLevelType w:val="hybridMultilevel"/>
     <w:tmpl w:val="376208BE"/>
@@ -8889,7 +10220,7 @@
       </w:rPr>
     </w:lvl>
   </w:abstractNum>
-  <w:abstractNum w:abstractNumId="9" w15:restartNumberingAfterBreak="0">
+  <w:abstractNum w:abstractNumId="10" w15:restartNumberingAfterBreak="0">
     <w:nsid w:val="7C2325EA"/>
     <w:multiLevelType w:val="hybridMultilevel"/>
     <w:tmpl w:val="5EBCBECC"/>
@@ -9101,7 +10432,7 @@
       </w:rPr>
     </w:lvl>
   </w:abstractNum>
-  <w:abstractNum w:abstractNumId="10" w15:restartNumberingAfterBreak="0">
+  <w:abstractNum w:abstractNumId="11" w15:restartNumberingAfterBreak="0">
     <w:nsid w:val="7C360A22"/>
     <w:multiLevelType w:val="hybridMultilevel"/>
     <w:tmpl w:val="CAACD308"/>
@@ -9218,34 +10549,37 @@
     <w:abstractNumId w:val="2"/>
   </w:num>
   <w:num w:numId="2">
-    <w:abstractNumId w:val="9"/>
+    <w:abstractNumId w:val="10"/>
   </w:num>
   <w:num w:numId="3">
     <w:abstractNumId w:val="1"/>
   </w:num>
   <w:num w:numId="4">
-    <w:abstractNumId w:val="7"/>
+    <w:abstractNumId w:val="8"/>
   </w:num>
   <w:num w:numId="5">
     <w:abstractNumId w:val="3"/>
   </w:num>
   <w:num w:numId="6">
-    <w:abstractNumId w:val="4"/>
+    <w:abstractNumId w:val="5"/>
   </w:num>
   <w:num w:numId="7">
-    <w:abstractNumId w:val="8"/>
+    <w:abstractNumId w:val="9"/>
   </w:num>
   <w:num w:numId="8">
     <w:abstractNumId w:val="0"/>
   </w:num>
   <w:num w:numId="9">
+    <w:abstractNumId w:val="7"/>
+  </w:num>
+  <w:num w:numId="10">
     <w:abstractNumId w:val="6"/>
   </w:num>
-  <w:num w:numId="10">
-    <w:abstractNumId w:val="5"/>
+  <w:num w:numId="11">
+    <w:abstractNumId w:val="11"/>
   </w:num>
-  <w:num w:numId="11">
-    <w:abstractNumId w:val="10"/>
+  <w:num w:numId="12">
+    <w:abstractNumId w:val="4"/>
   </w:num>
 </w:numbering>
 </file>

</xml_diff>

<commit_message>
j'ai fini l'Installation des logiciels
</commit_message>
<xml_diff>
--- a/Atelier-linux-p1ia-27-juillet-26.docx
+++ b/Atelier-linux-p1ia-27-juillet-26.docx
@@ -7305,10 +7305,275 @@
           <w:ilvl w:val="0"/>
           <w:numId w:val="7"/>
         </w:numPr>
+        <w:spacing w:after="12" w:line="255" w:lineRule="auto"/>
         <w:ind w:left="661" w:hanging="338"/>
       </w:pPr>
       <w:r>
+        <w:drawing>
+          <wp:inline distT="0" distB="0" distL="0" distR="0" wp14:anchorId="66F6C00B" wp14:editId="27306D4A">
+            <wp:extent cx="5328285" cy="1202690"/>
+            <wp:effectExtent l="0" t="0" r="5715" b="0"/>
+            <wp:docPr id="52" name="Image 52"/>
+            <wp:cNvGraphicFramePr>
+              <a:graphicFrameLocks xmlns:a="http://schemas.openxmlformats.org/drawingml/2006/main" noChangeAspect="1"/>
+            </wp:cNvGraphicFramePr>
+            <a:graphic xmlns:a="http://schemas.openxmlformats.org/drawingml/2006/main">
+              <a:graphicData uri="http://schemas.openxmlformats.org/drawingml/2006/picture">
+                <pic:pic xmlns:pic="http://schemas.openxmlformats.org/drawingml/2006/picture">
+                  <pic:nvPicPr>
+                    <pic:cNvPr id="1" name=""/>
+                    <pic:cNvPicPr/>
+                  </pic:nvPicPr>
+                  <pic:blipFill>
+                    <a:blip r:embed="rId66"/>
+                    <a:stretch>
+                      <a:fillRect/>
+                    </a:stretch>
+                  </pic:blipFill>
+                  <pic:spPr>
+                    <a:xfrm>
+                      <a:off x="0" y="0"/>
+                      <a:ext cx="5328285" cy="1202690"/>
+                    </a:xfrm>
+                    <a:prstGeom prst="rect">
+                      <a:avLst/>
+                    </a:prstGeom>
+                  </pic:spPr>
+                </pic:pic>
+              </a:graphicData>
+            </a:graphic>
+          </wp:inline>
+        </w:drawing>
+      </w:r>
+    </w:p>
+    <w:p>
+      <w:pPr>
+        <w:numPr>
+          <w:ilvl w:val="0"/>
+          <w:numId w:val="7"/>
+        </w:numPr>
+        <w:ind w:left="661" w:hanging="338"/>
+      </w:pPr>
+      <w:r>
         <w:t xml:space="preserve">Vérifiez leur installation. </w:t>
+      </w:r>
+    </w:p>
+    <w:p>
+      <w:pPr>
+        <w:ind w:left="661" w:firstLine="0"/>
+        <w:rPr>
+          <w:color w:val="auto"/>
+        </w:rPr>
+      </w:pPr>
+      <w:proofErr w:type="gramStart"/>
+      <w:r>
+        <w:rPr>
+          <w:color w:val="auto"/>
+        </w:rPr>
+        <w:t>git</w:t>
+      </w:r>
+      <w:proofErr w:type="gramEnd"/>
+      <w:r>
+        <w:rPr>
+          <w:color w:val="auto"/>
+        </w:rPr>
+        <w:t xml:space="preserve"> --version </w:t>
+      </w:r>
+      <w:proofErr w:type="spellStart"/>
+      <w:r>
+        <w:rPr>
+          <w:color w:val="auto"/>
+        </w:rPr>
+        <w:t>curl</w:t>
+      </w:r>
+      <w:proofErr w:type="spellEnd"/>
+      <w:r>
+        <w:rPr>
+          <w:color w:val="auto"/>
+        </w:rPr>
+        <w:t xml:space="preserve"> --version </w:t>
+      </w:r>
+      <w:proofErr w:type="spellStart"/>
+      <w:r>
+        <w:rPr>
+          <w:color w:val="auto"/>
+        </w:rPr>
+        <w:t>wget</w:t>
+      </w:r>
+      <w:proofErr w:type="spellEnd"/>
+      <w:r>
+        <w:rPr>
+          <w:color w:val="auto"/>
+        </w:rPr>
+        <w:t xml:space="preserve"> --version </w:t>
+      </w:r>
+      <w:proofErr w:type="spellStart"/>
+      <w:r>
+        <w:rPr>
+          <w:color w:val="auto"/>
+        </w:rPr>
+        <w:t>htop</w:t>
+      </w:r>
+      <w:proofErr w:type="spellEnd"/>
+      <w:r>
+        <w:rPr>
+          <w:color w:val="auto"/>
+        </w:rPr>
+        <w:t xml:space="preserve"> --version </w:t>
+      </w:r>
+      <w:proofErr w:type="spellStart"/>
+      <w:r>
+        <w:rPr>
+          <w:color w:val="auto"/>
+        </w:rPr>
+        <w:t>tree</w:t>
+      </w:r>
+      <w:proofErr w:type="spellEnd"/>
+      <w:r>
+        <w:rPr>
+          <w:color w:val="auto"/>
+        </w:rPr>
+        <w:t xml:space="preserve"> --version python3 --version pip3 --version </w:t>
+      </w:r>
+      <w:proofErr w:type="spellStart"/>
+      <w:r>
+        <w:rPr>
+          <w:color w:val="auto"/>
+        </w:rPr>
+        <w:t>unzip</w:t>
+      </w:r>
+      <w:proofErr w:type="spellEnd"/>
+      <w:r>
+        <w:rPr>
+          <w:color w:val="auto"/>
+        </w:rPr>
+        <w:t xml:space="preserve"> -v</w:t>
+      </w:r>
+    </w:p>
+    <w:p>
+      <w:pPr>
+        <w:ind w:left="661" w:firstLine="0"/>
+      </w:pPr>
+      <w:r>
+        <w:drawing>
+          <wp:inline distT="0" distB="0" distL="0" distR="0" wp14:anchorId="48448802" wp14:editId="08228D38">
+            <wp:extent cx="3283119" cy="196860"/>
+            <wp:effectExtent l="0" t="0" r="0" b="0"/>
+            <wp:docPr id="53" name="Image 53"/>
+            <wp:cNvGraphicFramePr>
+              <a:graphicFrameLocks xmlns:a="http://schemas.openxmlformats.org/drawingml/2006/main" noChangeAspect="1"/>
+            </wp:cNvGraphicFramePr>
+            <a:graphic xmlns:a="http://schemas.openxmlformats.org/drawingml/2006/main">
+              <a:graphicData uri="http://schemas.openxmlformats.org/drawingml/2006/picture">
+                <pic:pic xmlns:pic="http://schemas.openxmlformats.org/drawingml/2006/picture">
+                  <pic:nvPicPr>
+                    <pic:cNvPr id="1" name=""/>
+                    <pic:cNvPicPr/>
+                  </pic:nvPicPr>
+                  <pic:blipFill>
+                    <a:blip r:embed="rId67"/>
+                    <a:stretch>
+                      <a:fillRect/>
+                    </a:stretch>
+                  </pic:blipFill>
+                  <pic:spPr>
+                    <a:xfrm>
+                      <a:off x="0" y="0"/>
+                      <a:ext cx="3283119" cy="196860"/>
+                    </a:xfrm>
+                    <a:prstGeom prst="rect">
+                      <a:avLst/>
+                    </a:prstGeom>
+                  </pic:spPr>
+                </pic:pic>
+              </a:graphicData>
+            </a:graphic>
+          </wp:inline>
+        </w:drawing>
+      </w:r>
+    </w:p>
+    <w:p>
+      <w:pPr>
+        <w:ind w:left="661" w:firstLine="0"/>
+      </w:pPr>
+      <w:r>
+        <w:drawing>
+          <wp:inline distT="0" distB="0" distL="0" distR="0" wp14:anchorId="0A519087" wp14:editId="12AE2A07">
+            <wp:extent cx="5328285" cy="332740"/>
+            <wp:effectExtent l="0" t="0" r="5715" b="0"/>
+            <wp:docPr id="54" name="Image 54"/>
+            <wp:cNvGraphicFramePr>
+              <a:graphicFrameLocks xmlns:a="http://schemas.openxmlformats.org/drawingml/2006/main" noChangeAspect="1"/>
+            </wp:cNvGraphicFramePr>
+            <a:graphic xmlns:a="http://schemas.openxmlformats.org/drawingml/2006/main">
+              <a:graphicData uri="http://schemas.openxmlformats.org/drawingml/2006/picture">
+                <pic:pic xmlns:pic="http://schemas.openxmlformats.org/drawingml/2006/picture">
+                  <pic:nvPicPr>
+                    <pic:cNvPr id="1" name=""/>
+                    <pic:cNvPicPr/>
+                  </pic:nvPicPr>
+                  <pic:blipFill>
+                    <a:blip r:embed="rId68"/>
+                    <a:stretch>
+                      <a:fillRect/>
+                    </a:stretch>
+                  </pic:blipFill>
+                  <pic:spPr>
+                    <a:xfrm>
+                      <a:off x="0" y="0"/>
+                      <a:ext cx="5328285" cy="332740"/>
+                    </a:xfrm>
+                    <a:prstGeom prst="rect">
+                      <a:avLst/>
+                    </a:prstGeom>
+                  </pic:spPr>
+                </pic:pic>
+              </a:graphicData>
+            </a:graphic>
+          </wp:inline>
+        </w:drawing>
+      </w:r>
+    </w:p>
+    <w:p>
+      <w:pPr>
+        <w:ind w:left="661" w:firstLine="0"/>
+      </w:pPr>
+      <w:r>
+        <w:drawing>
+          <wp:inline distT="0" distB="0" distL="0" distR="0" wp14:anchorId="02BB86E0" wp14:editId="3D363DC8">
+            <wp:extent cx="5863166" cy="334010"/>
+            <wp:effectExtent l="0" t="0" r="4445" b="8890"/>
+            <wp:docPr id="55" name="Image 55"/>
+            <wp:cNvGraphicFramePr>
+              <a:graphicFrameLocks xmlns:a="http://schemas.openxmlformats.org/drawingml/2006/main" noChangeAspect="1"/>
+            </wp:cNvGraphicFramePr>
+            <a:graphic xmlns:a="http://schemas.openxmlformats.org/drawingml/2006/main">
+              <a:graphicData uri="http://schemas.openxmlformats.org/drawingml/2006/picture">
+                <pic:pic xmlns:pic="http://schemas.openxmlformats.org/drawingml/2006/picture">
+                  <pic:nvPicPr>
+                    <pic:cNvPr id="1" name=""/>
+                    <pic:cNvPicPr/>
+                  </pic:nvPicPr>
+                  <pic:blipFill>
+                    <a:blip r:embed="rId69"/>
+                    <a:stretch>
+                      <a:fillRect/>
+                    </a:stretch>
+                  </pic:blipFill>
+                  <pic:spPr>
+                    <a:xfrm>
+                      <a:off x="0" y="0"/>
+                      <a:ext cx="5952877" cy="339121"/>
+                    </a:xfrm>
+                    <a:prstGeom prst="rect">
+                      <a:avLst/>
+                    </a:prstGeom>
+                  </pic:spPr>
+                </pic:pic>
+              </a:graphicData>
+            </a:graphic>
+          </wp:inline>
+        </w:drawing>
       </w:r>
     </w:p>
     <w:p>
@@ -7347,19 +7612,111 @@
     </w:p>
     <w:p>
       <w:pPr>
+        <w:spacing w:after="254" w:line="255" w:lineRule="auto"/>
+        <w:ind w:left="687"/>
+        <w:jc w:val="left"/>
+      </w:pPr>
+      <w:r>
+        <w:drawing>
+          <wp:inline distT="0" distB="0" distL="0" distR="0" wp14:anchorId="440A329A" wp14:editId="47663B51">
+            <wp:extent cx="5328285" cy="988060"/>
+            <wp:effectExtent l="0" t="0" r="5715" b="2540"/>
+            <wp:docPr id="57" name="Image 57"/>
+            <wp:cNvGraphicFramePr>
+              <a:graphicFrameLocks xmlns:a="http://schemas.openxmlformats.org/drawingml/2006/main" noChangeAspect="1"/>
+            </wp:cNvGraphicFramePr>
+            <a:graphic xmlns:a="http://schemas.openxmlformats.org/drawingml/2006/main">
+              <a:graphicData uri="http://schemas.openxmlformats.org/drawingml/2006/picture">
+                <pic:pic xmlns:pic="http://schemas.openxmlformats.org/drawingml/2006/picture">
+                  <pic:nvPicPr>
+                    <pic:cNvPr id="1" name=""/>
+                    <pic:cNvPicPr/>
+                  </pic:nvPicPr>
+                  <pic:blipFill>
+                    <a:blip r:embed="rId70"/>
+                    <a:stretch>
+                      <a:fillRect/>
+                    </a:stretch>
+                  </pic:blipFill>
+                  <pic:spPr>
+                    <a:xfrm>
+                      <a:off x="0" y="0"/>
+                      <a:ext cx="5328285" cy="988060"/>
+                    </a:xfrm>
+                    <a:prstGeom prst="rect">
+                      <a:avLst/>
+                    </a:prstGeom>
+                  </pic:spPr>
+                </pic:pic>
+              </a:graphicData>
+            </a:graphic>
+          </wp:inline>
+        </w:drawing>
+      </w:r>
+    </w:p>
+    <w:p>
+      <w:pPr>
         <w:numPr>
           <w:ilvl w:val="0"/>
           <w:numId w:val="7"/>
         </w:numPr>
         <w:ind w:left="661" w:hanging="338"/>
       </w:pPr>
-      <w:proofErr w:type="gramStart"/>
-      <w:r>
-        <w:t>vérifiez</w:t>
-      </w:r>
-      <w:proofErr w:type="gramEnd"/>
-      <w:r>
-        <w:t xml:space="preserve"> sa présence  </w:t>
+      <w:r>
+        <w:t>Vérifiez</w:t>
+      </w:r>
+      <w:r>
+        <w:t xml:space="preserve"> sa présence </w:t>
+      </w:r>
+    </w:p>
+    <w:p>
+      <w:pPr>
+        <w:ind w:left="661" w:firstLine="0"/>
+      </w:pPr>
+      <w:r>
+        <w:drawing>
+          <wp:inline distT="0" distB="0" distL="0" distR="0" wp14:anchorId="4309CDD5" wp14:editId="1D742ED9">
+            <wp:extent cx="5328285" cy="508635"/>
+            <wp:effectExtent l="0" t="0" r="5715" b="5715"/>
+            <wp:docPr id="58" name="Image 58"/>
+            <wp:cNvGraphicFramePr>
+              <a:graphicFrameLocks xmlns:a="http://schemas.openxmlformats.org/drawingml/2006/main" noChangeAspect="1"/>
+            </wp:cNvGraphicFramePr>
+            <a:graphic xmlns:a="http://schemas.openxmlformats.org/drawingml/2006/main">
+              <a:graphicData uri="http://schemas.openxmlformats.org/drawingml/2006/picture">
+                <pic:pic xmlns:pic="http://schemas.openxmlformats.org/drawingml/2006/picture">
+                  <pic:nvPicPr>
+                    <pic:cNvPr id="1" name=""/>
+                    <pic:cNvPicPr/>
+                  </pic:nvPicPr>
+                  <pic:blipFill>
+                    <a:blip r:embed="rId71"/>
+                    <a:stretch>
+                      <a:fillRect/>
+                    </a:stretch>
+                  </pic:blipFill>
+                  <pic:spPr>
+                    <a:xfrm>
+                      <a:off x="0" y="0"/>
+                      <a:ext cx="5328285" cy="508635"/>
+                    </a:xfrm>
+                    <a:prstGeom prst="rect">
+                      <a:avLst/>
+                    </a:prstGeom>
+                  </pic:spPr>
+                </pic:pic>
+              </a:graphicData>
+            </a:graphic>
+          </wp:inline>
+        </w:drawing>
+      </w:r>
+    </w:p>
+    <w:p>
+      <w:pPr>
+        <w:ind w:left="661" w:firstLine="0"/>
+      </w:pPr>
+      <w:r>
+        <w:t xml:space="preserve"> </w:t>
       </w:r>
     </w:p>
     <w:p>
@@ -7371,13 +7728,54 @@
         <w:spacing w:after="293"/>
         <w:ind w:left="661" w:hanging="338"/>
       </w:pPr>
-      <w:proofErr w:type="gramStart"/>
-      <w:r>
-        <w:t>consultez</w:t>
-      </w:r>
-      <w:proofErr w:type="gramEnd"/>
+      <w:r>
+        <w:t>Consultez</w:t>
+      </w:r>
       <w:r>
         <w:t xml:space="preserve"> son contenu </w:t>
+      </w:r>
+    </w:p>
+    <w:p>
+      <w:pPr>
+        <w:spacing w:after="293"/>
+        <w:ind w:left="661" w:firstLine="0"/>
+      </w:pPr>
+      <w:r>
+        <w:drawing>
+          <wp:inline distT="0" distB="0" distL="0" distR="0" wp14:anchorId="2526980D" wp14:editId="60965734">
+            <wp:extent cx="5328285" cy="1033145"/>
+            <wp:effectExtent l="0" t="0" r="5715" b="0"/>
+            <wp:docPr id="59" name="Image 59"/>
+            <wp:cNvGraphicFramePr>
+              <a:graphicFrameLocks xmlns:a="http://schemas.openxmlformats.org/drawingml/2006/main" noChangeAspect="1"/>
+            </wp:cNvGraphicFramePr>
+            <a:graphic xmlns:a="http://schemas.openxmlformats.org/drawingml/2006/main">
+              <a:graphicData uri="http://schemas.openxmlformats.org/drawingml/2006/picture">
+                <pic:pic xmlns:pic="http://schemas.openxmlformats.org/drawingml/2006/picture">
+                  <pic:nvPicPr>
+                    <pic:cNvPr id="1" name=""/>
+                    <pic:cNvPicPr/>
+                  </pic:nvPicPr>
+                  <pic:blipFill>
+                    <a:blip r:embed="rId72"/>
+                    <a:stretch>
+                      <a:fillRect/>
+                    </a:stretch>
+                  </pic:blipFill>
+                  <pic:spPr>
+                    <a:xfrm>
+                      <a:off x="0" y="0"/>
+                      <a:ext cx="5328285" cy="1033145"/>
+                    </a:xfrm>
+                    <a:prstGeom prst="rect">
+                      <a:avLst/>
+                    </a:prstGeom>
+                  </pic:spPr>
+                </pic:pic>
+              </a:graphicData>
+            </a:graphic>
+          </wp:inline>
+        </w:drawing>
       </w:r>
     </w:p>
     <w:p>
@@ -7415,7 +7813,7 @@
     <w:p>
       <w:pPr>
         <w:spacing w:after="220" w:line="259" w:lineRule="auto"/>
-        <w:ind w:left="-2" w:firstLine="0"/>
+        <w:ind w:left="-2" w:firstLine="569"/>
         <w:jc w:val="left"/>
       </w:pPr>
       <w:r>
@@ -7436,7 +7834,7 @@
                     <pic:cNvPicPr/>
                   </pic:nvPicPr>
                   <pic:blipFill>
-                    <a:blip r:embed="rId66"/>
+                    <a:blip r:embed="rId73"/>
                     <a:stretch>
                       <a:fillRect/>
                     </a:stretch>
@@ -7462,17 +7860,22 @@
     </w:p>
     <w:p>
       <w:pPr>
+        <w:spacing w:after="220" w:line="259" w:lineRule="auto"/>
+        <w:ind w:left="-2" w:firstLine="569"/>
+        <w:jc w:val="left"/>
+      </w:pPr>
+    </w:p>
+    <w:p>
+      <w:pPr>
         <w:numPr>
           <w:ilvl w:val="0"/>
           <w:numId w:val="8"/>
         </w:numPr>
         <w:ind w:left="661" w:hanging="338"/>
       </w:pPr>
-      <w:proofErr w:type="gramStart"/>
-      <w:r>
-        <w:t>lancez</w:t>
-      </w:r>
-      <w:proofErr w:type="gramEnd"/>
+      <w:r>
+        <w:t>Lancez</w:t>
+      </w:r>
       <w:r>
         <w:t xml:space="preserve"> le script  </w:t>
       </w:r>
@@ -7485,11 +7888,9 @@
         </w:numPr>
         <w:ind w:left="661" w:hanging="338"/>
       </w:pPr>
-      <w:proofErr w:type="gramStart"/>
-      <w:r>
-        <w:t>observez</w:t>
-      </w:r>
-      <w:proofErr w:type="gramEnd"/>
+      <w:r>
+        <w:t>Observez</w:t>
+      </w:r>
       <w:r>
         <w:t xml:space="preserve"> son PID  </w:t>
       </w:r>
@@ -7991,9 +8392,9 @@
       </w:r>
     </w:p>
     <w:sectPr>
-      <w:footerReference w:type="even" r:id="rId67"/>
-      <w:footerReference w:type="default" r:id="rId68"/>
-      <w:footerReference w:type="first" r:id="rId69"/>
+      <w:footerReference w:type="even" r:id="rId74"/>
+      <w:footerReference w:type="default" r:id="rId75"/>
+      <w:footerReference w:type="first" r:id="rId76"/>
       <w:pgSz w:w="12240" w:h="15840"/>
       <w:pgMar w:top="1351" w:right="1977" w:bottom="1412" w:left="1872" w:header="720" w:footer="679" w:gutter="0"/>
       <w:cols w:space="720"/>

</xml_diff>

<commit_message>
j'ai termine la 5ieme partie
</commit_message>
<xml_diff>
--- a/Atelier-linux-p1ia-27-juillet-26.docx
+++ b/Atelier-linux-p1ia-27-juillet-26.docx
@@ -1106,12 +1106,10 @@
         <w:t xml:space="preserve">On peut remarquer que la commande </w:t>
       </w:r>
       <w:proofErr w:type="spellStart"/>
-      <w:proofErr w:type="gramStart"/>
       <w:r>
         <w:t>a</w:t>
       </w:r>
       <w:proofErr w:type="spellEnd"/>
-      <w:proofErr w:type="gramEnd"/>
       <w:r>
         <w:t xml:space="preserve"> passer</w:t>
       </w:r>
@@ -2551,7 +2549,6 @@
               <w:jc w:val="left"/>
             </w:pPr>
             <w:proofErr w:type="spellStart"/>
-            <w:proofErr w:type="gramStart"/>
             <w:r>
               <w:rPr>
                 <w:sz w:val="23"/>
@@ -2559,7 +2556,6 @@
               <w:t>alice</w:t>
             </w:r>
             <w:proofErr w:type="spellEnd"/>
-            <w:proofErr w:type="gramEnd"/>
             <w:r>
               <w:rPr>
                 <w:sz w:val="23"/>
@@ -2627,19 +2623,11 @@
               <w:ind w:left="0" w:firstLine="0"/>
               <w:jc w:val="left"/>
             </w:pPr>
-            <w:proofErr w:type="gramStart"/>
-            <w:r>
-              <w:rPr>
-                <w:sz w:val="23"/>
-              </w:rPr>
-              <w:t>bob</w:t>
-            </w:r>
-            <w:proofErr w:type="gramEnd"/>
-            <w:r>
-              <w:rPr>
-                <w:sz w:val="23"/>
-              </w:rPr>
-              <w:t xml:space="preserve"> </w:t>
+            <w:r>
+              <w:rPr>
+                <w:sz w:val="23"/>
+              </w:rPr>
+              <w:t xml:space="preserve">bob </w:t>
             </w:r>
           </w:p>
         </w:tc>
@@ -2703,7 +2691,6 @@
               <w:jc w:val="left"/>
             </w:pPr>
             <w:proofErr w:type="spellStart"/>
-            <w:proofErr w:type="gramStart"/>
             <w:r>
               <w:rPr>
                 <w:sz w:val="23"/>
@@ -2711,7 +2698,6 @@
               <w:t>charles</w:t>
             </w:r>
             <w:proofErr w:type="spellEnd"/>
-            <w:proofErr w:type="gramEnd"/>
             <w:r>
               <w:rPr>
                 <w:sz w:val="23"/>
@@ -2764,19 +2750,11 @@
               <w:ind w:left="0" w:firstLine="0"/>
               <w:jc w:val="left"/>
             </w:pPr>
-            <w:proofErr w:type="gramStart"/>
-            <w:r>
-              <w:rPr>
-                <w:sz w:val="23"/>
-              </w:rPr>
-              <w:t>diane</w:t>
-            </w:r>
-            <w:proofErr w:type="gramEnd"/>
-            <w:r>
-              <w:rPr>
-                <w:sz w:val="23"/>
-              </w:rPr>
-              <w:t xml:space="preserve"> </w:t>
+            <w:r>
+              <w:rPr>
+                <w:sz w:val="23"/>
+              </w:rPr>
+              <w:t xml:space="preserve">diane </w:t>
             </w:r>
           </w:p>
         </w:tc>
@@ -2847,7 +2825,6 @@
               <w:jc w:val="left"/>
             </w:pPr>
             <w:proofErr w:type="spellStart"/>
-            <w:proofErr w:type="gramStart"/>
             <w:r>
               <w:rPr>
                 <w:sz w:val="23"/>
@@ -2855,7 +2832,6 @@
               <w:t>eva</w:t>
             </w:r>
             <w:proofErr w:type="spellEnd"/>
-            <w:proofErr w:type="gramEnd"/>
             <w:r>
               <w:rPr>
                 <w:sz w:val="23"/>
@@ -2981,13 +2957,8 @@
         </w:numPr>
         <w:ind w:right="1510" w:hanging="336"/>
       </w:pPr>
-      <w:proofErr w:type="gramStart"/>
-      <w:r>
-        <w:t>créez</w:t>
-      </w:r>
-      <w:proofErr w:type="gramEnd"/>
-      <w:r>
-        <w:t xml:space="preserve"> un mot de passe ; </w:t>
+      <w:r>
+        <w:t xml:space="preserve">créez un mot de passe ; </w:t>
       </w:r>
     </w:p>
     <w:p>
@@ -3304,19 +3275,11 @@
               <w:ind w:left="1" w:firstLine="0"/>
               <w:jc w:val="left"/>
             </w:pPr>
-            <w:proofErr w:type="gramStart"/>
-            <w:r>
-              <w:rPr>
-                <w:sz w:val="23"/>
-              </w:rPr>
-              <w:t>data</w:t>
-            </w:r>
-            <w:proofErr w:type="gramEnd"/>
-            <w:r>
-              <w:rPr>
-                <w:sz w:val="23"/>
-              </w:rPr>
-              <w:t xml:space="preserve"> </w:t>
+            <w:r>
+              <w:rPr>
+                <w:sz w:val="23"/>
+              </w:rPr>
+              <w:t xml:space="preserve">data </w:t>
             </w:r>
           </w:p>
         </w:tc>
@@ -3365,7 +3328,6 @@
               <w:ind w:left="1" w:firstLine="0"/>
             </w:pPr>
             <w:proofErr w:type="spellStart"/>
-            <w:proofErr w:type="gramStart"/>
             <w:r>
               <w:rPr>
                 <w:sz w:val="23"/>
@@ -3373,7 +3335,6 @@
               <w:t>models</w:t>
             </w:r>
             <w:proofErr w:type="spellEnd"/>
-            <w:proofErr w:type="gramEnd"/>
             <w:r>
               <w:rPr>
                 <w:sz w:val="23"/>
@@ -3427,19 +3388,11 @@
               <w:ind w:left="1" w:firstLine="0"/>
               <w:jc w:val="left"/>
             </w:pPr>
-            <w:proofErr w:type="gramStart"/>
-            <w:r>
-              <w:rPr>
-                <w:sz w:val="23"/>
-              </w:rPr>
-              <w:t>api</w:t>
-            </w:r>
-            <w:proofErr w:type="gramEnd"/>
-            <w:r>
-              <w:rPr>
-                <w:sz w:val="23"/>
-              </w:rPr>
-              <w:t xml:space="preserve"> </w:t>
+            <w:r>
+              <w:rPr>
+                <w:sz w:val="23"/>
+              </w:rPr>
+              <w:t xml:space="preserve">api </w:t>
             </w:r>
           </w:p>
         </w:tc>
@@ -3488,7 +3441,6 @@
               <w:jc w:val="left"/>
             </w:pPr>
             <w:proofErr w:type="spellStart"/>
-            <w:proofErr w:type="gramStart"/>
             <w:r>
               <w:rPr>
                 <w:sz w:val="23"/>
@@ -3496,7 +3448,6 @@
               <w:t>mlops</w:t>
             </w:r>
             <w:proofErr w:type="spellEnd"/>
-            <w:proofErr w:type="gramEnd"/>
             <w:r>
               <w:rPr>
                 <w:sz w:val="23"/>
@@ -3551,7 +3502,6 @@
               <w:jc w:val="left"/>
             </w:pPr>
             <w:proofErr w:type="spellStart"/>
-            <w:proofErr w:type="gramStart"/>
             <w:r>
               <w:rPr>
                 <w:sz w:val="23"/>
@@ -3559,7 +3509,6 @@
               <w:t>interns</w:t>
             </w:r>
             <w:proofErr w:type="spellEnd"/>
-            <w:proofErr w:type="gramEnd"/>
             <w:r>
               <w:rPr>
                 <w:sz w:val="23"/>
@@ -3880,7 +3829,6 @@
         </w:rPr>
       </w:pPr>
       <w:proofErr w:type="spellStart"/>
-      <w:proofErr w:type="gramStart"/>
       <w:r>
         <w:rPr>
           <w:b/>
@@ -3890,7 +3838,6 @@
         <w:t>mkdir</w:t>
       </w:r>
       <w:proofErr w:type="spellEnd"/>
-      <w:proofErr w:type="gramEnd"/>
       <w:r>
         <w:rPr>
           <w:b/>
@@ -4055,7 +4002,6 @@
               <w:jc w:val="left"/>
             </w:pPr>
             <w:proofErr w:type="spellStart"/>
-            <w:proofErr w:type="gramStart"/>
             <w:r>
               <w:rPr>
                 <w:sz w:val="23"/>
@@ -4063,7 +4009,6 @@
               <w:t>datasets</w:t>
             </w:r>
             <w:proofErr w:type="spellEnd"/>
-            <w:proofErr w:type="gramEnd"/>
             <w:r>
               <w:rPr>
                 <w:sz w:val="23"/>
@@ -4089,7 +4034,6 @@
               <w:jc w:val="left"/>
             </w:pPr>
             <w:proofErr w:type="spellStart"/>
-            <w:proofErr w:type="gramStart"/>
             <w:r>
               <w:rPr>
                 <w:sz w:val="23"/>
@@ -4097,7 +4041,6 @@
               <w:t>alice</w:t>
             </w:r>
             <w:proofErr w:type="spellEnd"/>
-            <w:proofErr w:type="gramEnd"/>
             <w:r>
               <w:rPr>
                 <w:sz w:val="23"/>
@@ -4128,7 +4071,6 @@
               <w:jc w:val="left"/>
             </w:pPr>
             <w:proofErr w:type="spellStart"/>
-            <w:proofErr w:type="gramStart"/>
             <w:r>
               <w:rPr>
                 <w:sz w:val="23"/>
@@ -4136,7 +4078,6 @@
               <w:t>models</w:t>
             </w:r>
             <w:proofErr w:type="spellEnd"/>
-            <w:proofErr w:type="gramEnd"/>
             <w:r>
               <w:rPr>
                 <w:sz w:val="23"/>
@@ -4162,7 +4103,6 @@
               <w:jc w:val="left"/>
             </w:pPr>
             <w:proofErr w:type="spellStart"/>
-            <w:proofErr w:type="gramStart"/>
             <w:r>
               <w:rPr>
                 <w:sz w:val="23"/>
@@ -4170,7 +4110,6 @@
               <w:t>alice</w:t>
             </w:r>
             <w:proofErr w:type="spellEnd"/>
-            <w:proofErr w:type="gramEnd"/>
             <w:r>
               <w:rPr>
                 <w:sz w:val="23"/>
@@ -4200,19 +4139,11 @@
               <w:ind w:left="0" w:firstLine="0"/>
               <w:jc w:val="left"/>
             </w:pPr>
-            <w:proofErr w:type="gramStart"/>
-            <w:r>
-              <w:rPr>
-                <w:sz w:val="23"/>
-              </w:rPr>
-              <w:t>api</w:t>
-            </w:r>
-            <w:proofErr w:type="gramEnd"/>
-            <w:r>
-              <w:rPr>
-                <w:sz w:val="23"/>
-              </w:rPr>
-              <w:t xml:space="preserve"> </w:t>
+            <w:r>
+              <w:rPr>
+                <w:sz w:val="23"/>
+              </w:rPr>
+              <w:t xml:space="preserve">api </w:t>
             </w:r>
           </w:p>
         </w:tc>
@@ -4233,7 +4164,6 @@
               <w:jc w:val="left"/>
             </w:pPr>
             <w:proofErr w:type="spellStart"/>
-            <w:proofErr w:type="gramStart"/>
             <w:r>
               <w:rPr>
                 <w:sz w:val="23"/>
@@ -4241,7 +4171,6 @@
               <w:t>charles</w:t>
             </w:r>
             <w:proofErr w:type="spellEnd"/>
-            <w:proofErr w:type="gramEnd"/>
             <w:r>
               <w:rPr>
                 <w:sz w:val="23"/>
@@ -4271,19 +4200,11 @@
               <w:ind w:left="0" w:firstLine="0"/>
               <w:jc w:val="left"/>
             </w:pPr>
-            <w:proofErr w:type="gramStart"/>
-            <w:r>
-              <w:rPr>
-                <w:sz w:val="23"/>
-              </w:rPr>
-              <w:t>logs</w:t>
-            </w:r>
-            <w:proofErr w:type="gramEnd"/>
-            <w:r>
-              <w:rPr>
-                <w:sz w:val="23"/>
-              </w:rPr>
-              <w:t xml:space="preserve"> </w:t>
+            <w:r>
+              <w:rPr>
+                <w:sz w:val="23"/>
+              </w:rPr>
+              <w:t xml:space="preserve">logs </w:t>
             </w:r>
           </w:p>
         </w:tc>
@@ -4303,19 +4224,11 @@
               <w:ind w:left="2" w:firstLine="0"/>
               <w:jc w:val="left"/>
             </w:pPr>
-            <w:proofErr w:type="gramStart"/>
-            <w:r>
-              <w:rPr>
-                <w:sz w:val="23"/>
-              </w:rPr>
-              <w:t>diane</w:t>
-            </w:r>
-            <w:proofErr w:type="gramEnd"/>
-            <w:r>
-              <w:rPr>
-                <w:sz w:val="23"/>
-              </w:rPr>
-              <w:t xml:space="preserve"> </w:t>
+            <w:r>
+              <w:rPr>
+                <w:sz w:val="23"/>
+              </w:rPr>
+              <w:t xml:space="preserve">diane </w:t>
             </w:r>
           </w:p>
         </w:tc>
@@ -4340,19 +4253,11 @@
               <w:ind w:left="0" w:firstLine="0"/>
               <w:jc w:val="left"/>
             </w:pPr>
-            <w:proofErr w:type="gramStart"/>
-            <w:r>
-              <w:rPr>
-                <w:sz w:val="23"/>
-              </w:rPr>
-              <w:t>backup</w:t>
-            </w:r>
-            <w:proofErr w:type="gramEnd"/>
-            <w:r>
-              <w:rPr>
-                <w:sz w:val="23"/>
-              </w:rPr>
-              <w:t xml:space="preserve"> </w:t>
+            <w:r>
+              <w:rPr>
+                <w:sz w:val="23"/>
+              </w:rPr>
+              <w:t xml:space="preserve">backup </w:t>
             </w:r>
           </w:p>
         </w:tc>
@@ -4372,19 +4277,11 @@
               <w:ind w:left="3" w:firstLine="0"/>
               <w:jc w:val="left"/>
             </w:pPr>
-            <w:proofErr w:type="gramStart"/>
-            <w:r>
-              <w:rPr>
-                <w:sz w:val="23"/>
-              </w:rPr>
-              <w:t>diane</w:t>
-            </w:r>
-            <w:proofErr w:type="gramEnd"/>
-            <w:r>
-              <w:rPr>
-                <w:sz w:val="23"/>
-              </w:rPr>
-              <w:t xml:space="preserve"> </w:t>
+            <w:r>
+              <w:rPr>
+                <w:sz w:val="23"/>
+              </w:rPr>
+              <w:t xml:space="preserve">diane </w:t>
             </w:r>
           </w:p>
         </w:tc>
@@ -4408,19 +4305,11 @@
               <w:spacing w:after="0" w:line="259" w:lineRule="auto"/>
               <w:ind w:left="0" w:firstLine="0"/>
             </w:pPr>
-            <w:proofErr w:type="gramStart"/>
-            <w:r>
-              <w:rPr>
-                <w:sz w:val="23"/>
-              </w:rPr>
-              <w:t>documentation</w:t>
-            </w:r>
-            <w:proofErr w:type="gramEnd"/>
-            <w:r>
-              <w:rPr>
-                <w:sz w:val="23"/>
-              </w:rPr>
-              <w:t xml:space="preserve"> </w:t>
+            <w:r>
+              <w:rPr>
+                <w:sz w:val="23"/>
+              </w:rPr>
+              <w:t xml:space="preserve">documentation </w:t>
             </w:r>
           </w:p>
         </w:tc>
@@ -4440,19 +4329,11 @@
               <w:ind w:left="2" w:firstLine="0"/>
               <w:jc w:val="left"/>
             </w:pPr>
-            <w:proofErr w:type="gramStart"/>
-            <w:r>
-              <w:rPr>
-                <w:sz w:val="23"/>
-              </w:rPr>
-              <w:t>bob</w:t>
-            </w:r>
-            <w:proofErr w:type="gramEnd"/>
-            <w:r>
-              <w:rPr>
-                <w:sz w:val="23"/>
-              </w:rPr>
-              <w:t xml:space="preserve"> </w:t>
+            <w:r>
+              <w:rPr>
+                <w:sz w:val="23"/>
+              </w:rPr>
+              <w:t xml:space="preserve">bob </w:t>
             </w:r>
           </w:p>
         </w:tc>
@@ -4478,7 +4359,6 @@
               <w:jc w:val="left"/>
             </w:pPr>
             <w:proofErr w:type="spellStart"/>
-            <w:proofErr w:type="gramStart"/>
             <w:r>
               <w:rPr>
                 <w:sz w:val="23"/>
@@ -4486,7 +4366,6 @@
               <w:t>shared</w:t>
             </w:r>
             <w:proofErr w:type="spellEnd"/>
-            <w:proofErr w:type="gramEnd"/>
             <w:r>
               <w:rPr>
                 <w:sz w:val="23"/>
@@ -4511,19 +4390,11 @@
               <w:ind w:left="3" w:firstLine="0"/>
               <w:jc w:val="left"/>
             </w:pPr>
-            <w:proofErr w:type="gramStart"/>
-            <w:r>
-              <w:rPr>
-                <w:sz w:val="23"/>
-              </w:rPr>
-              <w:t>root</w:t>
-            </w:r>
-            <w:proofErr w:type="gramEnd"/>
-            <w:r>
-              <w:rPr>
-                <w:sz w:val="23"/>
-              </w:rPr>
-              <w:t xml:space="preserve"> </w:t>
+            <w:r>
+              <w:rPr>
+                <w:sz w:val="23"/>
+              </w:rPr>
+              <w:t xml:space="preserve">root </w:t>
             </w:r>
           </w:p>
         </w:tc>
@@ -4716,7 +4587,6 @@
               <w:jc w:val="left"/>
             </w:pPr>
             <w:proofErr w:type="spellStart"/>
-            <w:proofErr w:type="gramStart"/>
             <w:r>
               <w:rPr>
                 <w:sz w:val="23"/>
@@ -4724,7 +4594,6 @@
               <w:t>datasets</w:t>
             </w:r>
             <w:proofErr w:type="spellEnd"/>
-            <w:proofErr w:type="gramEnd"/>
             <w:r>
               <w:rPr>
                 <w:sz w:val="23"/>
@@ -4749,19 +4618,11 @@
               <w:ind w:left="1" w:firstLine="0"/>
               <w:jc w:val="left"/>
             </w:pPr>
-            <w:proofErr w:type="gramStart"/>
-            <w:r>
-              <w:rPr>
-                <w:sz w:val="23"/>
-              </w:rPr>
-              <w:t>data</w:t>
-            </w:r>
-            <w:proofErr w:type="gramEnd"/>
-            <w:r>
-              <w:rPr>
-                <w:sz w:val="23"/>
-              </w:rPr>
-              <w:t xml:space="preserve"> </w:t>
+            <w:r>
+              <w:rPr>
+                <w:sz w:val="23"/>
+              </w:rPr>
+              <w:t xml:space="preserve">data </w:t>
             </w:r>
           </w:p>
         </w:tc>
@@ -4787,7 +4648,6 @@
               <w:jc w:val="left"/>
             </w:pPr>
             <w:proofErr w:type="spellStart"/>
-            <w:proofErr w:type="gramStart"/>
             <w:r>
               <w:rPr>
                 <w:sz w:val="23"/>
@@ -4795,7 +4655,6 @@
               <w:t>models</w:t>
             </w:r>
             <w:proofErr w:type="spellEnd"/>
-            <w:proofErr w:type="gramEnd"/>
             <w:r>
               <w:rPr>
                 <w:sz w:val="23"/>
@@ -4820,19 +4679,11 @@
               <w:ind w:left="2" w:firstLine="0"/>
               <w:jc w:val="left"/>
             </w:pPr>
-            <w:proofErr w:type="gramStart"/>
-            <w:r>
-              <w:rPr>
-                <w:sz w:val="23"/>
-              </w:rPr>
-              <w:t>data</w:t>
-            </w:r>
-            <w:proofErr w:type="gramEnd"/>
-            <w:r>
-              <w:rPr>
-                <w:sz w:val="23"/>
-              </w:rPr>
-              <w:t xml:space="preserve"> </w:t>
+            <w:r>
+              <w:rPr>
+                <w:sz w:val="23"/>
+              </w:rPr>
+              <w:t xml:space="preserve">data </w:t>
             </w:r>
           </w:p>
         </w:tc>
@@ -4857,19 +4708,11 @@
               <w:ind w:left="0" w:firstLine="0"/>
               <w:jc w:val="left"/>
             </w:pPr>
-            <w:proofErr w:type="gramStart"/>
-            <w:r>
-              <w:rPr>
-                <w:sz w:val="23"/>
-              </w:rPr>
-              <w:t>api</w:t>
-            </w:r>
-            <w:proofErr w:type="gramEnd"/>
-            <w:r>
-              <w:rPr>
-                <w:sz w:val="23"/>
-              </w:rPr>
-              <w:t xml:space="preserve"> </w:t>
+            <w:r>
+              <w:rPr>
+                <w:sz w:val="23"/>
+              </w:rPr>
+              <w:t xml:space="preserve">api </w:t>
             </w:r>
           </w:p>
         </w:tc>
@@ -4889,19 +4732,11 @@
               <w:ind w:left="2" w:firstLine="0"/>
               <w:jc w:val="left"/>
             </w:pPr>
-            <w:proofErr w:type="gramStart"/>
-            <w:r>
-              <w:rPr>
-                <w:sz w:val="23"/>
-              </w:rPr>
-              <w:t>api</w:t>
-            </w:r>
-            <w:proofErr w:type="gramEnd"/>
-            <w:r>
-              <w:rPr>
-                <w:sz w:val="23"/>
-              </w:rPr>
-              <w:t xml:space="preserve"> </w:t>
+            <w:r>
+              <w:rPr>
+                <w:sz w:val="23"/>
+              </w:rPr>
+              <w:t xml:space="preserve">api </w:t>
             </w:r>
           </w:p>
         </w:tc>
@@ -4926,19 +4761,11 @@
               <w:ind w:left="0" w:firstLine="0"/>
               <w:jc w:val="left"/>
             </w:pPr>
-            <w:proofErr w:type="gramStart"/>
-            <w:r>
-              <w:rPr>
-                <w:sz w:val="23"/>
-              </w:rPr>
-              <w:t>logs</w:t>
-            </w:r>
-            <w:proofErr w:type="gramEnd"/>
-            <w:r>
-              <w:rPr>
-                <w:sz w:val="23"/>
-              </w:rPr>
-              <w:t xml:space="preserve"> </w:t>
+            <w:r>
+              <w:rPr>
+                <w:sz w:val="23"/>
+              </w:rPr>
+              <w:t xml:space="preserve">logs </w:t>
             </w:r>
           </w:p>
         </w:tc>
@@ -4959,7 +4786,6 @@
               <w:jc w:val="left"/>
             </w:pPr>
             <w:proofErr w:type="spellStart"/>
-            <w:proofErr w:type="gramStart"/>
             <w:r>
               <w:rPr>
                 <w:sz w:val="23"/>
@@ -4967,7 +4793,6 @@
               <w:t>mlops</w:t>
             </w:r>
             <w:proofErr w:type="spellEnd"/>
-            <w:proofErr w:type="gramEnd"/>
             <w:r>
               <w:rPr>
                 <w:sz w:val="23"/>
@@ -4997,19 +4822,11 @@
               <w:ind w:left="0" w:firstLine="0"/>
               <w:jc w:val="left"/>
             </w:pPr>
-            <w:proofErr w:type="gramStart"/>
-            <w:r>
-              <w:rPr>
-                <w:sz w:val="23"/>
-              </w:rPr>
-              <w:t>backup</w:t>
-            </w:r>
-            <w:proofErr w:type="gramEnd"/>
-            <w:r>
-              <w:rPr>
-                <w:sz w:val="23"/>
-              </w:rPr>
-              <w:t xml:space="preserve"> </w:t>
+            <w:r>
+              <w:rPr>
+                <w:sz w:val="23"/>
+              </w:rPr>
+              <w:t xml:space="preserve">backup </w:t>
             </w:r>
           </w:p>
         </w:tc>
@@ -5030,7 +4847,6 @@
               <w:jc w:val="left"/>
             </w:pPr>
             <w:proofErr w:type="spellStart"/>
-            <w:proofErr w:type="gramStart"/>
             <w:r>
               <w:rPr>
                 <w:sz w:val="23"/>
@@ -5038,7 +4854,6 @@
               <w:t>mlops</w:t>
             </w:r>
             <w:proofErr w:type="spellEnd"/>
-            <w:proofErr w:type="gramEnd"/>
             <w:r>
               <w:rPr>
                 <w:sz w:val="23"/>
@@ -5067,19 +4882,11 @@
               <w:spacing w:after="0" w:line="259" w:lineRule="auto"/>
               <w:ind w:left="0" w:firstLine="0"/>
             </w:pPr>
-            <w:proofErr w:type="gramStart"/>
-            <w:r>
-              <w:rPr>
-                <w:sz w:val="23"/>
-              </w:rPr>
-              <w:t>documentation</w:t>
-            </w:r>
-            <w:proofErr w:type="gramEnd"/>
-            <w:r>
-              <w:rPr>
-                <w:sz w:val="23"/>
-              </w:rPr>
-              <w:t xml:space="preserve"> </w:t>
+            <w:r>
+              <w:rPr>
+                <w:sz w:val="23"/>
+              </w:rPr>
+              <w:t xml:space="preserve">documentation </w:t>
             </w:r>
           </w:p>
         </w:tc>
@@ -5099,19 +4906,11 @@
               <w:ind w:left="2" w:firstLine="0"/>
               <w:jc w:val="left"/>
             </w:pPr>
-            <w:proofErr w:type="gramStart"/>
-            <w:r>
-              <w:rPr>
-                <w:sz w:val="23"/>
-              </w:rPr>
-              <w:t>data</w:t>
-            </w:r>
-            <w:proofErr w:type="gramEnd"/>
-            <w:r>
-              <w:rPr>
-                <w:sz w:val="23"/>
-              </w:rPr>
-              <w:t xml:space="preserve"> </w:t>
+            <w:r>
+              <w:rPr>
+                <w:sz w:val="23"/>
+              </w:rPr>
+              <w:t xml:space="preserve">data </w:t>
             </w:r>
           </w:p>
         </w:tc>
@@ -5137,7 +4936,6 @@
               <w:jc w:val="left"/>
             </w:pPr>
             <w:proofErr w:type="spellStart"/>
-            <w:proofErr w:type="gramStart"/>
             <w:r>
               <w:rPr>
                 <w:sz w:val="23"/>
@@ -5145,7 +4943,6 @@
               <w:t>shared</w:t>
             </w:r>
             <w:proofErr w:type="spellEnd"/>
-            <w:proofErr w:type="gramEnd"/>
             <w:r>
               <w:rPr>
                 <w:sz w:val="23"/>
@@ -5170,19 +4967,11 @@
               <w:ind w:left="3" w:firstLine="0"/>
               <w:jc w:val="left"/>
             </w:pPr>
-            <w:proofErr w:type="gramStart"/>
-            <w:r>
-              <w:rPr>
-                <w:sz w:val="23"/>
-              </w:rPr>
-              <w:t>data</w:t>
-            </w:r>
-            <w:proofErr w:type="gramEnd"/>
-            <w:r>
-              <w:rPr>
-                <w:sz w:val="23"/>
-              </w:rPr>
-              <w:t xml:space="preserve"> </w:t>
+            <w:r>
+              <w:rPr>
+                <w:sz w:val="23"/>
+              </w:rPr>
+              <w:t xml:space="preserve">data </w:t>
             </w:r>
           </w:p>
         </w:tc>
@@ -5359,7 +5148,6 @@
               <w:jc w:val="left"/>
             </w:pPr>
             <w:proofErr w:type="spellStart"/>
-            <w:proofErr w:type="gramStart"/>
             <w:r>
               <w:rPr>
                 <w:sz w:val="23"/>
@@ -5367,7 +5155,6 @@
               <w:t>datasets</w:t>
             </w:r>
             <w:proofErr w:type="spellEnd"/>
-            <w:proofErr w:type="gramEnd"/>
             <w:r>
               <w:rPr>
                 <w:sz w:val="23"/>
@@ -5393,7 +5180,6 @@
               <w:jc w:val="left"/>
             </w:pPr>
             <w:proofErr w:type="spellStart"/>
-            <w:proofErr w:type="gramStart"/>
             <w:r>
               <w:rPr>
                 <w:sz w:val="23"/>
@@ -5401,7 +5187,6 @@
               <w:t>rwx</w:t>
             </w:r>
             <w:proofErr w:type="spellEnd"/>
-            <w:proofErr w:type="gramEnd"/>
             <w:r>
               <w:rPr>
                 <w:sz w:val="23"/>
@@ -5427,7 +5212,6 @@
               <w:jc w:val="left"/>
             </w:pPr>
             <w:proofErr w:type="spellStart"/>
-            <w:proofErr w:type="gramStart"/>
             <w:r>
               <w:rPr>
                 <w:sz w:val="23"/>
@@ -5435,7 +5219,6 @@
               <w:t>rwx</w:t>
             </w:r>
             <w:proofErr w:type="spellEnd"/>
-            <w:proofErr w:type="gramEnd"/>
             <w:r>
               <w:rPr>
                 <w:sz w:val="23"/>
@@ -5490,7 +5273,6 @@
               <w:jc w:val="left"/>
             </w:pPr>
             <w:proofErr w:type="spellStart"/>
-            <w:proofErr w:type="gramStart"/>
             <w:r>
               <w:rPr>
                 <w:sz w:val="23"/>
@@ -5498,7 +5280,6 @@
               <w:t>models</w:t>
             </w:r>
             <w:proofErr w:type="spellEnd"/>
-            <w:proofErr w:type="gramEnd"/>
             <w:r>
               <w:rPr>
                 <w:sz w:val="23"/>
@@ -5524,7 +5305,6 @@
               <w:jc w:val="left"/>
             </w:pPr>
             <w:proofErr w:type="spellStart"/>
-            <w:proofErr w:type="gramStart"/>
             <w:r>
               <w:rPr>
                 <w:sz w:val="23"/>
@@ -5532,7 +5312,6 @@
               <w:t>rwx</w:t>
             </w:r>
             <w:proofErr w:type="spellEnd"/>
-            <w:proofErr w:type="gramEnd"/>
             <w:r>
               <w:rPr>
                 <w:sz w:val="23"/>
@@ -5557,19 +5336,11 @@
               <w:ind w:left="1" w:firstLine="0"/>
               <w:jc w:val="left"/>
             </w:pPr>
-            <w:proofErr w:type="gramStart"/>
-            <w:r>
-              <w:rPr>
-                <w:sz w:val="23"/>
-              </w:rPr>
-              <w:t>r</w:t>
-            </w:r>
-            <w:proofErr w:type="gramEnd"/>
-            <w:r>
-              <w:rPr>
-                <w:sz w:val="23"/>
-              </w:rPr>
-              <w:t xml:space="preserve">-x </w:t>
+            <w:r>
+              <w:rPr>
+                <w:sz w:val="23"/>
+              </w:rPr>
+              <w:t xml:space="preserve">r-x </w:t>
             </w:r>
           </w:p>
         </w:tc>
@@ -5618,19 +5389,11 @@
               <w:ind w:left="0" w:firstLine="0"/>
               <w:jc w:val="left"/>
             </w:pPr>
-            <w:proofErr w:type="gramStart"/>
-            <w:r>
-              <w:rPr>
-                <w:sz w:val="23"/>
-              </w:rPr>
-              <w:t>api</w:t>
-            </w:r>
-            <w:proofErr w:type="gramEnd"/>
-            <w:r>
-              <w:rPr>
-                <w:sz w:val="23"/>
-              </w:rPr>
-              <w:t xml:space="preserve"> </w:t>
+            <w:r>
+              <w:rPr>
+                <w:sz w:val="23"/>
+              </w:rPr>
+              <w:t xml:space="preserve">api </w:t>
             </w:r>
           </w:p>
         </w:tc>
@@ -5651,7 +5414,6 @@
               <w:jc w:val="left"/>
             </w:pPr>
             <w:proofErr w:type="spellStart"/>
-            <w:proofErr w:type="gramStart"/>
             <w:r>
               <w:rPr>
                 <w:sz w:val="23"/>
@@ -5659,7 +5421,6 @@
               <w:t>rwx</w:t>
             </w:r>
             <w:proofErr w:type="spellEnd"/>
-            <w:proofErr w:type="gramEnd"/>
             <w:r>
               <w:rPr>
                 <w:sz w:val="23"/>
@@ -5685,7 +5446,6 @@
               <w:jc w:val="left"/>
             </w:pPr>
             <w:proofErr w:type="spellStart"/>
-            <w:proofErr w:type="gramStart"/>
             <w:r>
               <w:rPr>
                 <w:sz w:val="23"/>
@@ -5693,7 +5453,6 @@
               <w:t>rwx</w:t>
             </w:r>
             <w:proofErr w:type="spellEnd"/>
-            <w:proofErr w:type="gramEnd"/>
             <w:r>
               <w:rPr>
                 <w:sz w:val="23"/>
@@ -5747,19 +5506,11 @@
               <w:ind w:left="0" w:firstLine="0"/>
               <w:jc w:val="left"/>
             </w:pPr>
-            <w:proofErr w:type="gramStart"/>
-            <w:r>
-              <w:rPr>
-                <w:sz w:val="23"/>
-              </w:rPr>
-              <w:t>logs</w:t>
-            </w:r>
-            <w:proofErr w:type="gramEnd"/>
-            <w:r>
-              <w:rPr>
-                <w:sz w:val="23"/>
-              </w:rPr>
-              <w:t xml:space="preserve"> </w:t>
+            <w:r>
+              <w:rPr>
+                <w:sz w:val="23"/>
+              </w:rPr>
+              <w:t xml:space="preserve">logs </w:t>
             </w:r>
           </w:p>
         </w:tc>
@@ -5780,7 +5531,6 @@
               <w:jc w:val="left"/>
             </w:pPr>
             <w:proofErr w:type="spellStart"/>
-            <w:proofErr w:type="gramStart"/>
             <w:r>
               <w:rPr>
                 <w:sz w:val="23"/>
@@ -5788,7 +5538,6 @@
               <w:t>rwx</w:t>
             </w:r>
             <w:proofErr w:type="spellEnd"/>
-            <w:proofErr w:type="gramEnd"/>
             <w:r>
               <w:rPr>
                 <w:sz w:val="23"/>
@@ -5813,19 +5562,11 @@
               <w:ind w:left="2" w:firstLine="0"/>
               <w:jc w:val="left"/>
             </w:pPr>
-            <w:proofErr w:type="gramStart"/>
-            <w:r>
-              <w:rPr>
-                <w:sz w:val="23"/>
-              </w:rPr>
-              <w:t>r</w:t>
-            </w:r>
-            <w:proofErr w:type="gramEnd"/>
-            <w:r>
-              <w:rPr>
-                <w:sz w:val="23"/>
-              </w:rPr>
-              <w:t xml:space="preserve">-- </w:t>
+            <w:r>
+              <w:rPr>
+                <w:sz w:val="23"/>
+              </w:rPr>
+              <w:t xml:space="preserve">r-- </w:t>
             </w:r>
           </w:p>
         </w:tc>
@@ -5874,19 +5615,11 @@
               <w:ind w:left="0" w:firstLine="0"/>
               <w:jc w:val="left"/>
             </w:pPr>
-            <w:proofErr w:type="gramStart"/>
-            <w:r>
-              <w:rPr>
-                <w:sz w:val="23"/>
-              </w:rPr>
-              <w:t>backup</w:t>
-            </w:r>
-            <w:proofErr w:type="gramEnd"/>
-            <w:r>
-              <w:rPr>
-                <w:sz w:val="23"/>
-              </w:rPr>
-              <w:t xml:space="preserve"> </w:t>
+            <w:r>
+              <w:rPr>
+                <w:sz w:val="23"/>
+              </w:rPr>
+              <w:t xml:space="preserve">backup </w:t>
             </w:r>
           </w:p>
         </w:tc>
@@ -5907,7 +5640,6 @@
               <w:jc w:val="left"/>
             </w:pPr>
             <w:proofErr w:type="spellStart"/>
-            <w:proofErr w:type="gramStart"/>
             <w:r>
               <w:rPr>
                 <w:sz w:val="23"/>
@@ -5915,7 +5647,6 @@
               <w:t>rwx</w:t>
             </w:r>
             <w:proofErr w:type="spellEnd"/>
-            <w:proofErr w:type="gramEnd"/>
             <w:r>
               <w:rPr>
                 <w:sz w:val="23"/>
@@ -5992,19 +5723,11 @@
               <w:spacing w:after="0" w:line="259" w:lineRule="auto"/>
               <w:ind w:left="0" w:firstLine="0"/>
             </w:pPr>
-            <w:proofErr w:type="gramStart"/>
-            <w:r>
-              <w:rPr>
-                <w:sz w:val="23"/>
-              </w:rPr>
-              <w:t>documentation</w:t>
-            </w:r>
-            <w:proofErr w:type="gramEnd"/>
-            <w:r>
-              <w:rPr>
-                <w:sz w:val="23"/>
-              </w:rPr>
-              <w:t xml:space="preserve"> </w:t>
+            <w:r>
+              <w:rPr>
+                <w:sz w:val="23"/>
+              </w:rPr>
+              <w:t xml:space="preserve">documentation </w:t>
             </w:r>
           </w:p>
         </w:tc>
@@ -6025,7 +5748,6 @@
               <w:jc w:val="left"/>
             </w:pPr>
             <w:proofErr w:type="spellStart"/>
-            <w:proofErr w:type="gramStart"/>
             <w:r>
               <w:rPr>
                 <w:sz w:val="23"/>
@@ -6033,7 +5755,6 @@
               <w:t>rwx</w:t>
             </w:r>
             <w:proofErr w:type="spellEnd"/>
-            <w:proofErr w:type="gramEnd"/>
             <w:r>
               <w:rPr>
                 <w:sz w:val="23"/>
@@ -6058,19 +5779,11 @@
               <w:ind w:left="2" w:firstLine="0"/>
               <w:jc w:val="left"/>
             </w:pPr>
-            <w:proofErr w:type="gramStart"/>
-            <w:r>
-              <w:rPr>
-                <w:sz w:val="23"/>
-              </w:rPr>
-              <w:t>r</w:t>
-            </w:r>
-            <w:proofErr w:type="gramEnd"/>
-            <w:r>
-              <w:rPr>
-                <w:sz w:val="23"/>
-              </w:rPr>
-              <w:t xml:space="preserve">-- </w:t>
+            <w:r>
+              <w:rPr>
+                <w:sz w:val="23"/>
+              </w:rPr>
+              <w:t xml:space="preserve">r-- </w:t>
             </w:r>
           </w:p>
         </w:tc>
@@ -6090,19 +5803,11 @@
               <w:ind w:left="3" w:firstLine="0"/>
               <w:jc w:val="left"/>
             </w:pPr>
-            <w:proofErr w:type="gramStart"/>
-            <w:r>
-              <w:rPr>
-                <w:sz w:val="23"/>
-              </w:rPr>
-              <w:t>r</w:t>
-            </w:r>
-            <w:proofErr w:type="gramEnd"/>
-            <w:r>
-              <w:rPr>
-                <w:sz w:val="23"/>
-              </w:rPr>
-              <w:t xml:space="preserve">-- </w:t>
+            <w:r>
+              <w:rPr>
+                <w:sz w:val="23"/>
+              </w:rPr>
+              <w:t xml:space="preserve">r-- </w:t>
             </w:r>
           </w:p>
         </w:tc>
@@ -6128,7 +5833,6 @@
               <w:jc w:val="left"/>
             </w:pPr>
             <w:proofErr w:type="spellStart"/>
-            <w:proofErr w:type="gramStart"/>
             <w:r>
               <w:rPr>
                 <w:sz w:val="23"/>
@@ -6136,7 +5840,6 @@
               <w:t>shared</w:t>
             </w:r>
             <w:proofErr w:type="spellEnd"/>
-            <w:proofErr w:type="gramEnd"/>
             <w:r>
               <w:rPr>
                 <w:sz w:val="23"/>
@@ -6162,7 +5865,6 @@
               <w:jc w:val="left"/>
             </w:pPr>
             <w:proofErr w:type="spellStart"/>
-            <w:proofErr w:type="gramStart"/>
             <w:r>
               <w:rPr>
                 <w:sz w:val="23"/>
@@ -6170,7 +5872,6 @@
               <w:t>rwx</w:t>
             </w:r>
             <w:proofErr w:type="spellEnd"/>
-            <w:proofErr w:type="gramEnd"/>
             <w:r>
               <w:rPr>
                 <w:sz w:val="23"/>
@@ -6196,7 +5897,6 @@
               <w:jc w:val="left"/>
             </w:pPr>
             <w:proofErr w:type="spellStart"/>
-            <w:proofErr w:type="gramStart"/>
             <w:r>
               <w:rPr>
                 <w:sz w:val="23"/>
@@ -6204,7 +5904,6 @@
               <w:t>rwx</w:t>
             </w:r>
             <w:proofErr w:type="spellEnd"/>
-            <w:proofErr w:type="gramEnd"/>
             <w:r>
               <w:rPr>
                 <w:sz w:val="23"/>
@@ -6229,19 +5928,11 @@
               <w:ind w:left="3" w:firstLine="0"/>
               <w:jc w:val="left"/>
             </w:pPr>
-            <w:proofErr w:type="gramStart"/>
-            <w:r>
-              <w:rPr>
-                <w:sz w:val="23"/>
-              </w:rPr>
-              <w:t>r</w:t>
-            </w:r>
-            <w:proofErr w:type="gramEnd"/>
-            <w:r>
-              <w:rPr>
-                <w:sz w:val="23"/>
-              </w:rPr>
-              <w:t xml:space="preserve">-x </w:t>
+            <w:r>
+              <w:rPr>
+                <w:sz w:val="23"/>
+              </w:rPr>
+              <w:t xml:space="preserve">r-x </w:t>
             </w:r>
           </w:p>
         </w:tc>
@@ -6487,13 +6178,8 @@
         <w:spacing w:after="12" w:line="255" w:lineRule="auto"/>
         <w:ind w:firstLine="338"/>
       </w:pPr>
-      <w:proofErr w:type="gramStart"/>
-      <w:r>
-        <w:t>lire</w:t>
-      </w:r>
-      <w:proofErr w:type="gramEnd"/>
-      <w:r>
-        <w:t xml:space="preserve"> </w:t>
+      <w:r>
+        <w:t xml:space="preserve">lire </w:t>
       </w:r>
       <w:proofErr w:type="spellStart"/>
       <w:r>
@@ -6711,15 +6397,7 @@
       </w:r>
       <w:proofErr w:type="spellEnd"/>
       <w:r>
-        <w:t xml:space="preserve"> peut lire car document est un fichier que </w:t>
-      </w:r>
-      <w:proofErr w:type="gramStart"/>
-      <w:r>
-        <w:t>tous le mode</w:t>
-      </w:r>
-      <w:proofErr w:type="gramEnd"/>
-      <w:r>
-        <w:t xml:space="preserve"> peut lire </w:t>
+        <w:t xml:space="preserve"> peut lire car document est un fichier que tous le mode peut lire </w:t>
       </w:r>
       <w:r>
         <w:t xml:space="preserve"> </w:t>
@@ -7027,15 +6705,7 @@
       </w:r>
       <w:proofErr w:type="spellEnd"/>
       <w:r>
-        <w:t xml:space="preserve"> </w:t>
-      </w:r>
-      <w:proofErr w:type="gramStart"/>
-      <w:r>
-        <w:t>toutes les droit</w:t>
-      </w:r>
-      <w:proofErr w:type="gramEnd"/>
-      <w:r>
-        <w:t xml:space="preserve"> sur dataset</w:t>
+        <w:t xml:space="preserve"> toutes les droit sur dataset</w:t>
       </w:r>
     </w:p>
     <w:p>
@@ -7365,19 +7035,11 @@
           <w:color w:val="auto"/>
         </w:rPr>
       </w:pPr>
-      <w:proofErr w:type="gramStart"/>
       <w:r>
         <w:rPr>
           <w:color w:val="auto"/>
         </w:rPr>
-        <w:t>git</w:t>
-      </w:r>
-      <w:proofErr w:type="gramEnd"/>
-      <w:r>
-        <w:rPr>
-          <w:color w:val="auto"/>
-        </w:rPr>
-        <w:t xml:space="preserve"> --version </w:t>
+        <w:t xml:space="preserve">git --version </w:t>
       </w:r>
       <w:proofErr w:type="spellStart"/>
       <w:r>
@@ -7585,13 +7247,8 @@
         <w:spacing w:after="224"/>
         <w:ind w:left="661" w:hanging="338"/>
       </w:pPr>
-      <w:proofErr w:type="gramStart"/>
-      <w:r>
-        <w:t>téléchargez</w:t>
-      </w:r>
-      <w:proofErr w:type="gramEnd"/>
-      <w:r>
-        <w:t xml:space="preserve"> le dataset :  </w:t>
+      <w:r>
+        <w:t xml:space="preserve">téléchargez le dataset :  </w:t>
       </w:r>
     </w:p>
     <w:p>
@@ -7864,6 +7521,43 @@
         <w:ind w:left="-2" w:firstLine="569"/>
         <w:jc w:val="left"/>
       </w:pPr>
+      <w:r>
+        <w:drawing>
+          <wp:inline distT="0" distB="0" distL="0" distR="0" wp14:anchorId="79059103" wp14:editId="0B8127D8">
+            <wp:extent cx="5328285" cy="525145"/>
+            <wp:effectExtent l="0" t="0" r="5715" b="8255"/>
+            <wp:docPr id="60" name="Image 60"/>
+            <wp:cNvGraphicFramePr>
+              <a:graphicFrameLocks xmlns:a="http://schemas.openxmlformats.org/drawingml/2006/main" noChangeAspect="1"/>
+            </wp:cNvGraphicFramePr>
+            <a:graphic xmlns:a="http://schemas.openxmlformats.org/drawingml/2006/main">
+              <a:graphicData uri="http://schemas.openxmlformats.org/drawingml/2006/picture">
+                <pic:pic xmlns:pic="http://schemas.openxmlformats.org/drawingml/2006/picture">
+                  <pic:nvPicPr>
+                    <pic:cNvPr id="1" name=""/>
+                    <pic:cNvPicPr/>
+                  </pic:nvPicPr>
+                  <pic:blipFill>
+                    <a:blip r:embed="rId74"/>
+                    <a:stretch>
+                      <a:fillRect/>
+                    </a:stretch>
+                  </pic:blipFill>
+                  <pic:spPr>
+                    <a:xfrm>
+                      <a:off x="0" y="0"/>
+                      <a:ext cx="5328285" cy="525145"/>
+                    </a:xfrm>
+                    <a:prstGeom prst="rect">
+                      <a:avLst/>
+                    </a:prstGeom>
+                  </pic:spPr>
+                </pic:pic>
+              </a:graphicData>
+            </a:graphic>
+          </wp:inline>
+        </w:drawing>
+      </w:r>
     </w:p>
     <w:p>
       <w:pPr>
@@ -7882,6 +7576,48 @@
     </w:p>
     <w:p>
       <w:pPr>
+        <w:ind w:left="661" w:firstLine="0"/>
+      </w:pPr>
+      <w:r>
+        <w:drawing>
+          <wp:inline distT="0" distB="0" distL="0" distR="0" wp14:anchorId="1CC05E26" wp14:editId="7ACC5716">
+            <wp:extent cx="5328285" cy="1244600"/>
+            <wp:effectExtent l="0" t="0" r="5715" b="0"/>
+            <wp:docPr id="61" name="Image 61"/>
+            <wp:cNvGraphicFramePr>
+              <a:graphicFrameLocks xmlns:a="http://schemas.openxmlformats.org/drawingml/2006/main" noChangeAspect="1"/>
+            </wp:cNvGraphicFramePr>
+            <a:graphic xmlns:a="http://schemas.openxmlformats.org/drawingml/2006/main">
+              <a:graphicData uri="http://schemas.openxmlformats.org/drawingml/2006/picture">
+                <pic:pic xmlns:pic="http://schemas.openxmlformats.org/drawingml/2006/picture">
+                  <pic:nvPicPr>
+                    <pic:cNvPr id="1" name=""/>
+                    <pic:cNvPicPr/>
+                  </pic:nvPicPr>
+                  <pic:blipFill>
+                    <a:blip r:embed="rId75"/>
+                    <a:stretch>
+                      <a:fillRect/>
+                    </a:stretch>
+                  </pic:blipFill>
+                  <pic:spPr>
+                    <a:xfrm>
+                      <a:off x="0" y="0"/>
+                      <a:ext cx="5328285" cy="1244600"/>
+                    </a:xfrm>
+                    <a:prstGeom prst="rect">
+                      <a:avLst/>
+                    </a:prstGeom>
+                  </pic:spPr>
+                </pic:pic>
+              </a:graphicData>
+            </a:graphic>
+          </wp:inline>
+        </w:drawing>
+      </w:r>
+    </w:p>
+    <w:p>
+      <w:pPr>
         <w:numPr>
           <w:ilvl w:val="0"/>
           <w:numId w:val="8"/>
@@ -7897,19 +7633,125 @@
     </w:p>
     <w:p>
       <w:pPr>
+        <w:ind w:left="661" w:firstLine="0"/>
+      </w:pPr>
+      <w:r>
+        <w:drawing>
+          <wp:inline distT="0" distB="0" distL="0" distR="0" wp14:anchorId="70F10396" wp14:editId="1C92DB6B">
+            <wp:extent cx="5328285" cy="384810"/>
+            <wp:effectExtent l="0" t="0" r="5715" b="0"/>
+            <wp:docPr id="62" name="Image 62"/>
+            <wp:cNvGraphicFramePr>
+              <a:graphicFrameLocks xmlns:a="http://schemas.openxmlformats.org/drawingml/2006/main" noChangeAspect="1"/>
+            </wp:cNvGraphicFramePr>
+            <a:graphic xmlns:a="http://schemas.openxmlformats.org/drawingml/2006/main">
+              <a:graphicData uri="http://schemas.openxmlformats.org/drawingml/2006/picture">
+                <pic:pic xmlns:pic="http://schemas.openxmlformats.org/drawingml/2006/picture">
+                  <pic:nvPicPr>
+                    <pic:cNvPr id="1" name=""/>
+                    <pic:cNvPicPr/>
+                  </pic:nvPicPr>
+                  <pic:blipFill>
+                    <a:blip r:embed="rId76"/>
+                    <a:stretch>
+                      <a:fillRect/>
+                    </a:stretch>
+                  </pic:blipFill>
+                  <pic:spPr>
+                    <a:xfrm>
+                      <a:off x="0" y="0"/>
+                      <a:ext cx="5328285" cy="384810"/>
+                    </a:xfrm>
+                    <a:prstGeom prst="rect">
+                      <a:avLst/>
+                    </a:prstGeom>
+                  </pic:spPr>
+                </pic:pic>
+              </a:graphicData>
+            </a:graphic>
+          </wp:inline>
+        </w:drawing>
+      </w:r>
+    </w:p>
+    <w:p>
+      <w:pPr>
+        <w:ind w:left="661" w:firstLine="0"/>
+      </w:pPr>
+      <w:r>
+        <w:t>J’ai laisse le programme s’</w:t>
+      </w:r>
+      <w:proofErr w:type="spellStart"/>
+      <w:r>
+        <w:t>executer</w:t>
+      </w:r>
+      <w:proofErr w:type="spellEnd"/>
+      <w:r>
+        <w:t xml:space="preserve"> sur un terminale et sur le </w:t>
+      </w:r>
+      <w:proofErr w:type="spellStart"/>
+      <w:r>
+        <w:t>deuxieme</w:t>
+      </w:r>
+      <w:proofErr w:type="spellEnd"/>
+      <w:r>
+        <w:t xml:space="preserve"> terminal je traque le PID</w:t>
+      </w:r>
+    </w:p>
+    <w:p>
+      <w:pPr>
         <w:numPr>
           <w:ilvl w:val="0"/>
           <w:numId w:val="8"/>
         </w:numPr>
         <w:ind w:left="661" w:hanging="338"/>
       </w:pPr>
-      <w:proofErr w:type="gramStart"/>
-      <w:r>
-        <w:t>consultez</w:t>
-      </w:r>
-      <w:proofErr w:type="gramEnd"/>
+      <w:r>
+        <w:t>Consultez</w:t>
+      </w:r>
       <w:r>
         <w:t xml:space="preserve"> son utilisation CPU  </w:t>
+      </w:r>
+    </w:p>
+    <w:p>
+      <w:pPr>
+        <w:ind w:left="661" w:firstLine="0"/>
+      </w:pPr>
+      <w:r>
+        <w:drawing>
+          <wp:inline distT="0" distB="0" distL="0" distR="0" wp14:anchorId="6E0E359B" wp14:editId="34DC05FD">
+            <wp:extent cx="5328285" cy="786130"/>
+            <wp:effectExtent l="0" t="0" r="5715" b="0"/>
+            <wp:docPr id="63" name="Image 63"/>
+            <wp:cNvGraphicFramePr>
+              <a:graphicFrameLocks xmlns:a="http://schemas.openxmlformats.org/drawingml/2006/main" noChangeAspect="1"/>
+            </wp:cNvGraphicFramePr>
+            <a:graphic xmlns:a="http://schemas.openxmlformats.org/drawingml/2006/main">
+              <a:graphicData uri="http://schemas.openxmlformats.org/drawingml/2006/picture">
+                <pic:pic xmlns:pic="http://schemas.openxmlformats.org/drawingml/2006/picture">
+                  <pic:nvPicPr>
+                    <pic:cNvPr id="1" name=""/>
+                    <pic:cNvPicPr/>
+                  </pic:nvPicPr>
+                  <pic:blipFill>
+                    <a:blip r:embed="rId77"/>
+                    <a:stretch>
+                      <a:fillRect/>
+                    </a:stretch>
+                  </pic:blipFill>
+                  <pic:spPr>
+                    <a:xfrm>
+                      <a:off x="0" y="0"/>
+                      <a:ext cx="5328285" cy="786130"/>
+                    </a:xfrm>
+                    <a:prstGeom prst="rect">
+                      <a:avLst/>
+                    </a:prstGeom>
+                  </pic:spPr>
+                </pic:pic>
+              </a:graphicData>
+            </a:graphic>
+          </wp:inline>
+        </w:drawing>
       </w:r>
     </w:p>
     <w:p>
@@ -7920,13 +7762,95 @@
         </w:numPr>
         <w:ind w:left="661" w:hanging="338"/>
       </w:pPr>
-      <w:proofErr w:type="gramStart"/>
-      <w:r>
-        <w:t>arrêtez</w:t>
-      </w:r>
-      <w:proofErr w:type="gramEnd"/>
+      <w:r>
+        <w:t>Arrêtez</w:t>
+      </w:r>
       <w:r>
         <w:t xml:space="preserve"> le processus  </w:t>
+      </w:r>
+    </w:p>
+    <w:p>
+      <w:pPr>
+        <w:ind w:left="661" w:firstLine="0"/>
+      </w:pPr>
+      <w:r>
+        <w:drawing>
+          <wp:inline distT="0" distB="0" distL="0" distR="0" wp14:anchorId="0B1D1183" wp14:editId="02B8264E">
+            <wp:extent cx="5328285" cy="269240"/>
+            <wp:effectExtent l="0" t="0" r="5715" b="0"/>
+            <wp:docPr id="448" name="Image 448"/>
+            <wp:cNvGraphicFramePr>
+              <a:graphicFrameLocks xmlns:a="http://schemas.openxmlformats.org/drawingml/2006/main" noChangeAspect="1"/>
+            </wp:cNvGraphicFramePr>
+            <a:graphic xmlns:a="http://schemas.openxmlformats.org/drawingml/2006/main">
+              <a:graphicData uri="http://schemas.openxmlformats.org/drawingml/2006/picture">
+                <pic:pic xmlns:pic="http://schemas.openxmlformats.org/drawingml/2006/picture">
+                  <pic:nvPicPr>
+                    <pic:cNvPr id="1" name=""/>
+                    <pic:cNvPicPr/>
+                  </pic:nvPicPr>
+                  <pic:blipFill>
+                    <a:blip r:embed="rId78"/>
+                    <a:stretch>
+                      <a:fillRect/>
+                    </a:stretch>
+                  </pic:blipFill>
+                  <pic:spPr>
+                    <a:xfrm>
+                      <a:off x="0" y="0"/>
+                      <a:ext cx="5328285" cy="269240"/>
+                    </a:xfrm>
+                    <a:prstGeom prst="rect">
+                      <a:avLst/>
+                    </a:prstGeom>
+                  </pic:spPr>
+                </pic:pic>
+              </a:graphicData>
+            </a:graphic>
+          </wp:inline>
+        </w:drawing>
+      </w:r>
+    </w:p>
+    <w:p>
+      <w:pPr>
+        <w:ind w:left="661" w:firstLine="0"/>
+      </w:pPr>
+      <w:r>
+        <w:drawing>
+          <wp:inline distT="0" distB="0" distL="0" distR="0" wp14:anchorId="73F99B40" wp14:editId="14A4514E">
+            <wp:extent cx="5328285" cy="549910"/>
+            <wp:effectExtent l="0" t="0" r="5715" b="2540"/>
+            <wp:docPr id="449" name="Image 449"/>
+            <wp:cNvGraphicFramePr>
+              <a:graphicFrameLocks xmlns:a="http://schemas.openxmlformats.org/drawingml/2006/main" noChangeAspect="1"/>
+            </wp:cNvGraphicFramePr>
+            <a:graphic xmlns:a="http://schemas.openxmlformats.org/drawingml/2006/main">
+              <a:graphicData uri="http://schemas.openxmlformats.org/drawingml/2006/picture">
+                <pic:pic xmlns:pic="http://schemas.openxmlformats.org/drawingml/2006/picture">
+                  <pic:nvPicPr>
+                    <pic:cNvPr id="1" name=""/>
+                    <pic:cNvPicPr/>
+                  </pic:nvPicPr>
+                  <pic:blipFill>
+                    <a:blip r:embed="rId79"/>
+                    <a:stretch>
+                      <a:fillRect/>
+                    </a:stretch>
+                  </pic:blipFill>
+                  <pic:spPr>
+                    <a:xfrm>
+                      <a:off x="0" y="0"/>
+                      <a:ext cx="5328285" cy="549910"/>
+                    </a:xfrm>
+                    <a:prstGeom prst="rect">
+                      <a:avLst/>
+                    </a:prstGeom>
+                  </pic:spPr>
+                </pic:pic>
+              </a:graphicData>
+            </a:graphic>
+          </wp:inline>
+        </w:drawing>
       </w:r>
     </w:p>
     <w:p>
@@ -7937,13 +7861,53 @@
         </w:numPr>
         <w:ind w:left="661" w:hanging="338"/>
       </w:pPr>
-      <w:proofErr w:type="gramStart"/>
-      <w:r>
-        <w:t>relancez</w:t>
-      </w:r>
-      <w:proofErr w:type="gramEnd"/>
+      <w:r>
+        <w:t>Relancez</w:t>
+      </w:r>
       <w:r>
         <w:t xml:space="preserve"> en arrière-plan  </w:t>
+      </w:r>
+    </w:p>
+    <w:p>
+      <w:pPr>
+        <w:ind w:left="661" w:firstLine="0"/>
+      </w:pPr>
+      <w:r>
+        <w:drawing>
+          <wp:inline distT="0" distB="0" distL="0" distR="0" wp14:anchorId="3DBF612D" wp14:editId="7EE3D675">
+            <wp:extent cx="5328285" cy="186055"/>
+            <wp:effectExtent l="0" t="0" r="5715" b="4445"/>
+            <wp:docPr id="451" name="Image 451"/>
+            <wp:cNvGraphicFramePr>
+              <a:graphicFrameLocks xmlns:a="http://schemas.openxmlformats.org/drawingml/2006/main" noChangeAspect="1"/>
+            </wp:cNvGraphicFramePr>
+            <a:graphic xmlns:a="http://schemas.openxmlformats.org/drawingml/2006/main">
+              <a:graphicData uri="http://schemas.openxmlformats.org/drawingml/2006/picture">
+                <pic:pic xmlns:pic="http://schemas.openxmlformats.org/drawingml/2006/picture">
+                  <pic:nvPicPr>
+                    <pic:cNvPr id="1" name=""/>
+                    <pic:cNvPicPr/>
+                  </pic:nvPicPr>
+                  <pic:blipFill>
+                    <a:blip r:embed="rId80"/>
+                    <a:stretch>
+                      <a:fillRect/>
+                    </a:stretch>
+                  </pic:blipFill>
+                  <pic:spPr>
+                    <a:xfrm>
+                      <a:off x="0" y="0"/>
+                      <a:ext cx="5328285" cy="186055"/>
+                    </a:xfrm>
+                    <a:prstGeom prst="rect">
+                      <a:avLst/>
+                    </a:prstGeom>
+                  </pic:spPr>
+                </pic:pic>
+              </a:graphicData>
+            </a:graphic>
+          </wp:inline>
+        </w:drawing>
       </w:r>
     </w:p>
     <w:p>
@@ -7955,13 +7919,54 @@
         <w:spacing w:after="293"/>
         <w:ind w:left="661" w:hanging="338"/>
       </w:pPr>
-      <w:proofErr w:type="gramStart"/>
-      <w:r>
-        <w:t>remettez</w:t>
-      </w:r>
-      <w:proofErr w:type="gramEnd"/>
+      <w:r>
+        <w:t>Remettez</w:t>
+      </w:r>
       <w:r>
         <w:t xml:space="preserve"> au premier plan </w:t>
+      </w:r>
+    </w:p>
+    <w:p>
+      <w:pPr>
+        <w:spacing w:after="293"/>
+        <w:ind w:left="661" w:firstLine="0"/>
+      </w:pPr>
+      <w:r>
+        <w:drawing>
+          <wp:inline distT="0" distB="0" distL="0" distR="0" wp14:anchorId="508A1CDA" wp14:editId="4B36E076">
+            <wp:extent cx="5328285" cy="733425"/>
+            <wp:effectExtent l="0" t="0" r="5715" b="9525"/>
+            <wp:docPr id="453" name="Image 453"/>
+            <wp:cNvGraphicFramePr>
+              <a:graphicFrameLocks xmlns:a="http://schemas.openxmlformats.org/drawingml/2006/main" noChangeAspect="1"/>
+            </wp:cNvGraphicFramePr>
+            <a:graphic xmlns:a="http://schemas.openxmlformats.org/drawingml/2006/main">
+              <a:graphicData uri="http://schemas.openxmlformats.org/drawingml/2006/picture">
+                <pic:pic xmlns:pic="http://schemas.openxmlformats.org/drawingml/2006/picture">
+                  <pic:nvPicPr>
+                    <pic:cNvPr id="1" name=""/>
+                    <pic:cNvPicPr/>
+                  </pic:nvPicPr>
+                  <pic:blipFill>
+                    <a:blip r:embed="rId81"/>
+                    <a:stretch>
+                      <a:fillRect/>
+                    </a:stretch>
+                  </pic:blipFill>
+                  <pic:spPr>
+                    <a:xfrm>
+                      <a:off x="0" y="0"/>
+                      <a:ext cx="5328285" cy="733425"/>
+                    </a:xfrm>
+                    <a:prstGeom prst="rect">
+                      <a:avLst/>
+                    </a:prstGeom>
+                  </pic:spPr>
+                </pic:pic>
+              </a:graphicData>
+            </a:graphic>
+          </wp:inline>
+        </w:drawing>
       </w:r>
     </w:p>
     <w:p>
@@ -8013,13 +8018,8 @@
         </w:numPr>
         <w:ind w:left="661" w:hanging="338"/>
       </w:pPr>
-      <w:proofErr w:type="gramStart"/>
-      <w:r>
-        <w:t>demander</w:t>
-      </w:r>
-      <w:proofErr w:type="gramEnd"/>
-      <w:r>
-        <w:t xml:space="preserve"> le nom du projet ; </w:t>
+      <w:r>
+        <w:t xml:space="preserve">demander le nom du projet ; </w:t>
       </w:r>
     </w:p>
     <w:p>
@@ -8030,13 +8030,8 @@
         </w:numPr>
         <w:ind w:left="661" w:hanging="338"/>
       </w:pPr>
-      <w:proofErr w:type="gramStart"/>
-      <w:r>
-        <w:t>créer</w:t>
-      </w:r>
-      <w:proofErr w:type="gramEnd"/>
-      <w:r>
-        <w:t xml:space="preserve"> l'arborescence ;  </w:t>
+      <w:r>
+        <w:t xml:space="preserve">créer l'arborescence ;  </w:t>
       </w:r>
     </w:p>
     <w:p>
@@ -8047,13 +8042,8 @@
         </w:numPr>
         <w:ind w:left="661" w:hanging="338"/>
       </w:pPr>
-      <w:proofErr w:type="gramStart"/>
-      <w:r>
-        <w:t>créez</w:t>
-      </w:r>
-      <w:proofErr w:type="gramEnd"/>
-      <w:r>
-        <w:t xml:space="preserve"> un fichier de configuration </w:t>
+      <w:r>
+        <w:t xml:space="preserve">créez un fichier de configuration </w:t>
       </w:r>
     </w:p>
     <w:p>
@@ -8064,13 +8054,8 @@
         </w:numPr>
         <w:ind w:left="661" w:hanging="338"/>
       </w:pPr>
-      <w:proofErr w:type="gramStart"/>
-      <w:r>
-        <w:t>installer</w:t>
-      </w:r>
-      <w:proofErr w:type="gramEnd"/>
-      <w:r>
-        <w:t xml:space="preserve"> les outils </w:t>
+      <w:r>
+        <w:t xml:space="preserve">installer les outils </w:t>
       </w:r>
     </w:p>
     <w:p>
@@ -8081,13 +8066,8 @@
         </w:numPr>
         <w:ind w:left="661" w:hanging="338"/>
       </w:pPr>
-      <w:proofErr w:type="gramStart"/>
-      <w:r>
-        <w:t>télécharger</w:t>
-      </w:r>
-      <w:proofErr w:type="gramEnd"/>
-      <w:r>
-        <w:t xml:space="preserve"> le dataset ;  </w:t>
+      <w:r>
+        <w:t xml:space="preserve">télécharger le dataset ;  </w:t>
       </w:r>
     </w:p>
     <w:p>
@@ -8099,13 +8079,8 @@
         <w:spacing w:after="254"/>
         <w:ind w:left="661" w:hanging="338"/>
       </w:pPr>
-      <w:proofErr w:type="gramStart"/>
-      <w:r>
-        <w:t>compresser</w:t>
-      </w:r>
-      <w:proofErr w:type="gramEnd"/>
-      <w:r>
-        <w:t xml:space="preserve"> le projet ;  </w:t>
+      <w:r>
+        <w:t xml:space="preserve">compresser le projet ;  </w:t>
       </w:r>
       <w:r>
         <w:rPr>
@@ -8392,9 +8367,9 @@
       </w:r>
     </w:p>
     <w:sectPr>
-      <w:footerReference w:type="even" r:id="rId74"/>
-      <w:footerReference w:type="default" r:id="rId75"/>
-      <w:footerReference w:type="first" r:id="rId76"/>
+      <w:footerReference w:type="even" r:id="rId82"/>
+      <w:footerReference w:type="default" r:id="rId83"/>
+      <w:footerReference w:type="first" r:id="rId84"/>
       <w:pgSz w:w="12240" w:h="15840"/>
       <w:pgMar w:top="1351" w:right="1977" w:bottom="1412" w:left="1872" w:header="720" w:footer="679" w:gutter="0"/>
       <w:cols w:space="720"/>

</xml_diff>

<commit_message>
j'ai fini le travaille demander
</commit_message>
<xml_diff>
--- a/Atelier-linux-p1ia-27-juillet-26.docx
+++ b/Atelier-linux-p1ia-27-juillet-26.docx
@@ -26,14 +26,26 @@
         <w:rPr>
           <w:sz w:val="24"/>
           <w:szCs w:val="24"/>
-        </w:rPr>
-      </w:pPr>
+          <w:lang w:val="en-US"/>
+        </w:rPr>
+      </w:pPr>
+      <w:proofErr w:type="gramStart"/>
       <w:r>
         <w:rPr>
           <w:sz w:val="24"/>
           <w:szCs w:val="24"/>
-        </w:rPr>
-        <w:t xml:space="preserve">Email : </w:t>
+          <w:lang w:val="en-US"/>
+        </w:rPr>
+        <w:t>Email :</w:t>
+      </w:r>
+      <w:proofErr w:type="gramEnd"/>
+      <w:r>
+        <w:rPr>
+          <w:sz w:val="24"/>
+          <w:szCs w:val="24"/>
+          <w:lang w:val="en-US"/>
+        </w:rPr>
+        <w:t xml:space="preserve"> </w:t>
       </w:r>
       <w:hyperlink r:id="rId7" w:history="1">
         <w:r>
@@ -41,6 +53,7 @@
             <w:rStyle w:val="Lienhypertexte"/>
             <w:sz w:val="24"/>
             <w:szCs w:val="24"/>
+            <w:lang w:val="en-US"/>
           </w:rPr>
           <w:t>adamasarr7837@gmail.com</w:t>
         </w:r>
@@ -52,6 +65,7 @@
         <w:rPr>
           <w:sz w:val="24"/>
           <w:szCs w:val="24"/>
+          <w:lang w:val="en-US"/>
         </w:rPr>
       </w:pPr>
     </w:p>
@@ -1106,10 +1120,12 @@
         <w:t xml:space="preserve">On peut remarquer que la commande </w:t>
       </w:r>
       <w:proofErr w:type="spellStart"/>
+      <w:proofErr w:type="gramStart"/>
       <w:r>
         <w:t>a</w:t>
       </w:r>
       <w:proofErr w:type="spellEnd"/>
+      <w:proofErr w:type="gramEnd"/>
       <w:r>
         <w:t xml:space="preserve"> passer</w:t>
       </w:r>
@@ -1120,6 +1136,9 @@
         <w:ind w:left="661" w:firstLine="0"/>
       </w:pPr>
       <w:r>
+        <w:rPr>
+          <w:noProof/>
+        </w:rPr>
         <w:drawing>
           <wp:inline distT="0" distB="0" distL="0" distR="0" wp14:anchorId="1CA96985" wp14:editId="2FF881BB">
             <wp:extent cx="5328285" cy="1969770"/>
@@ -1212,6 +1231,9 @@
         <w:ind w:left="661" w:firstLine="0"/>
       </w:pPr>
       <w:r>
+        <w:rPr>
+          <w:noProof/>
+        </w:rPr>
         <w:drawing>
           <wp:inline distT="0" distB="0" distL="0" distR="0" wp14:anchorId="40FD2CC5" wp14:editId="090E0F24">
             <wp:extent cx="5328285" cy="3430905"/>
@@ -1275,6 +1297,9 @@
         <w:ind w:left="661" w:firstLine="0"/>
       </w:pPr>
       <w:r>
+        <w:rPr>
+          <w:noProof/>
+        </w:rPr>
         <w:drawing>
           <wp:inline distT="0" distB="0" distL="0" distR="0" wp14:anchorId="7E0E3C4A" wp14:editId="7758E733">
             <wp:extent cx="5328285" cy="1957070"/>
@@ -1335,6 +1360,9 @@
         <w:ind w:left="661" w:firstLine="0"/>
       </w:pPr>
       <w:r>
+        <w:rPr>
+          <w:noProof/>
+        </w:rPr>
         <w:drawing>
           <wp:inline distT="0" distB="0" distL="0" distR="0" wp14:anchorId="6C06ABA1" wp14:editId="4017FE56">
             <wp:extent cx="5328285" cy="371475"/>
@@ -1395,6 +1423,9 @@
         <w:ind w:left="661" w:firstLine="0"/>
       </w:pPr>
       <w:r>
+        <w:rPr>
+          <w:noProof/>
+        </w:rPr>
         <w:drawing>
           <wp:inline distT="0" distB="0" distL="0" distR="0" wp14:anchorId="7EF31157" wp14:editId="5314F16C">
             <wp:extent cx="5328285" cy="260985"/>
@@ -1449,6 +1480,9 @@
         <w:ind w:left="671"/>
       </w:pPr>
       <w:r>
+        <w:rPr>
+          <w:noProof/>
+        </w:rPr>
         <w:drawing>
           <wp:inline distT="0" distB="0" distL="0" distR="0" wp14:anchorId="3921158C" wp14:editId="7139CDA5">
             <wp:extent cx="5328285" cy="1069975"/>
@@ -1526,6 +1560,9 @@
         <w:ind w:left="661" w:firstLine="0"/>
       </w:pPr>
       <w:r>
+        <w:rPr>
+          <w:noProof/>
+        </w:rPr>
         <w:drawing>
           <wp:inline distT="0" distB="0" distL="0" distR="0" wp14:anchorId="1FBFE7B7" wp14:editId="59097E1C">
             <wp:extent cx="5328285" cy="1898650"/>
@@ -1600,6 +1637,9 @@
         <w:ind w:left="661" w:firstLine="0"/>
       </w:pPr>
       <w:r>
+        <w:rPr>
+          <w:noProof/>
+        </w:rPr>
         <w:drawing>
           <wp:inline distT="0" distB="0" distL="0" distR="0" wp14:anchorId="4543C390" wp14:editId="3646B868">
             <wp:extent cx="5328285" cy="588645"/>
@@ -1654,6 +1694,9 @@
         <w:ind w:left="661" w:firstLine="0"/>
       </w:pPr>
       <w:r>
+        <w:rPr>
+          <w:noProof/>
+        </w:rPr>
         <w:drawing>
           <wp:inline distT="0" distB="0" distL="0" distR="0" wp14:anchorId="35177104" wp14:editId="1A880E4D">
             <wp:extent cx="5317849" cy="190123"/>
@@ -1720,6 +1763,9 @@
         <w:t xml:space="preserve">  </w:t>
       </w:r>
       <w:r>
+        <w:rPr>
+          <w:noProof/>
+        </w:rPr>
         <w:drawing>
           <wp:inline distT="0" distB="0" distL="0" distR="0" wp14:anchorId="32879292" wp14:editId="2F2235DB">
             <wp:extent cx="5328285" cy="2523490"/>
@@ -1836,6 +1882,9 @@
         <w:ind w:left="661" w:firstLine="0"/>
       </w:pPr>
       <w:r>
+        <w:rPr>
+          <w:noProof/>
+        </w:rPr>
         <w:drawing>
           <wp:inline distT="0" distB="0" distL="0" distR="0" wp14:anchorId="44251671" wp14:editId="5B898FEA">
             <wp:extent cx="5328285" cy="2408555"/>
@@ -2549,6 +2598,7 @@
               <w:jc w:val="left"/>
             </w:pPr>
             <w:proofErr w:type="spellStart"/>
+            <w:proofErr w:type="gramStart"/>
             <w:r>
               <w:rPr>
                 <w:sz w:val="23"/>
@@ -2556,6 +2606,7 @@
               <w:t>alice</w:t>
             </w:r>
             <w:proofErr w:type="spellEnd"/>
+            <w:proofErr w:type="gramEnd"/>
             <w:r>
               <w:rPr>
                 <w:sz w:val="23"/>
@@ -2623,11 +2674,19 @@
               <w:ind w:left="0" w:firstLine="0"/>
               <w:jc w:val="left"/>
             </w:pPr>
-            <w:r>
-              <w:rPr>
-                <w:sz w:val="23"/>
-              </w:rPr>
-              <w:t xml:space="preserve">bob </w:t>
+            <w:proofErr w:type="gramStart"/>
+            <w:r>
+              <w:rPr>
+                <w:sz w:val="23"/>
+              </w:rPr>
+              <w:t>bob</w:t>
+            </w:r>
+            <w:proofErr w:type="gramEnd"/>
+            <w:r>
+              <w:rPr>
+                <w:sz w:val="23"/>
+              </w:rPr>
+              <w:t xml:space="preserve"> </w:t>
             </w:r>
           </w:p>
         </w:tc>
@@ -2691,6 +2750,7 @@
               <w:jc w:val="left"/>
             </w:pPr>
             <w:proofErr w:type="spellStart"/>
+            <w:proofErr w:type="gramStart"/>
             <w:r>
               <w:rPr>
                 <w:sz w:val="23"/>
@@ -2698,6 +2758,7 @@
               <w:t>charles</w:t>
             </w:r>
             <w:proofErr w:type="spellEnd"/>
+            <w:proofErr w:type="gramEnd"/>
             <w:r>
               <w:rPr>
                 <w:sz w:val="23"/>
@@ -2750,11 +2811,19 @@
               <w:ind w:left="0" w:firstLine="0"/>
               <w:jc w:val="left"/>
             </w:pPr>
-            <w:r>
-              <w:rPr>
-                <w:sz w:val="23"/>
-              </w:rPr>
-              <w:t xml:space="preserve">diane </w:t>
+            <w:proofErr w:type="gramStart"/>
+            <w:r>
+              <w:rPr>
+                <w:sz w:val="23"/>
+              </w:rPr>
+              <w:t>diane</w:t>
+            </w:r>
+            <w:proofErr w:type="gramEnd"/>
+            <w:r>
+              <w:rPr>
+                <w:sz w:val="23"/>
+              </w:rPr>
+              <w:t xml:space="preserve"> </w:t>
             </w:r>
           </w:p>
         </w:tc>
@@ -2825,6 +2894,7 @@
               <w:jc w:val="left"/>
             </w:pPr>
             <w:proofErr w:type="spellStart"/>
+            <w:proofErr w:type="gramStart"/>
             <w:r>
               <w:rPr>
                 <w:sz w:val="23"/>
@@ -2832,6 +2902,7 @@
               <w:t>eva</w:t>
             </w:r>
             <w:proofErr w:type="spellEnd"/>
+            <w:proofErr w:type="gramEnd"/>
             <w:r>
               <w:rPr>
                 <w:sz w:val="23"/>
@@ -2868,6 +2939,9 @@
     </w:tbl>
     <w:p>
       <w:r>
+        <w:rPr>
+          <w:noProof/>
+        </w:rPr>
         <w:drawing>
           <wp:inline distT="0" distB="0" distL="0" distR="0" wp14:anchorId="0C10C8B3" wp14:editId="1FED720F">
             <wp:extent cx="5328285" cy="436245"/>
@@ -2907,6 +2981,9 @@
     </w:p>
     <w:p>
       <w:r>
+        <w:rPr>
+          <w:noProof/>
+        </w:rPr>
         <w:drawing>
           <wp:inline distT="0" distB="0" distL="0" distR="0" wp14:anchorId="669F338C" wp14:editId="3789BDBB">
             <wp:extent cx="5328285" cy="427990"/>
@@ -2957,8 +3034,13 @@
         </w:numPr>
         <w:ind w:right="1510" w:hanging="336"/>
       </w:pPr>
-      <w:r>
-        <w:t xml:space="preserve">créez un mot de passe ; </w:t>
+      <w:proofErr w:type="gramStart"/>
+      <w:r>
+        <w:t>créez</w:t>
+      </w:r>
+      <w:proofErr w:type="gramEnd"/>
+      <w:r>
+        <w:t xml:space="preserve"> un mot de passe ; </w:t>
       </w:r>
     </w:p>
     <w:p>
@@ -2966,6 +3048,9 @@
         <w:ind w:left="659" w:right="1510" w:firstLine="0"/>
       </w:pPr>
       <w:r>
+        <w:rPr>
+          <w:noProof/>
+        </w:rPr>
         <w:drawing>
           <wp:inline distT="0" distB="0" distL="0" distR="0" wp14:anchorId="1F1C2398" wp14:editId="0E70696D">
             <wp:extent cx="5328285" cy="428625"/>
@@ -3008,6 +3093,9 @@
         <w:ind w:left="709" w:right="1510" w:firstLine="0"/>
       </w:pPr>
       <w:r>
+        <w:rPr>
+          <w:noProof/>
+        </w:rPr>
         <w:drawing>
           <wp:inline distT="0" distB="0" distL="0" distR="0" wp14:anchorId="5144BB3F" wp14:editId="040B7C7A">
             <wp:extent cx="5328285" cy="1593215"/>
@@ -3070,6 +3158,9 @@
         <w:ind w:left="659" w:right="1510" w:firstLine="0"/>
       </w:pPr>
       <w:r>
+        <w:rPr>
+          <w:noProof/>
+        </w:rPr>
         <w:drawing>
           <wp:inline distT="0" distB="0" distL="0" distR="0" wp14:anchorId="2D94D0A4" wp14:editId="3621649C">
             <wp:extent cx="5328285" cy="706120"/>
@@ -3132,6 +3223,9 @@
         <w:ind w:left="659" w:right="1510" w:firstLine="0"/>
       </w:pPr>
       <w:r>
+        <w:rPr>
+          <w:noProof/>
+        </w:rPr>
         <w:drawing>
           <wp:inline distT="0" distB="0" distL="0" distR="0" wp14:anchorId="0E3F25E0" wp14:editId="2C6129D6">
             <wp:extent cx="5328285" cy="751205"/>
@@ -3275,11 +3369,19 @@
               <w:ind w:left="1" w:firstLine="0"/>
               <w:jc w:val="left"/>
             </w:pPr>
-            <w:r>
-              <w:rPr>
-                <w:sz w:val="23"/>
-              </w:rPr>
-              <w:t xml:space="preserve">data </w:t>
+            <w:proofErr w:type="gramStart"/>
+            <w:r>
+              <w:rPr>
+                <w:sz w:val="23"/>
+              </w:rPr>
+              <w:t>data</w:t>
+            </w:r>
+            <w:proofErr w:type="gramEnd"/>
+            <w:r>
+              <w:rPr>
+                <w:sz w:val="23"/>
+              </w:rPr>
+              <w:t xml:space="preserve"> </w:t>
             </w:r>
           </w:p>
         </w:tc>
@@ -3328,6 +3430,7 @@
               <w:ind w:left="1" w:firstLine="0"/>
             </w:pPr>
             <w:proofErr w:type="spellStart"/>
+            <w:proofErr w:type="gramStart"/>
             <w:r>
               <w:rPr>
                 <w:sz w:val="23"/>
@@ -3335,6 +3438,7 @@
               <w:t>models</w:t>
             </w:r>
             <w:proofErr w:type="spellEnd"/>
+            <w:proofErr w:type="gramEnd"/>
             <w:r>
               <w:rPr>
                 <w:sz w:val="23"/>
@@ -3388,11 +3492,19 @@
               <w:ind w:left="1" w:firstLine="0"/>
               <w:jc w:val="left"/>
             </w:pPr>
-            <w:r>
-              <w:rPr>
-                <w:sz w:val="23"/>
-              </w:rPr>
-              <w:t xml:space="preserve">api </w:t>
+            <w:proofErr w:type="gramStart"/>
+            <w:r>
+              <w:rPr>
+                <w:sz w:val="23"/>
+              </w:rPr>
+              <w:t>api</w:t>
+            </w:r>
+            <w:proofErr w:type="gramEnd"/>
+            <w:r>
+              <w:rPr>
+                <w:sz w:val="23"/>
+              </w:rPr>
+              <w:t xml:space="preserve"> </w:t>
             </w:r>
           </w:p>
         </w:tc>
@@ -3441,6 +3553,7 @@
               <w:jc w:val="left"/>
             </w:pPr>
             <w:proofErr w:type="spellStart"/>
+            <w:proofErr w:type="gramStart"/>
             <w:r>
               <w:rPr>
                 <w:sz w:val="23"/>
@@ -3448,6 +3561,7 @@
               <w:t>mlops</w:t>
             </w:r>
             <w:proofErr w:type="spellEnd"/>
+            <w:proofErr w:type="gramEnd"/>
             <w:r>
               <w:rPr>
                 <w:sz w:val="23"/>
@@ -3502,6 +3616,7 @@
               <w:jc w:val="left"/>
             </w:pPr>
             <w:proofErr w:type="spellStart"/>
+            <w:proofErr w:type="gramStart"/>
             <w:r>
               <w:rPr>
                 <w:sz w:val="23"/>
@@ -3509,6 +3624,7 @@
               <w:t>interns</w:t>
             </w:r>
             <w:proofErr w:type="spellEnd"/>
+            <w:proofErr w:type="gramEnd"/>
             <w:r>
               <w:rPr>
                 <w:sz w:val="23"/>
@@ -3549,6 +3665,9 @@
         <w:jc w:val="left"/>
       </w:pPr>
       <w:r>
+        <w:rPr>
+          <w:noProof/>
+        </w:rPr>
         <w:drawing>
           <wp:inline distT="0" distB="0" distL="0" distR="0" wp14:anchorId="00304002" wp14:editId="7901980A">
             <wp:extent cx="5328285" cy="383540"/>
@@ -3616,6 +3735,9 @@
         <w:jc w:val="left"/>
       </w:pPr>
       <w:r>
+        <w:rPr>
+          <w:noProof/>
+        </w:rPr>
         <w:drawing>
           <wp:inline distT="0" distB="0" distL="0" distR="0" wp14:anchorId="2A70041F" wp14:editId="39644C9F">
             <wp:extent cx="5328285" cy="434340"/>
@@ -3670,6 +3792,9 @@
         <w:ind w:left="661" w:firstLine="0"/>
       </w:pPr>
       <w:r>
+        <w:rPr>
+          <w:noProof/>
+        </w:rPr>
         <w:drawing>
           <wp:inline distT="0" distB="0" distL="0" distR="0" wp14:anchorId="27F9DE7A" wp14:editId="03CA1B48">
             <wp:extent cx="5328285" cy="361315"/>
@@ -3720,6 +3845,9 @@
         <w:ind w:left="661" w:firstLine="0"/>
       </w:pPr>
       <w:r>
+        <w:rPr>
+          <w:noProof/>
+        </w:rPr>
         <w:drawing>
           <wp:inline distT="0" distB="0" distL="0" distR="0" wp14:anchorId="3833B7F0" wp14:editId="450E2A01">
             <wp:extent cx="5328285" cy="309880"/>
@@ -3829,6 +3957,7 @@
         </w:rPr>
       </w:pPr>
       <w:proofErr w:type="spellStart"/>
+      <w:proofErr w:type="gramStart"/>
       <w:r>
         <w:rPr>
           <w:b/>
@@ -3838,6 +3967,7 @@
         <w:t>mkdir</w:t>
       </w:r>
       <w:proofErr w:type="spellEnd"/>
+      <w:proofErr w:type="gramEnd"/>
       <w:r>
         <w:rPr>
           <w:b/>
@@ -3864,6 +3994,9 @@
         <w:jc w:val="left"/>
       </w:pPr>
       <w:r>
+        <w:rPr>
+          <w:noProof/>
+        </w:rPr>
         <w:drawing>
           <wp:inline distT="0" distB="0" distL="0" distR="0" wp14:anchorId="7D1848F4" wp14:editId="46E40BB5">
             <wp:extent cx="5328285" cy="787400"/>
@@ -4002,6 +4135,7 @@
               <w:jc w:val="left"/>
             </w:pPr>
             <w:proofErr w:type="spellStart"/>
+            <w:proofErr w:type="gramStart"/>
             <w:r>
               <w:rPr>
                 <w:sz w:val="23"/>
@@ -4009,6 +4143,7 @@
               <w:t>datasets</w:t>
             </w:r>
             <w:proofErr w:type="spellEnd"/>
+            <w:proofErr w:type="gramEnd"/>
             <w:r>
               <w:rPr>
                 <w:sz w:val="23"/>
@@ -4034,6 +4169,7 @@
               <w:jc w:val="left"/>
             </w:pPr>
             <w:proofErr w:type="spellStart"/>
+            <w:proofErr w:type="gramStart"/>
             <w:r>
               <w:rPr>
                 <w:sz w:val="23"/>
@@ -4041,6 +4177,7 @@
               <w:t>alice</w:t>
             </w:r>
             <w:proofErr w:type="spellEnd"/>
+            <w:proofErr w:type="gramEnd"/>
             <w:r>
               <w:rPr>
                 <w:sz w:val="23"/>
@@ -4071,6 +4208,7 @@
               <w:jc w:val="left"/>
             </w:pPr>
             <w:proofErr w:type="spellStart"/>
+            <w:proofErr w:type="gramStart"/>
             <w:r>
               <w:rPr>
                 <w:sz w:val="23"/>
@@ -4078,6 +4216,7 @@
               <w:t>models</w:t>
             </w:r>
             <w:proofErr w:type="spellEnd"/>
+            <w:proofErr w:type="gramEnd"/>
             <w:r>
               <w:rPr>
                 <w:sz w:val="23"/>
@@ -4103,6 +4242,7 @@
               <w:jc w:val="left"/>
             </w:pPr>
             <w:proofErr w:type="spellStart"/>
+            <w:proofErr w:type="gramStart"/>
             <w:r>
               <w:rPr>
                 <w:sz w:val="23"/>
@@ -4110,6 +4250,7 @@
               <w:t>alice</w:t>
             </w:r>
             <w:proofErr w:type="spellEnd"/>
+            <w:proofErr w:type="gramEnd"/>
             <w:r>
               <w:rPr>
                 <w:sz w:val="23"/>
@@ -4139,11 +4280,19 @@
               <w:ind w:left="0" w:firstLine="0"/>
               <w:jc w:val="left"/>
             </w:pPr>
-            <w:r>
-              <w:rPr>
-                <w:sz w:val="23"/>
-              </w:rPr>
-              <w:t xml:space="preserve">api </w:t>
+            <w:proofErr w:type="gramStart"/>
+            <w:r>
+              <w:rPr>
+                <w:sz w:val="23"/>
+              </w:rPr>
+              <w:t>api</w:t>
+            </w:r>
+            <w:proofErr w:type="gramEnd"/>
+            <w:r>
+              <w:rPr>
+                <w:sz w:val="23"/>
+              </w:rPr>
+              <w:t xml:space="preserve"> </w:t>
             </w:r>
           </w:p>
         </w:tc>
@@ -4164,6 +4313,7 @@
               <w:jc w:val="left"/>
             </w:pPr>
             <w:proofErr w:type="spellStart"/>
+            <w:proofErr w:type="gramStart"/>
             <w:r>
               <w:rPr>
                 <w:sz w:val="23"/>
@@ -4171,6 +4321,7 @@
               <w:t>charles</w:t>
             </w:r>
             <w:proofErr w:type="spellEnd"/>
+            <w:proofErr w:type="gramEnd"/>
             <w:r>
               <w:rPr>
                 <w:sz w:val="23"/>
@@ -4200,11 +4351,19 @@
               <w:ind w:left="0" w:firstLine="0"/>
               <w:jc w:val="left"/>
             </w:pPr>
-            <w:r>
-              <w:rPr>
-                <w:sz w:val="23"/>
-              </w:rPr>
-              <w:t xml:space="preserve">logs </w:t>
+            <w:proofErr w:type="gramStart"/>
+            <w:r>
+              <w:rPr>
+                <w:sz w:val="23"/>
+              </w:rPr>
+              <w:t>logs</w:t>
+            </w:r>
+            <w:proofErr w:type="gramEnd"/>
+            <w:r>
+              <w:rPr>
+                <w:sz w:val="23"/>
+              </w:rPr>
+              <w:t xml:space="preserve"> </w:t>
             </w:r>
           </w:p>
         </w:tc>
@@ -4224,11 +4383,19 @@
               <w:ind w:left="2" w:firstLine="0"/>
               <w:jc w:val="left"/>
             </w:pPr>
-            <w:r>
-              <w:rPr>
-                <w:sz w:val="23"/>
-              </w:rPr>
-              <w:t xml:space="preserve">diane </w:t>
+            <w:proofErr w:type="gramStart"/>
+            <w:r>
+              <w:rPr>
+                <w:sz w:val="23"/>
+              </w:rPr>
+              <w:t>diane</w:t>
+            </w:r>
+            <w:proofErr w:type="gramEnd"/>
+            <w:r>
+              <w:rPr>
+                <w:sz w:val="23"/>
+              </w:rPr>
+              <w:t xml:space="preserve"> </w:t>
             </w:r>
           </w:p>
         </w:tc>
@@ -4253,11 +4420,19 @@
               <w:ind w:left="0" w:firstLine="0"/>
               <w:jc w:val="left"/>
             </w:pPr>
-            <w:r>
-              <w:rPr>
-                <w:sz w:val="23"/>
-              </w:rPr>
-              <w:t xml:space="preserve">backup </w:t>
+            <w:proofErr w:type="gramStart"/>
+            <w:r>
+              <w:rPr>
+                <w:sz w:val="23"/>
+              </w:rPr>
+              <w:t>backup</w:t>
+            </w:r>
+            <w:proofErr w:type="gramEnd"/>
+            <w:r>
+              <w:rPr>
+                <w:sz w:val="23"/>
+              </w:rPr>
+              <w:t xml:space="preserve"> </w:t>
             </w:r>
           </w:p>
         </w:tc>
@@ -4277,11 +4452,19 @@
               <w:ind w:left="3" w:firstLine="0"/>
               <w:jc w:val="left"/>
             </w:pPr>
-            <w:r>
-              <w:rPr>
-                <w:sz w:val="23"/>
-              </w:rPr>
-              <w:t xml:space="preserve">diane </w:t>
+            <w:proofErr w:type="gramStart"/>
+            <w:r>
+              <w:rPr>
+                <w:sz w:val="23"/>
+              </w:rPr>
+              <w:t>diane</w:t>
+            </w:r>
+            <w:proofErr w:type="gramEnd"/>
+            <w:r>
+              <w:rPr>
+                <w:sz w:val="23"/>
+              </w:rPr>
+              <w:t xml:space="preserve"> </w:t>
             </w:r>
           </w:p>
         </w:tc>
@@ -4305,11 +4488,19 @@
               <w:spacing w:after="0" w:line="259" w:lineRule="auto"/>
               <w:ind w:left="0" w:firstLine="0"/>
             </w:pPr>
-            <w:r>
-              <w:rPr>
-                <w:sz w:val="23"/>
-              </w:rPr>
-              <w:t xml:space="preserve">documentation </w:t>
+            <w:proofErr w:type="gramStart"/>
+            <w:r>
+              <w:rPr>
+                <w:sz w:val="23"/>
+              </w:rPr>
+              <w:t>documentation</w:t>
+            </w:r>
+            <w:proofErr w:type="gramEnd"/>
+            <w:r>
+              <w:rPr>
+                <w:sz w:val="23"/>
+              </w:rPr>
+              <w:t xml:space="preserve"> </w:t>
             </w:r>
           </w:p>
         </w:tc>
@@ -4329,11 +4520,19 @@
               <w:ind w:left="2" w:firstLine="0"/>
               <w:jc w:val="left"/>
             </w:pPr>
-            <w:r>
-              <w:rPr>
-                <w:sz w:val="23"/>
-              </w:rPr>
-              <w:t xml:space="preserve">bob </w:t>
+            <w:proofErr w:type="gramStart"/>
+            <w:r>
+              <w:rPr>
+                <w:sz w:val="23"/>
+              </w:rPr>
+              <w:t>bob</w:t>
+            </w:r>
+            <w:proofErr w:type="gramEnd"/>
+            <w:r>
+              <w:rPr>
+                <w:sz w:val="23"/>
+              </w:rPr>
+              <w:t xml:space="preserve"> </w:t>
             </w:r>
           </w:p>
         </w:tc>
@@ -4359,6 +4558,7 @@
               <w:jc w:val="left"/>
             </w:pPr>
             <w:proofErr w:type="spellStart"/>
+            <w:proofErr w:type="gramStart"/>
             <w:r>
               <w:rPr>
                 <w:sz w:val="23"/>
@@ -4366,6 +4566,7 @@
               <w:t>shared</w:t>
             </w:r>
             <w:proofErr w:type="spellEnd"/>
+            <w:proofErr w:type="gramEnd"/>
             <w:r>
               <w:rPr>
                 <w:sz w:val="23"/>
@@ -4390,11 +4591,19 @@
               <w:ind w:left="3" w:firstLine="0"/>
               <w:jc w:val="left"/>
             </w:pPr>
-            <w:r>
-              <w:rPr>
-                <w:sz w:val="23"/>
-              </w:rPr>
-              <w:t xml:space="preserve">root </w:t>
+            <w:proofErr w:type="gramStart"/>
+            <w:r>
+              <w:rPr>
+                <w:sz w:val="23"/>
+              </w:rPr>
+              <w:t>root</w:t>
+            </w:r>
+            <w:proofErr w:type="gramEnd"/>
+            <w:r>
+              <w:rPr>
+                <w:sz w:val="23"/>
+              </w:rPr>
+              <w:t xml:space="preserve"> </w:t>
             </w:r>
           </w:p>
         </w:tc>
@@ -4406,6 +4615,9 @@
         <w:ind w:left="661" w:firstLine="0"/>
       </w:pPr>
       <w:r>
+        <w:rPr>
+          <w:noProof/>
+        </w:rPr>
         <w:drawing>
           <wp:inline distT="0" distB="0" distL="0" distR="0" wp14:anchorId="010588F1" wp14:editId="5EBFA844">
             <wp:extent cx="5328285" cy="474980"/>
@@ -4449,6 +4661,9 @@
         <w:ind w:left="661" w:firstLine="0"/>
       </w:pPr>
       <w:r>
+        <w:rPr>
+          <w:noProof/>
+        </w:rPr>
         <w:drawing>
           <wp:inline distT="0" distB="0" distL="0" distR="0" wp14:anchorId="094C0AB0" wp14:editId="21B38409">
             <wp:extent cx="5328285" cy="583565"/>
@@ -4587,6 +4802,7 @@
               <w:jc w:val="left"/>
             </w:pPr>
             <w:proofErr w:type="spellStart"/>
+            <w:proofErr w:type="gramStart"/>
             <w:r>
               <w:rPr>
                 <w:sz w:val="23"/>
@@ -4594,6 +4810,7 @@
               <w:t>datasets</w:t>
             </w:r>
             <w:proofErr w:type="spellEnd"/>
+            <w:proofErr w:type="gramEnd"/>
             <w:r>
               <w:rPr>
                 <w:sz w:val="23"/>
@@ -4618,11 +4835,19 @@
               <w:ind w:left="1" w:firstLine="0"/>
               <w:jc w:val="left"/>
             </w:pPr>
-            <w:r>
-              <w:rPr>
-                <w:sz w:val="23"/>
-              </w:rPr>
-              <w:t xml:space="preserve">data </w:t>
+            <w:proofErr w:type="gramStart"/>
+            <w:r>
+              <w:rPr>
+                <w:sz w:val="23"/>
+              </w:rPr>
+              <w:t>data</w:t>
+            </w:r>
+            <w:proofErr w:type="gramEnd"/>
+            <w:r>
+              <w:rPr>
+                <w:sz w:val="23"/>
+              </w:rPr>
+              <w:t xml:space="preserve"> </w:t>
             </w:r>
           </w:p>
         </w:tc>
@@ -4648,6 +4873,7 @@
               <w:jc w:val="left"/>
             </w:pPr>
             <w:proofErr w:type="spellStart"/>
+            <w:proofErr w:type="gramStart"/>
             <w:r>
               <w:rPr>
                 <w:sz w:val="23"/>
@@ -4655,6 +4881,7 @@
               <w:t>models</w:t>
             </w:r>
             <w:proofErr w:type="spellEnd"/>
+            <w:proofErr w:type="gramEnd"/>
             <w:r>
               <w:rPr>
                 <w:sz w:val="23"/>
@@ -4679,11 +4906,19 @@
               <w:ind w:left="2" w:firstLine="0"/>
               <w:jc w:val="left"/>
             </w:pPr>
-            <w:r>
-              <w:rPr>
-                <w:sz w:val="23"/>
-              </w:rPr>
-              <w:t xml:space="preserve">data </w:t>
+            <w:proofErr w:type="gramStart"/>
+            <w:r>
+              <w:rPr>
+                <w:sz w:val="23"/>
+              </w:rPr>
+              <w:t>data</w:t>
+            </w:r>
+            <w:proofErr w:type="gramEnd"/>
+            <w:r>
+              <w:rPr>
+                <w:sz w:val="23"/>
+              </w:rPr>
+              <w:t xml:space="preserve"> </w:t>
             </w:r>
           </w:p>
         </w:tc>
@@ -4708,11 +4943,19 @@
               <w:ind w:left="0" w:firstLine="0"/>
               <w:jc w:val="left"/>
             </w:pPr>
-            <w:r>
-              <w:rPr>
-                <w:sz w:val="23"/>
-              </w:rPr>
-              <w:t xml:space="preserve">api </w:t>
+            <w:proofErr w:type="gramStart"/>
+            <w:r>
+              <w:rPr>
+                <w:sz w:val="23"/>
+              </w:rPr>
+              <w:t>api</w:t>
+            </w:r>
+            <w:proofErr w:type="gramEnd"/>
+            <w:r>
+              <w:rPr>
+                <w:sz w:val="23"/>
+              </w:rPr>
+              <w:t xml:space="preserve"> </w:t>
             </w:r>
           </w:p>
         </w:tc>
@@ -4732,11 +4975,19 @@
               <w:ind w:left="2" w:firstLine="0"/>
               <w:jc w:val="left"/>
             </w:pPr>
-            <w:r>
-              <w:rPr>
-                <w:sz w:val="23"/>
-              </w:rPr>
-              <w:t xml:space="preserve">api </w:t>
+            <w:proofErr w:type="gramStart"/>
+            <w:r>
+              <w:rPr>
+                <w:sz w:val="23"/>
+              </w:rPr>
+              <w:t>api</w:t>
+            </w:r>
+            <w:proofErr w:type="gramEnd"/>
+            <w:r>
+              <w:rPr>
+                <w:sz w:val="23"/>
+              </w:rPr>
+              <w:t xml:space="preserve"> </w:t>
             </w:r>
           </w:p>
         </w:tc>
@@ -4761,11 +5012,19 @@
               <w:ind w:left="0" w:firstLine="0"/>
               <w:jc w:val="left"/>
             </w:pPr>
-            <w:r>
-              <w:rPr>
-                <w:sz w:val="23"/>
-              </w:rPr>
-              <w:t xml:space="preserve">logs </w:t>
+            <w:proofErr w:type="gramStart"/>
+            <w:r>
+              <w:rPr>
+                <w:sz w:val="23"/>
+              </w:rPr>
+              <w:t>logs</w:t>
+            </w:r>
+            <w:proofErr w:type="gramEnd"/>
+            <w:r>
+              <w:rPr>
+                <w:sz w:val="23"/>
+              </w:rPr>
+              <w:t xml:space="preserve"> </w:t>
             </w:r>
           </w:p>
         </w:tc>
@@ -4786,6 +5045,7 @@
               <w:jc w:val="left"/>
             </w:pPr>
             <w:proofErr w:type="spellStart"/>
+            <w:proofErr w:type="gramStart"/>
             <w:r>
               <w:rPr>
                 <w:sz w:val="23"/>
@@ -4793,6 +5053,7 @@
               <w:t>mlops</w:t>
             </w:r>
             <w:proofErr w:type="spellEnd"/>
+            <w:proofErr w:type="gramEnd"/>
             <w:r>
               <w:rPr>
                 <w:sz w:val="23"/>
@@ -4822,11 +5083,19 @@
               <w:ind w:left="0" w:firstLine="0"/>
               <w:jc w:val="left"/>
             </w:pPr>
-            <w:r>
-              <w:rPr>
-                <w:sz w:val="23"/>
-              </w:rPr>
-              <w:t xml:space="preserve">backup </w:t>
+            <w:proofErr w:type="gramStart"/>
+            <w:r>
+              <w:rPr>
+                <w:sz w:val="23"/>
+              </w:rPr>
+              <w:t>backup</w:t>
+            </w:r>
+            <w:proofErr w:type="gramEnd"/>
+            <w:r>
+              <w:rPr>
+                <w:sz w:val="23"/>
+              </w:rPr>
+              <w:t xml:space="preserve"> </w:t>
             </w:r>
           </w:p>
         </w:tc>
@@ -4847,6 +5116,7 @@
               <w:jc w:val="left"/>
             </w:pPr>
             <w:proofErr w:type="spellStart"/>
+            <w:proofErr w:type="gramStart"/>
             <w:r>
               <w:rPr>
                 <w:sz w:val="23"/>
@@ -4854,6 +5124,7 @@
               <w:t>mlops</w:t>
             </w:r>
             <w:proofErr w:type="spellEnd"/>
+            <w:proofErr w:type="gramEnd"/>
             <w:r>
               <w:rPr>
                 <w:sz w:val="23"/>
@@ -4882,11 +5153,19 @@
               <w:spacing w:after="0" w:line="259" w:lineRule="auto"/>
               <w:ind w:left="0" w:firstLine="0"/>
             </w:pPr>
-            <w:r>
-              <w:rPr>
-                <w:sz w:val="23"/>
-              </w:rPr>
-              <w:t xml:space="preserve">documentation </w:t>
+            <w:proofErr w:type="gramStart"/>
+            <w:r>
+              <w:rPr>
+                <w:sz w:val="23"/>
+              </w:rPr>
+              <w:t>documentation</w:t>
+            </w:r>
+            <w:proofErr w:type="gramEnd"/>
+            <w:r>
+              <w:rPr>
+                <w:sz w:val="23"/>
+              </w:rPr>
+              <w:t xml:space="preserve"> </w:t>
             </w:r>
           </w:p>
         </w:tc>
@@ -4906,11 +5185,19 @@
               <w:ind w:left="2" w:firstLine="0"/>
               <w:jc w:val="left"/>
             </w:pPr>
-            <w:r>
-              <w:rPr>
-                <w:sz w:val="23"/>
-              </w:rPr>
-              <w:t xml:space="preserve">data </w:t>
+            <w:proofErr w:type="gramStart"/>
+            <w:r>
+              <w:rPr>
+                <w:sz w:val="23"/>
+              </w:rPr>
+              <w:t>data</w:t>
+            </w:r>
+            <w:proofErr w:type="gramEnd"/>
+            <w:r>
+              <w:rPr>
+                <w:sz w:val="23"/>
+              </w:rPr>
+              <w:t xml:space="preserve"> </w:t>
             </w:r>
           </w:p>
         </w:tc>
@@ -4936,6 +5223,7 @@
               <w:jc w:val="left"/>
             </w:pPr>
             <w:proofErr w:type="spellStart"/>
+            <w:proofErr w:type="gramStart"/>
             <w:r>
               <w:rPr>
                 <w:sz w:val="23"/>
@@ -4943,6 +5231,7 @@
               <w:t>shared</w:t>
             </w:r>
             <w:proofErr w:type="spellEnd"/>
+            <w:proofErr w:type="gramEnd"/>
             <w:r>
               <w:rPr>
                 <w:sz w:val="23"/>
@@ -4967,11 +5256,19 @@
               <w:ind w:left="3" w:firstLine="0"/>
               <w:jc w:val="left"/>
             </w:pPr>
-            <w:r>
-              <w:rPr>
-                <w:sz w:val="23"/>
-              </w:rPr>
-              <w:t xml:space="preserve">data </w:t>
+            <w:proofErr w:type="gramStart"/>
+            <w:r>
+              <w:rPr>
+                <w:sz w:val="23"/>
+              </w:rPr>
+              <w:t>data</w:t>
+            </w:r>
+            <w:proofErr w:type="gramEnd"/>
+            <w:r>
+              <w:rPr>
+                <w:sz w:val="23"/>
+              </w:rPr>
+              <w:t xml:space="preserve"> </w:t>
             </w:r>
           </w:p>
         </w:tc>
@@ -4983,6 +5280,9 @@
         <w:ind w:left="661" w:firstLine="0"/>
       </w:pPr>
       <w:r>
+        <w:rPr>
+          <w:noProof/>
+        </w:rPr>
         <w:drawing>
           <wp:inline distT="0" distB="0" distL="0" distR="0" wp14:anchorId="1C47D5CB" wp14:editId="1044BBDA">
             <wp:extent cx="5328285" cy="1083945"/>
@@ -5148,6 +5448,7 @@
               <w:jc w:val="left"/>
             </w:pPr>
             <w:proofErr w:type="spellStart"/>
+            <w:proofErr w:type="gramStart"/>
             <w:r>
               <w:rPr>
                 <w:sz w:val="23"/>
@@ -5155,6 +5456,7 @@
               <w:t>datasets</w:t>
             </w:r>
             <w:proofErr w:type="spellEnd"/>
+            <w:proofErr w:type="gramEnd"/>
             <w:r>
               <w:rPr>
                 <w:sz w:val="23"/>
@@ -5180,6 +5482,7 @@
               <w:jc w:val="left"/>
             </w:pPr>
             <w:proofErr w:type="spellStart"/>
+            <w:proofErr w:type="gramStart"/>
             <w:r>
               <w:rPr>
                 <w:sz w:val="23"/>
@@ -5187,6 +5490,7 @@
               <w:t>rwx</w:t>
             </w:r>
             <w:proofErr w:type="spellEnd"/>
+            <w:proofErr w:type="gramEnd"/>
             <w:r>
               <w:rPr>
                 <w:sz w:val="23"/>
@@ -5212,6 +5516,7 @@
               <w:jc w:val="left"/>
             </w:pPr>
             <w:proofErr w:type="spellStart"/>
+            <w:proofErr w:type="gramStart"/>
             <w:r>
               <w:rPr>
                 <w:sz w:val="23"/>
@@ -5219,6 +5524,7 @@
               <w:t>rwx</w:t>
             </w:r>
             <w:proofErr w:type="spellEnd"/>
+            <w:proofErr w:type="gramEnd"/>
             <w:r>
               <w:rPr>
                 <w:sz w:val="23"/>
@@ -5273,6 +5579,7 @@
               <w:jc w:val="left"/>
             </w:pPr>
             <w:proofErr w:type="spellStart"/>
+            <w:proofErr w:type="gramStart"/>
             <w:r>
               <w:rPr>
                 <w:sz w:val="23"/>
@@ -5280,6 +5587,7 @@
               <w:t>models</w:t>
             </w:r>
             <w:proofErr w:type="spellEnd"/>
+            <w:proofErr w:type="gramEnd"/>
             <w:r>
               <w:rPr>
                 <w:sz w:val="23"/>
@@ -5305,6 +5613,7 @@
               <w:jc w:val="left"/>
             </w:pPr>
             <w:proofErr w:type="spellStart"/>
+            <w:proofErr w:type="gramStart"/>
             <w:r>
               <w:rPr>
                 <w:sz w:val="23"/>
@@ -5312,6 +5621,7 @@
               <w:t>rwx</w:t>
             </w:r>
             <w:proofErr w:type="spellEnd"/>
+            <w:proofErr w:type="gramEnd"/>
             <w:r>
               <w:rPr>
                 <w:sz w:val="23"/>
@@ -5336,11 +5646,19 @@
               <w:ind w:left="1" w:firstLine="0"/>
               <w:jc w:val="left"/>
             </w:pPr>
-            <w:r>
-              <w:rPr>
-                <w:sz w:val="23"/>
-              </w:rPr>
-              <w:t xml:space="preserve">r-x </w:t>
+            <w:proofErr w:type="gramStart"/>
+            <w:r>
+              <w:rPr>
+                <w:sz w:val="23"/>
+              </w:rPr>
+              <w:t>r</w:t>
+            </w:r>
+            <w:proofErr w:type="gramEnd"/>
+            <w:r>
+              <w:rPr>
+                <w:sz w:val="23"/>
+              </w:rPr>
+              <w:t xml:space="preserve">-x </w:t>
             </w:r>
           </w:p>
         </w:tc>
@@ -5389,11 +5707,19 @@
               <w:ind w:left="0" w:firstLine="0"/>
               <w:jc w:val="left"/>
             </w:pPr>
-            <w:r>
-              <w:rPr>
-                <w:sz w:val="23"/>
-              </w:rPr>
-              <w:t xml:space="preserve">api </w:t>
+            <w:proofErr w:type="gramStart"/>
+            <w:r>
+              <w:rPr>
+                <w:sz w:val="23"/>
+              </w:rPr>
+              <w:t>api</w:t>
+            </w:r>
+            <w:proofErr w:type="gramEnd"/>
+            <w:r>
+              <w:rPr>
+                <w:sz w:val="23"/>
+              </w:rPr>
+              <w:t xml:space="preserve"> </w:t>
             </w:r>
           </w:p>
         </w:tc>
@@ -5414,6 +5740,7 @@
               <w:jc w:val="left"/>
             </w:pPr>
             <w:proofErr w:type="spellStart"/>
+            <w:proofErr w:type="gramStart"/>
             <w:r>
               <w:rPr>
                 <w:sz w:val="23"/>
@@ -5421,6 +5748,7 @@
               <w:t>rwx</w:t>
             </w:r>
             <w:proofErr w:type="spellEnd"/>
+            <w:proofErr w:type="gramEnd"/>
             <w:r>
               <w:rPr>
                 <w:sz w:val="23"/>
@@ -5446,6 +5774,7 @@
               <w:jc w:val="left"/>
             </w:pPr>
             <w:proofErr w:type="spellStart"/>
+            <w:proofErr w:type="gramStart"/>
             <w:r>
               <w:rPr>
                 <w:sz w:val="23"/>
@@ -5453,6 +5782,7 @@
               <w:t>rwx</w:t>
             </w:r>
             <w:proofErr w:type="spellEnd"/>
+            <w:proofErr w:type="gramEnd"/>
             <w:r>
               <w:rPr>
                 <w:sz w:val="23"/>
@@ -5506,11 +5836,19 @@
               <w:ind w:left="0" w:firstLine="0"/>
               <w:jc w:val="left"/>
             </w:pPr>
-            <w:r>
-              <w:rPr>
-                <w:sz w:val="23"/>
-              </w:rPr>
-              <w:t xml:space="preserve">logs </w:t>
+            <w:proofErr w:type="gramStart"/>
+            <w:r>
+              <w:rPr>
+                <w:sz w:val="23"/>
+              </w:rPr>
+              <w:t>logs</w:t>
+            </w:r>
+            <w:proofErr w:type="gramEnd"/>
+            <w:r>
+              <w:rPr>
+                <w:sz w:val="23"/>
+              </w:rPr>
+              <w:t xml:space="preserve"> </w:t>
             </w:r>
           </w:p>
         </w:tc>
@@ -5531,6 +5869,7 @@
               <w:jc w:val="left"/>
             </w:pPr>
             <w:proofErr w:type="spellStart"/>
+            <w:proofErr w:type="gramStart"/>
             <w:r>
               <w:rPr>
                 <w:sz w:val="23"/>
@@ -5538,6 +5877,7 @@
               <w:t>rwx</w:t>
             </w:r>
             <w:proofErr w:type="spellEnd"/>
+            <w:proofErr w:type="gramEnd"/>
             <w:r>
               <w:rPr>
                 <w:sz w:val="23"/>
@@ -5562,11 +5902,19 @@
               <w:ind w:left="2" w:firstLine="0"/>
               <w:jc w:val="left"/>
             </w:pPr>
-            <w:r>
-              <w:rPr>
-                <w:sz w:val="23"/>
-              </w:rPr>
-              <w:t xml:space="preserve">r-- </w:t>
+            <w:proofErr w:type="gramStart"/>
+            <w:r>
+              <w:rPr>
+                <w:sz w:val="23"/>
+              </w:rPr>
+              <w:t>r</w:t>
+            </w:r>
+            <w:proofErr w:type="gramEnd"/>
+            <w:r>
+              <w:rPr>
+                <w:sz w:val="23"/>
+              </w:rPr>
+              <w:t xml:space="preserve">-- </w:t>
             </w:r>
           </w:p>
         </w:tc>
@@ -5615,11 +5963,19 @@
               <w:ind w:left="0" w:firstLine="0"/>
               <w:jc w:val="left"/>
             </w:pPr>
-            <w:r>
-              <w:rPr>
-                <w:sz w:val="23"/>
-              </w:rPr>
-              <w:t xml:space="preserve">backup </w:t>
+            <w:proofErr w:type="gramStart"/>
+            <w:r>
+              <w:rPr>
+                <w:sz w:val="23"/>
+              </w:rPr>
+              <w:t>backup</w:t>
+            </w:r>
+            <w:proofErr w:type="gramEnd"/>
+            <w:r>
+              <w:rPr>
+                <w:sz w:val="23"/>
+              </w:rPr>
+              <w:t xml:space="preserve"> </w:t>
             </w:r>
           </w:p>
         </w:tc>
@@ -5640,6 +5996,7 @@
               <w:jc w:val="left"/>
             </w:pPr>
             <w:proofErr w:type="spellStart"/>
+            <w:proofErr w:type="gramStart"/>
             <w:r>
               <w:rPr>
                 <w:sz w:val="23"/>
@@ -5647,6 +6004,7 @@
               <w:t>rwx</w:t>
             </w:r>
             <w:proofErr w:type="spellEnd"/>
+            <w:proofErr w:type="gramEnd"/>
             <w:r>
               <w:rPr>
                 <w:sz w:val="23"/>
@@ -5723,11 +6081,19 @@
               <w:spacing w:after="0" w:line="259" w:lineRule="auto"/>
               <w:ind w:left="0" w:firstLine="0"/>
             </w:pPr>
-            <w:r>
-              <w:rPr>
-                <w:sz w:val="23"/>
-              </w:rPr>
-              <w:t xml:space="preserve">documentation </w:t>
+            <w:proofErr w:type="gramStart"/>
+            <w:r>
+              <w:rPr>
+                <w:sz w:val="23"/>
+              </w:rPr>
+              <w:t>documentation</w:t>
+            </w:r>
+            <w:proofErr w:type="gramEnd"/>
+            <w:r>
+              <w:rPr>
+                <w:sz w:val="23"/>
+              </w:rPr>
+              <w:t xml:space="preserve"> </w:t>
             </w:r>
           </w:p>
         </w:tc>
@@ -5748,6 +6114,7 @@
               <w:jc w:val="left"/>
             </w:pPr>
             <w:proofErr w:type="spellStart"/>
+            <w:proofErr w:type="gramStart"/>
             <w:r>
               <w:rPr>
                 <w:sz w:val="23"/>
@@ -5755,6 +6122,7 @@
               <w:t>rwx</w:t>
             </w:r>
             <w:proofErr w:type="spellEnd"/>
+            <w:proofErr w:type="gramEnd"/>
             <w:r>
               <w:rPr>
                 <w:sz w:val="23"/>
@@ -5779,11 +6147,19 @@
               <w:ind w:left="2" w:firstLine="0"/>
               <w:jc w:val="left"/>
             </w:pPr>
-            <w:r>
-              <w:rPr>
-                <w:sz w:val="23"/>
-              </w:rPr>
-              <w:t xml:space="preserve">r-- </w:t>
+            <w:proofErr w:type="gramStart"/>
+            <w:r>
+              <w:rPr>
+                <w:sz w:val="23"/>
+              </w:rPr>
+              <w:t>r</w:t>
+            </w:r>
+            <w:proofErr w:type="gramEnd"/>
+            <w:r>
+              <w:rPr>
+                <w:sz w:val="23"/>
+              </w:rPr>
+              <w:t xml:space="preserve">-- </w:t>
             </w:r>
           </w:p>
         </w:tc>
@@ -5803,11 +6179,19 @@
               <w:ind w:left="3" w:firstLine="0"/>
               <w:jc w:val="left"/>
             </w:pPr>
-            <w:r>
-              <w:rPr>
-                <w:sz w:val="23"/>
-              </w:rPr>
-              <w:t xml:space="preserve">r-- </w:t>
+            <w:proofErr w:type="gramStart"/>
+            <w:r>
+              <w:rPr>
+                <w:sz w:val="23"/>
+              </w:rPr>
+              <w:t>r</w:t>
+            </w:r>
+            <w:proofErr w:type="gramEnd"/>
+            <w:r>
+              <w:rPr>
+                <w:sz w:val="23"/>
+              </w:rPr>
+              <w:t xml:space="preserve">-- </w:t>
             </w:r>
           </w:p>
         </w:tc>
@@ -5833,6 +6217,7 @@
               <w:jc w:val="left"/>
             </w:pPr>
             <w:proofErr w:type="spellStart"/>
+            <w:proofErr w:type="gramStart"/>
             <w:r>
               <w:rPr>
                 <w:sz w:val="23"/>
@@ -5840,6 +6225,7 @@
               <w:t>shared</w:t>
             </w:r>
             <w:proofErr w:type="spellEnd"/>
+            <w:proofErr w:type="gramEnd"/>
             <w:r>
               <w:rPr>
                 <w:sz w:val="23"/>
@@ -5865,6 +6251,7 @@
               <w:jc w:val="left"/>
             </w:pPr>
             <w:proofErr w:type="spellStart"/>
+            <w:proofErr w:type="gramStart"/>
             <w:r>
               <w:rPr>
                 <w:sz w:val="23"/>
@@ -5872,6 +6259,7 @@
               <w:t>rwx</w:t>
             </w:r>
             <w:proofErr w:type="spellEnd"/>
+            <w:proofErr w:type="gramEnd"/>
             <w:r>
               <w:rPr>
                 <w:sz w:val="23"/>
@@ -5897,6 +6285,7 @@
               <w:jc w:val="left"/>
             </w:pPr>
             <w:proofErr w:type="spellStart"/>
+            <w:proofErr w:type="gramStart"/>
             <w:r>
               <w:rPr>
                 <w:sz w:val="23"/>
@@ -5904,6 +6293,7 @@
               <w:t>rwx</w:t>
             </w:r>
             <w:proofErr w:type="spellEnd"/>
+            <w:proofErr w:type="gramEnd"/>
             <w:r>
               <w:rPr>
                 <w:sz w:val="23"/>
@@ -5928,11 +6318,19 @@
               <w:ind w:left="3" w:firstLine="0"/>
               <w:jc w:val="left"/>
             </w:pPr>
-            <w:r>
-              <w:rPr>
-                <w:sz w:val="23"/>
-              </w:rPr>
-              <w:t xml:space="preserve">r-x </w:t>
+            <w:proofErr w:type="gramStart"/>
+            <w:r>
+              <w:rPr>
+                <w:sz w:val="23"/>
+              </w:rPr>
+              <w:t>r</w:t>
+            </w:r>
+            <w:proofErr w:type="gramEnd"/>
+            <w:r>
+              <w:rPr>
+                <w:sz w:val="23"/>
+              </w:rPr>
+              <w:t xml:space="preserve">-x </w:t>
             </w:r>
           </w:p>
         </w:tc>
@@ -5944,6 +6342,9 @@
         <w:ind w:left="661" w:firstLine="0"/>
       </w:pPr>
       <w:r>
+        <w:rPr>
+          <w:noProof/>
+        </w:rPr>
         <w:drawing>
           <wp:inline distT="0" distB="0" distL="0" distR="0" wp14:anchorId="0519CF8C" wp14:editId="1DA4AB9E">
             <wp:extent cx="5573210" cy="583565"/>
@@ -6041,6 +6442,9 @@
         <w:ind w:left="1341" w:firstLine="0"/>
       </w:pPr>
       <w:r>
+        <w:rPr>
+          <w:noProof/>
+        </w:rPr>
         <w:drawing>
           <wp:inline distT="0" distB="0" distL="0" distR="0" wp14:anchorId="605F04B9" wp14:editId="4645AEB0">
             <wp:extent cx="5328285" cy="236220"/>
@@ -6086,6 +6490,9 @@
         <w:ind w:left="1341" w:firstLine="0"/>
       </w:pPr>
       <w:r>
+        <w:rPr>
+          <w:noProof/>
+        </w:rPr>
         <w:drawing>
           <wp:inline distT="0" distB="0" distL="0" distR="0" wp14:anchorId="27B0E526" wp14:editId="33C3002B">
             <wp:extent cx="5328285" cy="436245"/>
@@ -6178,8 +6585,13 @@
         <w:spacing w:after="12" w:line="255" w:lineRule="auto"/>
         <w:ind w:firstLine="338"/>
       </w:pPr>
-      <w:r>
-        <w:t xml:space="preserve">lire </w:t>
+      <w:proofErr w:type="gramStart"/>
+      <w:r>
+        <w:t>lire</w:t>
+      </w:r>
+      <w:proofErr w:type="gramEnd"/>
+      <w:r>
+        <w:t xml:space="preserve"> </w:t>
       </w:r>
       <w:proofErr w:type="spellStart"/>
       <w:r>
@@ -6199,6 +6611,9 @@
         <w:ind w:left="1341" w:firstLine="0"/>
       </w:pPr>
       <w:r>
+        <w:rPr>
+          <w:noProof/>
+        </w:rPr>
         <w:drawing>
           <wp:inline distT="0" distB="0" distL="0" distR="0" wp14:anchorId="67E86657" wp14:editId="2423C482">
             <wp:extent cx="5328285" cy="241935"/>
@@ -6270,6 +6685,9 @@
         <w:ind w:left="1341" w:firstLine="0"/>
       </w:pPr>
       <w:r>
+        <w:rPr>
+          <w:noProof/>
+        </w:rPr>
         <w:drawing>
           <wp:inline distT="0" distB="0" distL="0" distR="0" wp14:anchorId="10C7F095" wp14:editId="4BAA97CE">
             <wp:extent cx="5328285" cy="242570"/>
@@ -6346,6 +6764,9 @@
         <w:ind w:left="1341" w:firstLine="0"/>
       </w:pPr>
       <w:r>
+        <w:rPr>
+          <w:noProof/>
+        </w:rPr>
         <w:drawing>
           <wp:inline distT="0" distB="0" distL="0" distR="0" wp14:anchorId="7D5A575F" wp14:editId="4F3314E0">
             <wp:extent cx="5328285" cy="233680"/>
@@ -6397,7 +6818,15 @@
       </w:r>
       <w:proofErr w:type="spellEnd"/>
       <w:r>
-        <w:t xml:space="preserve"> peut lire car document est un fichier que tous le mode peut lire </w:t>
+        <w:t xml:space="preserve"> peut lire car document est un fichier que </w:t>
+      </w:r>
+      <w:proofErr w:type="gramStart"/>
+      <w:r>
+        <w:t>tous le mode</w:t>
+      </w:r>
+      <w:proofErr w:type="gramEnd"/>
+      <w:r>
+        <w:t xml:space="preserve"> peut lire </w:t>
       </w:r>
       <w:r>
         <w:t xml:space="preserve"> </w:t>
@@ -6431,6 +6860,9 @@
         <w:ind w:left="1341" w:firstLine="0"/>
       </w:pPr>
       <w:r>
+        <w:rPr>
+          <w:noProof/>
+        </w:rPr>
         <w:drawing>
           <wp:inline distT="0" distB="0" distL="0" distR="0" wp14:anchorId="0222F2EC" wp14:editId="172FF960">
             <wp:extent cx="5328285" cy="344170"/>
@@ -6511,6 +6943,9 @@
         <w:ind w:left="1005" w:firstLine="0"/>
       </w:pPr>
       <w:r>
+        <w:rPr>
+          <w:noProof/>
+        </w:rPr>
         <w:drawing>
           <wp:inline distT="0" distB="0" distL="0" distR="0" wp14:anchorId="320F862D" wp14:editId="7D283FBB">
             <wp:extent cx="5328285" cy="354330"/>
@@ -6571,6 +7006,9 @@
         <w:ind w:left="1005" w:firstLine="0"/>
       </w:pPr>
       <w:r>
+        <w:rPr>
+          <w:noProof/>
+        </w:rPr>
         <w:drawing>
           <wp:inline distT="0" distB="0" distL="0" distR="0" wp14:anchorId="785392F7" wp14:editId="485E55A3">
             <wp:extent cx="5328285" cy="316865"/>
@@ -6639,6 +7077,9 @@
         <w:ind w:left="1005" w:firstLine="0"/>
       </w:pPr>
       <w:r>
+        <w:rPr>
+          <w:noProof/>
+        </w:rPr>
         <w:drawing>
           <wp:inline distT="0" distB="0" distL="0" distR="0" wp14:anchorId="1D3856CB" wp14:editId="75C35838">
             <wp:extent cx="5328285" cy="250190"/>
@@ -6705,7 +7146,15 @@
       </w:r>
       <w:proofErr w:type="spellEnd"/>
       <w:r>
-        <w:t xml:space="preserve"> toutes les droit sur dataset</w:t>
+        <w:t xml:space="preserve"> </w:t>
+      </w:r>
+      <w:proofErr w:type="gramStart"/>
+      <w:r>
+        <w:t>toutes les droit</w:t>
+      </w:r>
+      <w:proofErr w:type="gramEnd"/>
+      <w:r>
+        <w:t xml:space="preserve"> sur dataset</w:t>
       </w:r>
     </w:p>
     <w:p>
@@ -6737,6 +7186,9 @@
         <w:ind w:left="1005" w:firstLine="0"/>
       </w:pPr>
       <w:r>
+        <w:rPr>
+          <w:noProof/>
+        </w:rPr>
         <w:drawing>
           <wp:inline distT="0" distB="0" distL="0" distR="0" wp14:anchorId="4CF4C383" wp14:editId="4167A5CC">
             <wp:extent cx="5328285" cy="369570"/>
@@ -6815,6 +7267,9 @@
         <w:ind w:left="1005" w:firstLine="0"/>
       </w:pPr>
       <w:r>
+        <w:rPr>
+          <w:noProof/>
+        </w:rPr>
         <w:drawing>
           <wp:inline distT="0" distB="0" distL="0" distR="0" wp14:anchorId="0D229C2F" wp14:editId="54976043">
             <wp:extent cx="5328285" cy="325120"/>
@@ -6979,6 +7434,9 @@
         <w:ind w:left="661" w:hanging="338"/>
       </w:pPr>
       <w:r>
+        <w:rPr>
+          <w:noProof/>
+        </w:rPr>
         <w:drawing>
           <wp:inline distT="0" distB="0" distL="0" distR="0" wp14:anchorId="66F6C00B" wp14:editId="27306D4A">
             <wp:extent cx="5328285" cy="1202690"/>
@@ -7035,11 +7493,19 @@
           <w:color w:val="auto"/>
         </w:rPr>
       </w:pPr>
+      <w:proofErr w:type="gramStart"/>
       <w:r>
         <w:rPr>
           <w:color w:val="auto"/>
         </w:rPr>
-        <w:t xml:space="preserve">git --version </w:t>
+        <w:t>git</w:t>
+      </w:r>
+      <w:proofErr w:type="gramEnd"/>
+      <w:r>
+        <w:rPr>
+          <w:color w:val="auto"/>
+        </w:rPr>
+        <w:t xml:space="preserve"> --version </w:t>
       </w:r>
       <w:proofErr w:type="spellStart"/>
       <w:r>
@@ -7117,6 +7583,9 @@
         <w:ind w:left="661" w:firstLine="0"/>
       </w:pPr>
       <w:r>
+        <w:rPr>
+          <w:noProof/>
+        </w:rPr>
         <w:drawing>
           <wp:inline distT="0" distB="0" distL="0" distR="0" wp14:anchorId="48448802" wp14:editId="08228D38">
             <wp:extent cx="3283119" cy="196860"/>
@@ -7159,6 +7628,9 @@
         <w:ind w:left="661" w:firstLine="0"/>
       </w:pPr>
       <w:r>
+        <w:rPr>
+          <w:noProof/>
+        </w:rPr>
         <w:drawing>
           <wp:inline distT="0" distB="0" distL="0" distR="0" wp14:anchorId="0A519087" wp14:editId="12AE2A07">
             <wp:extent cx="5328285" cy="332740"/>
@@ -7201,6 +7673,9 @@
         <w:ind w:left="661" w:firstLine="0"/>
       </w:pPr>
       <w:r>
+        <w:rPr>
+          <w:noProof/>
+        </w:rPr>
         <w:drawing>
           <wp:inline distT="0" distB="0" distL="0" distR="0" wp14:anchorId="02BB86E0" wp14:editId="3D363DC8">
             <wp:extent cx="5863166" cy="334010"/>
@@ -7247,8 +7722,13 @@
         <w:spacing w:after="224"/>
         <w:ind w:left="661" w:hanging="338"/>
       </w:pPr>
-      <w:r>
-        <w:t xml:space="preserve">téléchargez le dataset :  </w:t>
+      <w:proofErr w:type="gramStart"/>
+      <w:r>
+        <w:t>téléchargez</w:t>
+      </w:r>
+      <w:proofErr w:type="gramEnd"/>
+      <w:r>
+        <w:t xml:space="preserve"> le dataset :  </w:t>
       </w:r>
     </w:p>
     <w:p>
@@ -7274,6 +7754,9 @@
         <w:jc w:val="left"/>
       </w:pPr>
       <w:r>
+        <w:rPr>
+          <w:noProof/>
+        </w:rPr>
         <w:drawing>
           <wp:inline distT="0" distB="0" distL="0" distR="0" wp14:anchorId="440A329A" wp14:editId="47663B51">
             <wp:extent cx="5328285" cy="988060"/>
@@ -7331,6 +7814,9 @@
         <w:ind w:left="661" w:firstLine="0"/>
       </w:pPr>
       <w:r>
+        <w:rPr>
+          <w:noProof/>
+        </w:rPr>
         <w:drawing>
           <wp:inline distT="0" distB="0" distL="0" distR="0" wp14:anchorId="4309CDD5" wp14:editId="1D742ED9">
             <wp:extent cx="5328285" cy="508635"/>
@@ -7398,6 +7884,9 @@
         <w:ind w:left="661" w:firstLine="0"/>
       </w:pPr>
       <w:r>
+        <w:rPr>
+          <w:noProof/>
+        </w:rPr>
         <w:drawing>
           <wp:inline distT="0" distB="0" distL="0" distR="0" wp14:anchorId="2526980D" wp14:editId="60965734">
             <wp:extent cx="5328285" cy="1033145"/>
@@ -7522,6 +8011,9 @@
         <w:jc w:val="left"/>
       </w:pPr>
       <w:r>
+        <w:rPr>
+          <w:noProof/>
+        </w:rPr>
         <w:drawing>
           <wp:inline distT="0" distB="0" distL="0" distR="0" wp14:anchorId="79059103" wp14:editId="0B8127D8">
             <wp:extent cx="5328285" cy="525145"/>
@@ -7579,6 +8071,9 @@
         <w:ind w:left="661" w:firstLine="0"/>
       </w:pPr>
       <w:r>
+        <w:rPr>
+          <w:noProof/>
+        </w:rPr>
         <w:drawing>
           <wp:inline distT="0" distB="0" distL="0" distR="0" wp14:anchorId="1CC05E26" wp14:editId="7ACC5716">
             <wp:extent cx="5328285" cy="1244600"/>
@@ -7636,6 +8131,9 @@
         <w:ind w:left="661" w:firstLine="0"/>
       </w:pPr>
       <w:r>
+        <w:rPr>
+          <w:noProof/>
+        </w:rPr>
         <w:drawing>
           <wp:inline distT="0" distB="0" distL="0" distR="0" wp14:anchorId="70F10396" wp14:editId="1C92DB6B">
             <wp:extent cx="5328285" cy="384810"/>
@@ -7678,15 +8176,31 @@
         <w:ind w:left="661" w:firstLine="0"/>
       </w:pPr>
       <w:r>
-        <w:t>J’ai laisse le programme s’</w:t>
+        <w:t xml:space="preserve">J’ai </w:t>
       </w:r>
       <w:proofErr w:type="spellStart"/>
       <w:r>
+        <w:t>laisse</w:t>
+      </w:r>
+      <w:proofErr w:type="spellEnd"/>
+      <w:r>
+        <w:t xml:space="preserve"> le programme s’</w:t>
+      </w:r>
+      <w:proofErr w:type="spellStart"/>
+      <w:r>
         <w:t>executer</w:t>
       </w:r>
       <w:proofErr w:type="spellEnd"/>
       <w:r>
-        <w:t xml:space="preserve"> sur un terminale et sur le </w:t>
+        <w:t xml:space="preserve"> sur </w:t>
+      </w:r>
+      <w:proofErr w:type="gramStart"/>
+      <w:r>
+        <w:t>un terminale</w:t>
+      </w:r>
+      <w:proofErr w:type="gramEnd"/>
+      <w:r>
+        <w:t xml:space="preserve"> et sur le </w:t>
       </w:r>
       <w:proofErr w:type="spellStart"/>
       <w:r>
@@ -7717,6 +8231,9 @@
         <w:ind w:left="661" w:firstLine="0"/>
       </w:pPr>
       <w:r>
+        <w:rPr>
+          <w:noProof/>
+        </w:rPr>
         <w:drawing>
           <wp:inline distT="0" distB="0" distL="0" distR="0" wp14:anchorId="6E0E359B" wp14:editId="34DC05FD">
             <wp:extent cx="5328285" cy="786130"/>
@@ -7774,6 +8291,9 @@
         <w:ind w:left="661" w:firstLine="0"/>
       </w:pPr>
       <w:r>
+        <w:rPr>
+          <w:noProof/>
+        </w:rPr>
         <w:drawing>
           <wp:inline distT="0" distB="0" distL="0" distR="0" wp14:anchorId="0B1D1183" wp14:editId="02B8264E">
             <wp:extent cx="5328285" cy="269240"/>
@@ -7816,6 +8336,9 @@
         <w:ind w:left="661" w:firstLine="0"/>
       </w:pPr>
       <w:r>
+        <w:rPr>
+          <w:noProof/>
+        </w:rPr>
         <w:drawing>
           <wp:inline distT="0" distB="0" distL="0" distR="0" wp14:anchorId="73F99B40" wp14:editId="14A4514E">
             <wp:extent cx="5328285" cy="549910"/>
@@ -7873,6 +8396,9 @@
         <w:ind w:left="661" w:firstLine="0"/>
       </w:pPr>
       <w:r>
+        <w:rPr>
+          <w:noProof/>
+        </w:rPr>
         <w:drawing>
           <wp:inline distT="0" distB="0" distL="0" distR="0" wp14:anchorId="3DBF612D" wp14:editId="7EE3D675">
             <wp:extent cx="5328285" cy="186055"/>
@@ -7932,6 +8458,9 @@
         <w:ind w:left="661" w:firstLine="0"/>
       </w:pPr>
       <w:r>
+        <w:rPr>
+          <w:noProof/>
+        </w:rPr>
         <w:drawing>
           <wp:inline distT="0" distB="0" distL="0" distR="0" wp14:anchorId="508A1CDA" wp14:editId="4B36E076">
             <wp:extent cx="5328285" cy="733425"/>
@@ -8019,7 +8548,10 @@
         <w:ind w:left="661" w:hanging="338"/>
       </w:pPr>
       <w:r>
-        <w:t xml:space="preserve">demander le nom du projet ; </w:t>
+        <w:t>Demander</w:t>
+      </w:r>
+      <w:r>
+        <w:t xml:space="preserve"> le nom du projet ; </w:t>
       </w:r>
     </w:p>
     <w:p>
@@ -8031,7 +8563,10 @@
         <w:ind w:left="661" w:hanging="338"/>
       </w:pPr>
       <w:r>
-        <w:t xml:space="preserve">créer l'arborescence ;  </w:t>
+        <w:t>Créer</w:t>
+      </w:r>
+      <w:r>
+        <w:t xml:space="preserve"> l'arborescence ;  </w:t>
       </w:r>
     </w:p>
     <w:p>
@@ -8043,7 +8578,10 @@
         <w:ind w:left="661" w:hanging="338"/>
       </w:pPr>
       <w:r>
-        <w:t xml:space="preserve">créez un fichier de configuration </w:t>
+        <w:t>Créez</w:t>
+      </w:r>
+      <w:r>
+        <w:t xml:space="preserve"> un fichier de configuration </w:t>
       </w:r>
     </w:p>
     <w:p>
@@ -8055,7 +8593,10 @@
         <w:ind w:left="661" w:hanging="338"/>
       </w:pPr>
       <w:r>
-        <w:t xml:space="preserve">installer les outils </w:t>
+        <w:t>Installer</w:t>
+      </w:r>
+      <w:r>
+        <w:t xml:space="preserve"> les outils </w:t>
       </w:r>
     </w:p>
     <w:p>
@@ -8067,7 +8608,10 @@
         <w:ind w:left="661" w:hanging="338"/>
       </w:pPr>
       <w:r>
-        <w:t xml:space="preserve">télécharger le dataset ;  </w:t>
+        <w:t>Télécharger</w:t>
+      </w:r>
+      <w:r>
+        <w:t xml:space="preserve"> le dataset ;  </w:t>
       </w:r>
     </w:p>
     <w:p>
@@ -8080,16 +8624,41 @@
         <w:ind w:left="661" w:hanging="338"/>
       </w:pPr>
       <w:r>
-        <w:t xml:space="preserve">compresser le projet ;  </w:t>
-      </w:r>
-      <w:r>
-        <w:rPr>
-          <w:sz w:val="19"/>
-        </w:rPr>
-        <w:t xml:space="preserve"> </w:t>
-      </w:r>
-      <w:r>
-        <w:t xml:space="preserve">afficher un résumé.  </w:t>
+        <w:t>Compresser</w:t>
+      </w:r>
+      <w:r>
+        <w:t xml:space="preserve"> le projet ; </w:t>
+      </w:r>
+    </w:p>
+    <w:p>
+      <w:pPr>
+        <w:numPr>
+          <w:ilvl w:val="0"/>
+          <w:numId w:val="9"/>
+        </w:numPr>
+        <w:spacing w:after="254"/>
+        <w:ind w:left="661" w:hanging="338"/>
+      </w:pPr>
+      <w:r>
+        <w:t>Afficher</w:t>
+      </w:r>
+      <w:r>
+        <w:t xml:space="preserve"> un résumé. </w:t>
+      </w:r>
+    </w:p>
+    <w:p>
+      <w:pPr>
+        <w:spacing w:after="254"/>
+        <w:ind w:left="323" w:firstLine="0"/>
+        <w:rPr>
+          <w:color w:val="FF0000"/>
+        </w:rPr>
+      </w:pPr>
+      <w:r>
+        <w:rPr>
+          <w:color w:val="FF0000"/>
+        </w:rPr>
+        <w:t>J’ai fini cette partie</w:t>
       </w:r>
     </w:p>
     <w:p>
@@ -8429,11 +8998,21 @@
     <w:r>
       <w:t>/</w:t>
     </w:r>
-    <w:fldSimple w:instr=" NUMPAGES   \* MERGEFORMAT ">
-      <w:r>
-        <w:t>7</w:t>
-      </w:r>
-    </w:fldSimple>
+    <w:r>
+      <w:fldChar w:fldCharType="begin"/>
+    </w:r>
+    <w:r>
+      <w:instrText xml:space="preserve"> NUMPAGES   \* MERGEFORMAT </w:instrText>
+    </w:r>
+    <w:r>
+      <w:fldChar w:fldCharType="separate"/>
+    </w:r>
+    <w:r>
+      <w:t>7</w:t>
+    </w:r>
+    <w:r>
+      <w:fldChar w:fldCharType="end"/>
+    </w:r>
     <w:r>
       <w:t xml:space="preserve"> </w:t>
     </w:r>
@@ -8477,11 +9056,21 @@
     <w:r>
       <w:t>/</w:t>
     </w:r>
-    <w:fldSimple w:instr=" NUMPAGES   \* MERGEFORMAT ">
-      <w:r>
-        <w:t>7</w:t>
-      </w:r>
-    </w:fldSimple>
+    <w:r>
+      <w:fldChar w:fldCharType="begin"/>
+    </w:r>
+    <w:r>
+      <w:instrText xml:space="preserve"> NUMPAGES   \* MERGEFORMAT </w:instrText>
+    </w:r>
+    <w:r>
+      <w:fldChar w:fldCharType="separate"/>
+    </w:r>
+    <w:r>
+      <w:t>7</w:t>
+    </w:r>
+    <w:r>
+      <w:fldChar w:fldCharType="end"/>
+    </w:r>
     <w:r>
       <w:t xml:space="preserve"> </w:t>
     </w:r>
@@ -8525,11 +9114,21 @@
     <w:r>
       <w:t>/</w:t>
     </w:r>
-    <w:fldSimple w:instr=" NUMPAGES   \* MERGEFORMAT ">
-      <w:r>
-        <w:t>7</w:t>
-      </w:r>
-    </w:fldSimple>
+    <w:r>
+      <w:fldChar w:fldCharType="begin"/>
+    </w:r>
+    <w:r>
+      <w:instrText xml:space="preserve"> NUMPAGES   \* MERGEFORMAT </w:instrText>
+    </w:r>
+    <w:r>
+      <w:fldChar w:fldCharType="separate"/>
+    </w:r>
+    <w:r>
+      <w:t>7</w:t>
+    </w:r>
+    <w:r>
+      <w:fldChar w:fldCharType="end"/>
+    </w:r>
     <w:r>
       <w:t xml:space="preserve"> </w:t>
     </w:r>

</xml_diff>